<commit_message>
Correct student name for roll 51226058 (order 3578) to Sarah Nur Shawli; queue resend
Co-Authored-By: Claude Opus 5.5 <noreply@anthropic.com>
</commit_message>
<xml_diff>
--- a/Admit_Cards_2026/DOCX/Admit_51226058.docx
+++ b/Admit_Cards_2026/DOCX/Admit_51226058.docx
@@ -1,11 +1,14 @@
 
 <file path=word/document.xml><?xml version="1.0" encoding="utf-8"?>
-<w:document xmlns:wpc="http://schemas.microsoft.com/office/word/2010/wordprocessingCanvas" xmlns:cx="http://schemas.microsoft.com/office/drawing/2014/chartex" xmlns:cx1="http://schemas.microsoft.com/office/drawing/2015/9/8/chartex" xmlns:cx2="http://schemas.microsoft.com/office/drawing/2015/10/21/chartex" xmlns:cx3="http://schemas.microsoft.com/office/drawing/2016/5/9/chartex" xmlns:cx4="http://schemas.microsoft.com/office/drawing/2016/5/10/chartex" xmlns:cx5="http://schemas.microsoft.com/office/drawing/2016/5/11/chartex" xmlns:cx6="http://schemas.microsoft.com/office/drawing/2016/5/12/chartex" xmlns:cx7="http://schemas.microsoft.com/office/drawing/2016/5/13/chartex" xmlns:cx8="http://schemas.microsoft.com/office/drawing/2016/5/14/chartex" xmlns:mc="http://schemas.openxmlformats.org/markup-compatibility/2006" xmlns:o="urn:schemas-microsoft-com:office:office" xmlns:r="http://schemas.openxmlformats.org/officeDocument/2006/relationships" xmlns:m="http://schemas.openxmlformats.org/officeDocument/2006/math" xmlns:v="urn:schemas-microsoft-com:vml" xmlns:wp14="http://schemas.microsoft.com/office/word/2010/wordprocessingDrawing" xmlns:wp="http://schemas.openxmlformats.org/drawingml/2006/wordprocessingDrawing" xmlns:w="http://schemas.openxmlformats.org/wordprocessingml/2006/main" xmlns:w14="http://schemas.microsoft.com/office/word/2010/wordml" xmlns:w10="urn:schemas-microsoft-com:office:word" xmlns:w15="http://schemas.microsoft.com/office/word/2012/wordml" xmlns:wpg="http://schemas.microsoft.com/office/word/2010/wordprocessingGroup" xmlns:wpi="http://schemas.microsoft.com/office/word/2010/wordprocessingInk" xmlns:wne="http://schemas.microsoft.com/office/word/2006/wordml" xmlns:wps="http://schemas.microsoft.com/office/word/2010/wordprocessingShape" xmlns:wpsCustomData="http://www.wps.cn/officeDocument/2013/wpsCustomData" mc:Ignorable="w14 w15 wp14">
+<w:document xmlns:wpc="http://schemas.microsoft.com/office/word/2010/wordprocessingCanvas" xmlns:cx="http://schemas.microsoft.com/office/drawing/2014/chartex" xmlns:cx1="http://schemas.microsoft.com/office/drawing/2015/9/8/chartex" xmlns:cx2="http://schemas.microsoft.com/office/drawing/2015/10/21/chartex" xmlns:cx3="http://schemas.microsoft.com/office/drawing/2016/5/9/chartex" xmlns:cx4="http://schemas.microsoft.com/office/drawing/2016/5/10/chartex" xmlns:cx5="http://schemas.microsoft.com/office/drawing/2016/5/11/chartex" xmlns:cx6="http://schemas.microsoft.com/office/drawing/2016/5/12/chartex" xmlns:cx7="http://schemas.microsoft.com/office/drawing/2016/5/13/chartex" xmlns:cx8="http://schemas.microsoft.com/office/drawing/2016/5/14/chartex" xmlns:mc="http://schemas.openxmlformats.org/markup-compatibility/2006" xmlns:aink="http://schemas.microsoft.com/office/drawing/2016/ink" xmlns:am3d="http://schemas.microsoft.com/office/drawing/2017/model3d" xmlns:o="urn:schemas-microsoft-com:office:office" xmlns:r="http://schemas.openxmlformats.org/officeDocument/2006/relationships" xmlns:m="http://schemas.openxmlformats.org/officeDocument/2006/math" xmlns:v="urn:schemas-microsoft-com:vml" xmlns:wp14="http://schemas.microsoft.com/office/word/2010/wordprocessingDrawing" xmlns:wp="http://schemas.openxmlformats.org/drawingml/2006/wordprocessingDrawing" xmlns:w10="urn:schemas-microsoft-com:office:word" xmlns:w="http://schemas.openxmlformats.org/wordprocessingml/2006/main" xmlns:w14="http://schemas.microsoft.com/office/word/2010/wordml" xmlns:w15="http://schemas.microsoft.com/office/word/2012/wordml" xmlns:w16cex="http://schemas.microsoft.com/office/word/2018/wordml/cex" xmlns:w16cid="http://schemas.microsoft.com/office/word/2016/wordml/cid" xmlns:w16="http://schemas.microsoft.com/office/word/2018/wordml" xmlns:w16sdtdh="http://schemas.microsoft.com/office/word/2020/wordml/sdtdatahash" xmlns:w16se="http://schemas.microsoft.com/office/word/2015/wordml/symex" xmlns:wpg="http://schemas.microsoft.com/office/word/2010/wordprocessingGroup" xmlns:wpi="http://schemas.microsoft.com/office/word/2010/wordprocessingInk" xmlns:wne="http://schemas.microsoft.com/office/word/2006/wordml" xmlns:wps="http://schemas.microsoft.com/office/word/2010/wordprocessingShape" mc:Ignorable="w14 w15 w16se w16cid w16 w16cex w16sdtdh wp14">
   <w:body>
     <w:p>
       <w:r>
+        <w:rPr>
+          <w:noProof/>
+        </w:rPr>
         <w:drawing>
-          <wp:anchor distT="0" distB="0" distL="114300" distR="114300" simplePos="0" relativeHeight="251659264" behindDoc="0" locked="0" layoutInCell="1" allowOverlap="1">
+          <wp:anchor distT="0" distB="0" distL="114300" distR="114300" simplePos="0" relativeHeight="251658240" behindDoc="0" locked="0" layoutInCell="1" allowOverlap="1" wp14:anchorId="0C883020" wp14:editId="5FAAF671">
             <wp:simplePos x="0" y="0"/>
             <wp:positionH relativeFrom="margin">
               <wp:posOffset>-262890</wp:posOffset>
@@ -24,13 +27,13 @@
               <a:graphicData uri="http://schemas.openxmlformats.org/drawingml/2006/picture">
                 <pic:pic xmlns:pic="http://schemas.openxmlformats.org/drawingml/2006/picture">
                   <pic:nvPicPr>
-                    <pic:cNvPr id="10" name="Picture 10" descr="F:\Downloads\Aunkur_English_Logo__2_-removebg-preview.png"/>
+                    <pic:cNvPr id="0" name="Picture 4" descr="F:\Downloads\Aunkur_English_Logo__2_-removebg-preview.png"/>
                     <pic:cNvPicPr>
                       <a:picLocks noChangeAspect="1" noChangeArrowheads="1"/>
                     </pic:cNvPicPr>
                   </pic:nvPicPr>
-                  <pic:blipFill>
-                    <a:blip r:embed="rId10" cstate="print">
+                  <pic:blipFill rotWithShape="1">
+                    <a:blip r:embed="rId7" cstate="print">
                       <a:extLst>
                         <a:ext uri="{28A0092B-C50C-407E-A947-70E740481C1C}">
                           <a14:useLocalDpi xmlns:a14="http://schemas.microsoft.com/office/drawing/2010/main" val="0"/>
@@ -38,11 +41,9 @@
                       </a:extLst>
                     </a:blip>
                     <a:srcRect l="-444" t="-62415" r="-36584" b="16971"/>
-                    <a:stretch>
-                      <a:fillRect/>
-                    </a:stretch>
+                    <a:stretch/>
                   </pic:blipFill>
-                  <pic:spPr>
+                  <pic:spPr bwMode="auto">
                     <a:xfrm>
                       <a:off x="0" y="0"/>
                       <a:ext cx="1870710" cy="1925955"/>
@@ -54,10 +55,21 @@
                     <a:ln>
                       <a:noFill/>
                     </a:ln>
+                    <a:extLst>
+                      <a:ext uri="{53640926-AAD7-44D8-BBD7-CCE9431645EC}">
+                        <a14:shadowObscured xmlns:a14="http://schemas.microsoft.com/office/drawing/2010/main"/>
+                      </a:ext>
+                    </a:extLst>
                   </pic:spPr>
                 </pic:pic>
               </a:graphicData>
             </a:graphic>
+            <wp14:sizeRelH relativeFrom="margin">
+              <wp14:pctWidth>0</wp14:pctWidth>
+            </wp14:sizeRelH>
+            <wp14:sizeRelV relativeFrom="margin">
+              <wp14:pctHeight>0</wp14:pctHeight>
+            </wp14:sizeRelV>
           </wp:anchor>
         </w:drawing>
       </w:r>
@@ -69,48 +81,17 @@
     <w:p/>
     <w:tbl>
       <w:tblPr>
-        <w:tblStyle w:val="9"/>
+        <w:tblStyle w:val="TableGrid"/>
         <w:tblW w:w="0" w:type="auto"/>
-        <w:tblInd w:w="0" w:type="dxa"/>
-        <w:tblBorders>
-          <w:top w:val="single" w:color="auto" w:sz="4" w:space="0"/>
-          <w:left w:val="single" w:color="auto" w:sz="4" w:space="0"/>
-          <w:bottom w:val="single" w:color="auto" w:sz="4" w:space="0"/>
-          <w:right w:val="single" w:color="auto" w:sz="4" w:space="0"/>
-          <w:insideH w:val="single" w:color="auto" w:sz="4" w:space="0"/>
-          <w:insideV w:val="single" w:color="auto" w:sz="4" w:space="0"/>
-        </w:tblBorders>
-        <w:tblLayout w:type="autofit"/>
-        <w:tblCellMar>
-          <w:top w:w="0" w:type="dxa"/>
-          <w:left w:w="108" w:type="dxa"/>
-          <w:bottom w:w="0" w:type="dxa"/>
-          <w:right w:w="108" w:type="dxa"/>
-        </w:tblCellMar>
+        <w:tblLook w:val="04A0" w:firstRow="1" w:lastRow="0" w:firstColumn="1" w:lastColumn="0" w:noHBand="0" w:noVBand="1"/>
       </w:tblPr>
       <w:tblGrid>
         <w:gridCol w:w="2155"/>
         <w:gridCol w:w="8635"/>
       </w:tblGrid>
       <w:tr>
-        <w:tblPrEx>
-          <w:tblBorders>
-            <w:top w:val="single" w:color="auto" w:sz="4" w:space="0"/>
-            <w:left w:val="single" w:color="auto" w:sz="4" w:space="0"/>
-            <w:bottom w:val="single" w:color="auto" w:sz="4" w:space="0"/>
-            <w:right w:val="single" w:color="auto" w:sz="4" w:space="0"/>
-            <w:insideH w:val="single" w:color="auto" w:sz="4" w:space="0"/>
-            <w:insideV w:val="single" w:color="auto" w:sz="4" w:space="0"/>
-          </w:tblBorders>
-          <w:tblCellMar>
-            <w:top w:w="0" w:type="dxa"/>
-            <w:left w:w="108" w:type="dxa"/>
-            <w:bottom w:w="0" w:type="dxa"/>
-            <w:right w:w="108" w:type="dxa"/>
-          </w:tblCellMar>
-        </w:tblPrEx>
         <w:trPr>
-          <w:trHeight w:val="440" w:hRule="atLeast"/>
+          <w:trHeight w:val="440"/>
         </w:trPr>
         <w:tc>
           <w:tcPr>
@@ -118,7 +99,6 @@
           </w:tcPr>
           <w:p>
             <w:pPr>
-              <w:spacing w:after="0" w:line="240" w:lineRule="auto"/>
               <w:rPr>
                 <w:rFonts w:ascii="Times New Roman" w:hAnsi="Times New Roman" w:cs="Times New Roman"/>
                 <w:b/>
@@ -145,7 +125,6 @@
           </w:tcPr>
           <w:p>
             <w:pPr>
-              <w:spacing w:after="0" w:line="240" w:lineRule="auto"/>
               <w:rPr>
                 <w:rFonts w:ascii="Times New Roman" w:hAnsi="Times New Roman" w:cs="Times New Roman"/>
                 <w:sz w:val="24"/>
@@ -154,35 +133,19 @@
             </w:pPr>
             <w:r>
               <w:rPr>
-                <w:rFonts w:hint="default" w:ascii="Times New Roman" w:hAnsi="Times New Roman" w:cs="Kalpurush"/>
+                <w:rFonts w:ascii="Times New Roman" w:hAnsi="Times New Roman" w:cs="Kalpurush"/>
                 <w:b w:val="0"/>
                 <w:sz w:val="24"/>
                 <w:szCs w:val="24"/>
               </w:rPr>
-              <w:t>Sarsh Nur Shawli</w:t>
+              <w:t xml:space="preserve">Sarah Nur Shawli</w:t>
             </w:r>
           </w:p>
         </w:tc>
       </w:tr>
       <w:tr>
-        <w:tblPrEx>
-          <w:tblBorders>
-            <w:top w:val="single" w:color="auto" w:sz="4" w:space="0"/>
-            <w:left w:val="single" w:color="auto" w:sz="4" w:space="0"/>
-            <w:bottom w:val="single" w:color="auto" w:sz="4" w:space="0"/>
-            <w:right w:val="single" w:color="auto" w:sz="4" w:space="0"/>
-            <w:insideH w:val="single" w:color="auto" w:sz="4" w:space="0"/>
-            <w:insideV w:val="single" w:color="auto" w:sz="4" w:space="0"/>
-          </w:tblBorders>
-          <w:tblCellMar>
-            <w:top w:w="0" w:type="dxa"/>
-            <w:left w:w="108" w:type="dxa"/>
-            <w:bottom w:w="0" w:type="dxa"/>
-            <w:right w:w="108" w:type="dxa"/>
-          </w:tblCellMar>
-        </w:tblPrEx>
         <w:trPr>
-          <w:trHeight w:val="431" w:hRule="atLeast"/>
+          <w:trHeight w:val="431"/>
         </w:trPr>
         <w:tc>
           <w:tcPr>
@@ -190,7 +153,6 @@
           </w:tcPr>
           <w:p>
             <w:pPr>
-              <w:spacing w:after="0" w:line="240" w:lineRule="auto"/>
               <w:rPr>
                 <w:rFonts w:ascii="Times New Roman" w:hAnsi="Times New Roman" w:cs="Times New Roman"/>
                 <w:b/>
@@ -217,7 +179,6 @@
           </w:tcPr>
           <w:p>
             <w:pPr>
-              <w:spacing w:after="0" w:line="240" w:lineRule="auto"/>
               <w:rPr>
                 <w:rFonts w:ascii="Times New Roman" w:hAnsi="Times New Roman" w:cs="Times New Roman"/>
                 <w:sz w:val="24"/>
@@ -231,30 +192,14 @@
                 <w:sz w:val="24"/>
                 <w:szCs w:val="24"/>
               </w:rPr>
-              <w:t>Hossain Muhammad Mohiuddin</w:t>
+              <w:t xml:space="preserve">Hossain Muhammad Mohiuddin</w:t>
             </w:r>
           </w:p>
         </w:tc>
       </w:tr>
       <w:tr>
-        <w:tblPrEx>
-          <w:tblBorders>
-            <w:top w:val="single" w:color="auto" w:sz="4" w:space="0"/>
-            <w:left w:val="single" w:color="auto" w:sz="4" w:space="0"/>
-            <w:bottom w:val="single" w:color="auto" w:sz="4" w:space="0"/>
-            <w:right w:val="single" w:color="auto" w:sz="4" w:space="0"/>
-            <w:insideH w:val="single" w:color="auto" w:sz="4" w:space="0"/>
-            <w:insideV w:val="single" w:color="auto" w:sz="4" w:space="0"/>
-          </w:tblBorders>
-          <w:tblCellMar>
-            <w:top w:w="0" w:type="dxa"/>
-            <w:left w:w="108" w:type="dxa"/>
-            <w:bottom w:w="0" w:type="dxa"/>
-            <w:right w:w="108" w:type="dxa"/>
-          </w:tblCellMar>
-        </w:tblPrEx>
         <w:trPr>
-          <w:trHeight w:val="413" w:hRule="atLeast"/>
+          <w:trHeight w:val="413"/>
         </w:trPr>
         <w:tc>
           <w:tcPr>
@@ -262,7 +207,6 @@
           </w:tcPr>
           <w:p>
             <w:pPr>
-              <w:spacing w:after="0" w:line="240" w:lineRule="auto"/>
               <w:rPr>
                 <w:rFonts w:ascii="Times New Roman" w:hAnsi="Times New Roman" w:cs="Times New Roman"/>
                 <w:b/>
@@ -289,7 +233,6 @@
           </w:tcPr>
           <w:p>
             <w:pPr>
-              <w:spacing w:after="0" w:line="240" w:lineRule="auto"/>
               <w:rPr>
                 <w:rFonts w:ascii="Times New Roman" w:hAnsi="Times New Roman" w:cs="Times New Roman"/>
                 <w:sz w:val="24"/>
@@ -303,30 +246,14 @@
                 <w:sz w:val="24"/>
                 <w:szCs w:val="24"/>
               </w:rPr>
-              <w:t>Satkania Govt. Primary School</w:t>
+              <w:t xml:space="preserve">Satkania Govt. Primary School</w:t>
             </w:r>
           </w:p>
         </w:tc>
       </w:tr>
       <w:tr>
-        <w:tblPrEx>
-          <w:tblBorders>
-            <w:top w:val="single" w:color="auto" w:sz="4" w:space="0"/>
-            <w:left w:val="single" w:color="auto" w:sz="4" w:space="0"/>
-            <w:bottom w:val="single" w:color="auto" w:sz="4" w:space="0"/>
-            <w:right w:val="single" w:color="auto" w:sz="4" w:space="0"/>
-            <w:insideH w:val="single" w:color="auto" w:sz="4" w:space="0"/>
-            <w:insideV w:val="single" w:color="auto" w:sz="4" w:space="0"/>
-          </w:tblBorders>
-          <w:tblCellMar>
-            <w:top w:w="0" w:type="dxa"/>
-            <w:left w:w="108" w:type="dxa"/>
-            <w:bottom w:w="0" w:type="dxa"/>
-            <w:right w:w="108" w:type="dxa"/>
-          </w:tblCellMar>
-        </w:tblPrEx>
         <w:trPr>
-          <w:trHeight w:val="395" w:hRule="atLeast"/>
+          <w:trHeight w:val="395"/>
         </w:trPr>
         <w:tc>
           <w:tcPr>
@@ -334,7 +261,6 @@
           </w:tcPr>
           <w:p>
             <w:pPr>
-              <w:spacing w:after="0" w:line="240" w:lineRule="auto"/>
               <w:rPr>
                 <w:rFonts w:ascii="Times New Roman" w:hAnsi="Times New Roman" w:cs="Times New Roman"/>
                 <w:b/>
@@ -361,7 +287,6 @@
           </w:tcPr>
           <w:p>
             <w:pPr>
-              <w:spacing w:after="0" w:line="240" w:lineRule="auto"/>
               <w:rPr>
                 <w:rFonts w:ascii="Times New Roman" w:hAnsi="Times New Roman" w:cs="Times New Roman"/>
                 <w:sz w:val="24"/>
@@ -375,30 +300,14 @@
                 <w:sz w:val="24"/>
                 <w:szCs w:val="24"/>
               </w:rPr>
-              <w:t>5</w:t>
+              <w:t xml:space="preserve">5</w:t>
             </w:r>
           </w:p>
         </w:tc>
       </w:tr>
       <w:tr>
-        <w:tblPrEx>
-          <w:tblBorders>
-            <w:top w:val="single" w:color="auto" w:sz="4" w:space="0"/>
-            <w:left w:val="single" w:color="auto" w:sz="4" w:space="0"/>
-            <w:bottom w:val="single" w:color="auto" w:sz="4" w:space="0"/>
-            <w:right w:val="single" w:color="auto" w:sz="4" w:space="0"/>
-            <w:insideH w:val="single" w:color="auto" w:sz="4" w:space="0"/>
-            <w:insideV w:val="single" w:color="auto" w:sz="4" w:space="0"/>
-          </w:tblBorders>
-          <w:tblCellMar>
-            <w:top w:w="0" w:type="dxa"/>
-            <w:left w:w="108" w:type="dxa"/>
-            <w:bottom w:w="0" w:type="dxa"/>
-            <w:right w:w="108" w:type="dxa"/>
-          </w:tblCellMar>
-        </w:tblPrEx>
         <w:trPr>
-          <w:trHeight w:val="377" w:hRule="atLeast"/>
+          <w:trHeight w:val="377"/>
         </w:trPr>
         <w:tc>
           <w:tcPr>
@@ -406,7 +315,6 @@
           </w:tcPr>
           <w:p>
             <w:pPr>
-              <w:spacing w:after="0" w:line="240" w:lineRule="auto"/>
               <w:rPr>
                 <w:rFonts w:ascii="Times New Roman" w:hAnsi="Times New Roman" w:cs="Times New Roman"/>
                 <w:b/>
@@ -433,7 +341,6 @@
           </w:tcPr>
           <w:p>
             <w:pPr>
-              <w:spacing w:after="0" w:line="240" w:lineRule="auto"/>
               <w:rPr>
                 <w:rFonts w:ascii="Times New Roman" w:hAnsi="Times New Roman" w:cs="Times New Roman"/>
                 <w:sz w:val="24"/>
@@ -447,7 +354,7 @@
                 <w:sz w:val="24"/>
                 <w:szCs w:val="24"/>
               </w:rPr>
-              <w:t>+8801554314046</w:t>
+              <w:t xml:space="preserve">+8801554314046</w:t>
             </w:r>
           </w:p>
         </w:tc>
@@ -462,24 +369,9 @@
     </w:p>
     <w:tbl>
       <w:tblPr>
-        <w:tblStyle w:val="9"/>
+        <w:tblStyle w:val="TableGrid"/>
         <w:tblW w:w="0" w:type="auto"/>
-        <w:tblInd w:w="0" w:type="dxa"/>
-        <w:tblBorders>
-          <w:top w:val="single" w:color="auto" w:sz="4" w:space="0"/>
-          <w:left w:val="single" w:color="auto" w:sz="4" w:space="0"/>
-          <w:bottom w:val="single" w:color="auto" w:sz="4" w:space="0"/>
-          <w:right w:val="single" w:color="auto" w:sz="4" w:space="0"/>
-          <w:insideH w:val="single" w:color="auto" w:sz="4" w:space="0"/>
-          <w:insideV w:val="single" w:color="auto" w:sz="4" w:space="0"/>
-        </w:tblBorders>
-        <w:tblLayout w:type="autofit"/>
-        <w:tblCellMar>
-          <w:top w:w="0" w:type="dxa"/>
-          <w:left w:w="108" w:type="dxa"/>
-          <w:bottom w:w="0" w:type="dxa"/>
-          <w:right w:w="108" w:type="dxa"/>
-        </w:tblCellMar>
+        <w:tblLook w:val="04A0" w:firstRow="1" w:lastRow="0" w:firstColumn="1" w:lastColumn="0" w:noHBand="0" w:noVBand="1"/>
       </w:tblPr>
       <w:tblGrid>
         <w:gridCol w:w="2155"/>
@@ -488,36 +380,19 @@
         <w:gridCol w:w="5215"/>
       </w:tblGrid>
       <w:tr>
-        <w:tblPrEx>
-          <w:tblBorders>
-            <w:top w:val="single" w:color="auto" w:sz="4" w:space="0"/>
-            <w:left w:val="single" w:color="auto" w:sz="4" w:space="0"/>
-            <w:bottom w:val="single" w:color="auto" w:sz="4" w:space="0"/>
-            <w:right w:val="single" w:color="auto" w:sz="4" w:space="0"/>
-            <w:insideH w:val="single" w:color="auto" w:sz="4" w:space="0"/>
-            <w:insideV w:val="single" w:color="auto" w:sz="4" w:space="0"/>
-          </w:tblBorders>
-          <w:tblCellMar>
-            <w:top w:w="0" w:type="dxa"/>
-            <w:left w:w="108" w:type="dxa"/>
-            <w:bottom w:w="0" w:type="dxa"/>
-            <w:right w:w="108" w:type="dxa"/>
-          </w:tblCellMar>
-        </w:tblPrEx>
         <w:trPr>
-          <w:trHeight w:val="575" w:hRule="atLeast"/>
+          <w:trHeight w:val="575"/>
         </w:trPr>
         <w:tc>
           <w:tcPr>
             <w:tcW w:w="2155" w:type="dxa"/>
             <w:tcBorders>
-              <w:bottom w:val="single" w:color="auto" w:sz="4" w:space="0"/>
+              <w:bottom w:val="single" w:sz="4" w:space="0" w:color="auto"/>
               <w:right w:val="nil"/>
             </w:tcBorders>
           </w:tcPr>
           <w:p>
             <w:pPr>
-              <w:spacing w:after="0" w:line="240" w:lineRule="auto"/>
               <w:rPr>
                 <w:rFonts w:ascii="Times New Roman" w:hAnsi="Times New Roman" w:cs="Times New Roman"/>
                 <w:sz w:val="28"/>
@@ -550,12 +425,11 @@
             <w:tcBorders>
               <w:left w:val="nil"/>
               <w:bottom w:val="nil"/>
-              <w:right w:val="single" w:color="auto" w:sz="4" w:space="0"/>
+              <w:right w:val="single" w:sz="4" w:space="0" w:color="auto"/>
             </w:tcBorders>
           </w:tcPr>
           <w:p>
             <w:pPr>
-              <w:spacing w:after="0" w:line="240" w:lineRule="auto"/>
               <w:rPr>
                 <w:rFonts w:ascii="Times New Roman" w:hAnsi="Times New Roman" w:cs="Times New Roman"/>
                 <w:sz w:val="28"/>
@@ -569,7 +443,7 @@
                 <w:sz w:val="24"/>
                 <w:szCs w:val="28"/>
               </w:rPr>
-              <w:t>51226058</w:t>
+              <w:t xml:space="preserve">51226058</w:t>
             </w:r>
           </w:p>
         </w:tc>
@@ -578,14 +452,13 @@
             <w:tcW w:w="270" w:type="dxa"/>
             <w:tcBorders>
               <w:top w:val="nil"/>
-              <w:left w:val="single" w:color="auto" w:sz="4" w:space="0"/>
+              <w:left w:val="single" w:sz="4" w:space="0" w:color="auto"/>
               <w:bottom w:val="nil"/>
-              <w:right w:val="single" w:color="auto" w:sz="4" w:space="0"/>
+              <w:right w:val="single" w:sz="4" w:space="0" w:color="auto"/>
             </w:tcBorders>
           </w:tcPr>
           <w:p>
             <w:pPr>
-              <w:spacing w:after="0" w:line="240" w:lineRule="auto"/>
               <w:rPr>
                 <w:rFonts w:ascii="Times New Roman" w:hAnsi="Times New Roman" w:cs="Times New Roman"/>
                 <w:sz w:val="28"/>
@@ -598,13 +471,12 @@
           <w:tcPr>
             <w:tcW w:w="5215" w:type="dxa"/>
             <w:tcBorders>
-              <w:left w:val="single" w:color="auto" w:sz="4" w:space="0"/>
-              <w:bottom w:val="single" w:color="auto" w:sz="4" w:space="0"/>
+              <w:left w:val="single" w:sz="4" w:space="0" w:color="auto"/>
+              <w:bottom w:val="single" w:sz="4" w:space="0" w:color="auto"/>
             </w:tcBorders>
           </w:tcPr>
           <w:p>
             <w:pPr>
-              <w:spacing w:after="0" w:line="240" w:lineRule="auto"/>
               <w:rPr>
                 <w:rFonts w:ascii="Times New Roman" w:hAnsi="Times New Roman" w:cs="Times New Roman"/>
                 <w:sz w:val="28"/>
@@ -661,40 +533,34 @@
                 <w:sz w:val="28"/>
                 <w:szCs w:val="28"/>
               </w:rPr>
-              <w:t>October 2026, 10:00 AM</w:t>
+              <w:t xml:space="preserve">October 2026, </w:t>
+            </w:r>
+            <w:r>
+              <w:rPr>
+                <w:rFonts w:ascii="Times New Roman" w:hAnsi="Times New Roman" w:cs="Times New Roman"/>
+                <w:b/>
+                <w:bCs/>
+                <w:color w:val="002060"/>
+                <w:sz w:val="28"/>
+                <w:szCs w:val="28"/>
+              </w:rPr>
+              <w:t>10:00 AM</w:t>
             </w:r>
           </w:p>
         </w:tc>
       </w:tr>
       <w:tr>
-        <w:tblPrEx>
-          <w:tblBorders>
-            <w:top w:val="single" w:color="auto" w:sz="4" w:space="0"/>
-            <w:left w:val="single" w:color="auto" w:sz="4" w:space="0"/>
-            <w:bottom w:val="single" w:color="auto" w:sz="4" w:space="0"/>
-            <w:right w:val="single" w:color="auto" w:sz="4" w:space="0"/>
-            <w:insideH w:val="single" w:color="auto" w:sz="4" w:space="0"/>
-            <w:insideV w:val="single" w:color="auto" w:sz="4" w:space="0"/>
-          </w:tblBorders>
-          <w:tblCellMar>
-            <w:top w:w="0" w:type="dxa"/>
-            <w:left w:w="108" w:type="dxa"/>
-            <w:bottom w:w="0" w:type="dxa"/>
-            <w:right w:w="108" w:type="dxa"/>
-          </w:tblCellMar>
-        </w:tblPrEx>
         <w:tc>
           <w:tcPr>
             <w:tcW w:w="2155" w:type="dxa"/>
             <w:tcBorders>
               <w:left w:val="nil"/>
-              <w:bottom w:val="single" w:color="auto" w:sz="4" w:space="0"/>
+              <w:bottom w:val="single" w:sz="4" w:space="0" w:color="auto"/>
               <w:right w:val="nil"/>
             </w:tcBorders>
           </w:tcPr>
           <w:p>
             <w:pPr>
-              <w:spacing w:after="0" w:line="240" w:lineRule="auto"/>
               <w:rPr>
                 <w:rFonts w:ascii="Times New Roman" w:hAnsi="Times New Roman" w:cs="Times New Roman"/>
                 <w:sz w:val="28"/>
@@ -708,13 +574,12 @@
             <w:tcW w:w="3150" w:type="dxa"/>
             <w:tcBorders>
               <w:left w:val="nil"/>
-              <w:bottom w:val="single" w:color="auto" w:sz="4" w:space="0"/>
+              <w:bottom w:val="single" w:sz="4" w:space="0" w:color="auto"/>
               <w:right w:val="nil"/>
             </w:tcBorders>
           </w:tcPr>
           <w:p>
             <w:pPr>
-              <w:spacing w:after="0" w:line="240" w:lineRule="auto"/>
               <w:rPr>
                 <w:rFonts w:ascii="Times New Roman" w:hAnsi="Times New Roman" w:cs="Times New Roman"/>
                 <w:sz w:val="28"/>
@@ -729,13 +594,12 @@
             <w:tcBorders>
               <w:top w:val="nil"/>
               <w:left w:val="nil"/>
-              <w:bottom w:val="single" w:color="auto" w:sz="4" w:space="0"/>
+              <w:bottom w:val="single" w:sz="4" w:space="0" w:color="auto"/>
               <w:right w:val="nil"/>
             </w:tcBorders>
           </w:tcPr>
           <w:p>
             <w:pPr>
-              <w:spacing w:after="0" w:line="240" w:lineRule="auto"/>
               <w:rPr>
                 <w:rFonts w:ascii="Times New Roman" w:hAnsi="Times New Roman" w:cs="Times New Roman"/>
                 <w:sz w:val="28"/>
@@ -749,13 +613,12 @@
             <w:tcW w:w="5215" w:type="dxa"/>
             <w:tcBorders>
               <w:left w:val="nil"/>
-              <w:bottom w:val="single" w:color="auto" w:sz="4" w:space="0"/>
+              <w:bottom w:val="single" w:sz="4" w:space="0" w:color="auto"/>
               <w:right w:val="nil"/>
             </w:tcBorders>
           </w:tcPr>
           <w:p>
             <w:pPr>
-              <w:spacing w:after="0" w:line="240" w:lineRule="auto"/>
               <w:rPr>
                 <w:rFonts w:ascii="Times New Roman" w:hAnsi="Times New Roman" w:cs="Times New Roman"/>
                 <w:sz w:val="28"/>
@@ -766,34 +629,17 @@
         </w:tc>
       </w:tr>
       <w:tr>
-        <w:tblPrEx>
-          <w:tblBorders>
-            <w:top w:val="single" w:color="auto" w:sz="4" w:space="0"/>
-            <w:left w:val="single" w:color="auto" w:sz="4" w:space="0"/>
-            <w:bottom w:val="single" w:color="auto" w:sz="4" w:space="0"/>
-            <w:right w:val="single" w:color="auto" w:sz="4" w:space="0"/>
-            <w:insideH w:val="single" w:color="auto" w:sz="4" w:space="0"/>
-            <w:insideV w:val="single" w:color="auto" w:sz="4" w:space="0"/>
-          </w:tblBorders>
-          <w:tblCellMar>
-            <w:top w:w="0" w:type="dxa"/>
-            <w:left w:w="108" w:type="dxa"/>
-            <w:bottom w:w="0" w:type="dxa"/>
-            <w:right w:w="108" w:type="dxa"/>
-          </w:tblCellMar>
-        </w:tblPrEx>
         <w:tc>
           <w:tcPr>
             <w:tcW w:w="2155" w:type="dxa"/>
             <w:tcBorders>
-              <w:top w:val="single" w:color="auto" w:sz="4" w:space="0"/>
-              <w:bottom w:val="single" w:color="auto" w:sz="4" w:space="0"/>
+              <w:top w:val="single" w:sz="4" w:space="0" w:color="auto"/>
+              <w:bottom w:val="single" w:sz="4" w:space="0" w:color="auto"/>
               <w:right w:val="nil"/>
             </w:tcBorders>
           </w:tcPr>
           <w:p>
             <w:pPr>
-              <w:spacing w:after="0" w:line="240" w:lineRule="auto"/>
               <w:rPr>
                 <w:rFonts w:ascii="Times New Roman" w:hAnsi="Times New Roman" w:cs="Times New Roman"/>
                 <w:b/>
@@ -819,15 +665,14 @@
             <w:tcW w:w="8635" w:type="dxa"/>
             <w:gridSpan w:val="3"/>
             <w:tcBorders>
-              <w:top w:val="single" w:color="auto" w:sz="4" w:space="0"/>
+              <w:top w:val="single" w:sz="4" w:space="0" w:color="auto"/>
               <w:left w:val="nil"/>
-              <w:bottom w:val="single" w:color="auto" w:sz="4" w:space="0"/>
-              <w:right w:val="single" w:color="auto" w:sz="4" w:space="0"/>
+              <w:bottom w:val="single" w:sz="4" w:space="0" w:color="auto"/>
+              <w:right w:val="single" w:sz="4" w:space="0" w:color="auto"/>
             </w:tcBorders>
           </w:tcPr>
           <w:p>
             <w:pPr>
-              <w:spacing w:after="0" w:line="240" w:lineRule="auto"/>
               <w:rPr>
                 <w:rFonts w:ascii="Times New Roman" w:hAnsi="Times New Roman" w:cs="Times New Roman"/>
                 <w:b/>
@@ -845,12 +690,11 @@
                 <w:cs/>
                 <w:lang w:bidi="bn-IN"/>
               </w:rPr>
-              <w:t>চট্টগ্রাম কলেজিয়েট স্কুল</w:t>
+              <w:t xml:space="preserve">চট্টগ্রাম কলেজিয়েট স্কুল</w:t>
             </w:r>
           </w:p>
           <w:p>
             <w:pPr>
-              <w:spacing w:after="0" w:line="240" w:lineRule="auto"/>
               <w:rPr>
                 <w:rFonts w:ascii="Times New Roman" w:hAnsi="Times New Roman" w:cs="Times New Roman"/>
                 <w:sz w:val="28"/>
@@ -866,11 +710,12 @@
       <w:r>
         <w:rPr>
           <w:rFonts w:ascii="SolaimanLipi" w:hAnsi="SolaimanLipi" w:cs="SolaimanLipi"/>
+          <w:noProof/>
         </w:rPr>
         <mc:AlternateContent>
           <mc:Choice Requires="wps">
             <w:drawing>
-              <wp:anchor distT="0" distB="0" distL="114300" distR="114300" simplePos="0" relativeHeight="251663360" behindDoc="0" locked="0" layoutInCell="1" allowOverlap="1">
+              <wp:anchor distT="0" distB="0" distL="114300" distR="114300" simplePos="0" relativeHeight="251662336" behindDoc="0" locked="0" layoutInCell="1" allowOverlap="1" wp14:anchorId="3CBD3D72" wp14:editId="42EB0393">
                 <wp:simplePos x="0" y="0"/>
                 <wp:positionH relativeFrom="margin">
                   <wp:align>right</wp:align>
@@ -921,21 +766,27 @@
                         </a:fontRef>
                       </wps:style>
                       <wps:bodyPr rot="0" spcFirstLastPara="0" vertOverflow="overflow" horzOverflow="overflow" vert="horz" wrap="square" lIns="91440" tIns="45720" rIns="91440" bIns="45720" numCol="1" spcCol="0" rtlCol="0" fromWordArt="0" anchor="ctr" anchorCtr="0" forceAA="0" compatLnSpc="1">
+                        <a:prstTxWarp prst="textNoShape">
+                          <a:avLst/>
+                        </a:prstTxWarp>
                         <a:noAutofit/>
                       </wps:bodyPr>
                     </wps:wsp>
                   </a:graphicData>
                 </a:graphic>
+                <wp14:sizeRelH relativeFrom="margin">
+                  <wp14:pctWidth>0</wp14:pctWidth>
+                </wp14:sizeRelH>
+                <wp14:sizeRelV relativeFrom="margin">
+                  <wp14:pctHeight>0</wp14:pctHeight>
+                </wp14:sizeRelV>
               </wp:anchor>
             </w:drawing>
           </mc:Choice>
           <mc:Fallback>
             <w:pict>
-              <v:rect id="_x0000_s1026" o:spid="_x0000_s1026" o:spt="1" style="position:absolute;left:0pt;margin-top:0.45pt;height:9pt;width:538.5pt;mso-position-horizontal:right;mso-position-horizontal-relative:margin;z-index:251663360;v-text-anchor:middle;mso-width-relative:page;mso-height-relative:page;" fillcolor="#008000" filled="t" stroked="t" coordsize="21600,21600" o:gfxdata="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">
-                <v:fill on="t" focussize="0,0"/>
-                <v:stroke weight="1pt" color="#008000 [3204]" miterlimit="8" joinstyle="miter"/>
-                <v:imagedata o:title=""/>
-                <o:lock v:ext="edit" aspectratio="f"/>
+              <v:rect w14:anchorId="763CE41F" id="Rectangle 11" o:spid="_x0000_s1026" style="position:absolute;margin-left:487.3pt;margin-top:.45pt;width:538.5pt;height:9pt;z-index:251662336;visibility:visible;mso-wrap-style:square;mso-width-percent:0;mso-height-percent:0;mso-wrap-distance-left:9pt;mso-wrap-distance-top:0;mso-wrap-distance-right:9pt;mso-wrap-distance-bottom:0;mso-position-horizontal:right;mso-position-horizontal-relative:margin;mso-position-vertical:absolute;mso-position-vertical-relative:text;mso-width-percent:0;mso-height-percent:0;mso-width-relative:margin;mso-height-relative:margin;v-text-anchor:middle" o:gfxdata="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" fillcolor="green" strokecolor="green" strokeweight="1pt">
+                <w10:wrap anchorx="margin"/>
               </v:rect>
             </w:pict>
           </mc:Fallback>
@@ -944,52 +795,21 @@
     </w:p>
     <w:tbl>
       <w:tblPr>
-        <w:tblStyle w:val="9"/>
+        <w:tblStyle w:val="TableGrid"/>
         <w:tblW w:w="0" w:type="auto"/>
-        <w:tblInd w:w="0" w:type="dxa"/>
-        <w:tblBorders>
-          <w:top w:val="single" w:color="auto" w:sz="4" w:space="0"/>
-          <w:left w:val="single" w:color="auto" w:sz="4" w:space="0"/>
-          <w:bottom w:val="single" w:color="auto" w:sz="4" w:space="0"/>
-          <w:right w:val="single" w:color="auto" w:sz="4" w:space="0"/>
-          <w:insideH w:val="single" w:color="auto" w:sz="4" w:space="0"/>
-          <w:insideV w:val="single" w:color="auto" w:sz="4" w:space="0"/>
-        </w:tblBorders>
-        <w:tblLayout w:type="autofit"/>
-        <w:tblCellMar>
-          <w:top w:w="0" w:type="dxa"/>
-          <w:left w:w="108" w:type="dxa"/>
-          <w:bottom w:w="0" w:type="dxa"/>
-          <w:right w:w="108" w:type="dxa"/>
-        </w:tblCellMar>
+        <w:tblLook w:val="04A0" w:firstRow="1" w:lastRow="0" w:firstColumn="1" w:lastColumn="0" w:noHBand="0" w:noVBand="1"/>
       </w:tblPr>
       <w:tblGrid>
         <w:gridCol w:w="10790"/>
       </w:tblGrid>
       <w:tr>
-        <w:tblPrEx>
-          <w:tblBorders>
-            <w:top w:val="single" w:color="auto" w:sz="4" w:space="0"/>
-            <w:left w:val="single" w:color="auto" w:sz="4" w:space="0"/>
-            <w:bottom w:val="single" w:color="auto" w:sz="4" w:space="0"/>
-            <w:right w:val="single" w:color="auto" w:sz="4" w:space="0"/>
-            <w:insideH w:val="single" w:color="auto" w:sz="4" w:space="0"/>
-            <w:insideV w:val="single" w:color="auto" w:sz="4" w:space="0"/>
-          </w:tblBorders>
-          <w:tblCellMar>
-            <w:top w:w="0" w:type="dxa"/>
-            <w:left w:w="108" w:type="dxa"/>
-            <w:bottom w:w="0" w:type="dxa"/>
-            <w:right w:w="108" w:type="dxa"/>
-          </w:tblCellMar>
-        </w:tblPrEx>
         <w:tc>
           <w:tcPr>
             <w:tcW w:w="10790" w:type="dxa"/>
           </w:tcPr>
           <w:p>
             <w:pPr>
-              <w:spacing w:before="240" w:after="0" w:line="360" w:lineRule="auto"/>
+              <w:spacing w:before="240" w:line="360" w:lineRule="auto"/>
               <w:jc w:val="center"/>
               <w:rPr>
                 <w:rFonts w:ascii="Li Shamim Cholontika Unicode" w:hAnsi="Li Shamim Cholontika Unicode" w:cs="Li Shamim Cholontika Unicode"/>
@@ -1070,7 +890,7 @@
           </w:p>
           <w:p>
             <w:pPr>
-              <w:spacing w:before="240" w:after="0" w:line="360" w:lineRule="auto"/>
+              <w:spacing w:before="240" w:line="360" w:lineRule="auto"/>
               <w:rPr>
                 <w:rFonts w:ascii="Kalpurush" w:hAnsi="Kalpurush" w:cs="Kalpurush"/>
                 <w:cs/>
@@ -1099,7 +919,15 @@
                 <w:cs/>
                 <w:lang w:bidi="bn-IN"/>
               </w:rPr>
-              <w:t xml:space="preserve"> পরীক্ষা</w:t>
+              <w:t xml:space="preserve"> </w:t>
+            </w:r>
+            <w:r>
+              <w:rPr>
+                <w:rFonts w:ascii="Kalpurush" w:hAnsi="Kalpurush" w:cs="Kalpurush"/>
+                <w:cs/>
+                <w:lang w:bidi="bn-IN"/>
+              </w:rPr>
+              <w:t>পরীক্ষা</w:t>
             </w:r>
             <w:r>
               <w:rPr>
@@ -1127,7 +955,15 @@
                 <w:cs/>
                 <w:lang w:bidi="bn-IN"/>
               </w:rPr>
-              <w:t>পূর্বঘোষিত</w:t>
+              <w:t>পূর্ব</w:t>
+            </w:r>
+            <w:r>
+              <w:rPr>
+                <w:rFonts w:ascii="Kalpurush" w:hAnsi="Kalpurush" w:cs="Kalpurush"/>
+                <w:cs/>
+                <w:lang w:bidi="bn-IN"/>
+              </w:rPr>
+              <w:t>ঘোষিত</w:t>
             </w:r>
             <w:r>
               <w:rPr>
@@ -1252,7 +1088,7 @@
           </w:p>
           <w:p>
             <w:pPr>
-              <w:spacing w:before="60" w:after="0" w:line="360" w:lineRule="auto"/>
+              <w:spacing w:before="60" w:line="360" w:lineRule="auto"/>
               <w:rPr>
                 <w:rFonts w:ascii="Kalpurush" w:hAnsi="Kalpurush" w:cs="Kalpurush"/>
                 <w:cs/>
@@ -1285,39 +1121,83 @@
             </w:r>
             <w:r>
               <w:rPr>
-                <w:rStyle w:val="8"/>
+                <w:rStyle w:val="Strong"/>
                 <w:rFonts w:ascii="Kalpurush" w:hAnsi="Kalpurush" w:cs="Kalpurush"/>
                 <w:b w:val="0"/>
                 <w:bCs w:val="0"/>
                 <w:cs/>
                 <w:lang w:bidi="bn-IN"/>
               </w:rPr>
-              <w:t>পরীক্ষা আরম্ভ হওয়ার ৩০ মিনিট পূর্বে পরীক্ষার্থীদের পরীক্ষা কেন্দ্রে উপস্থিত থাকতে হবে। পরীক্ষা আরম্ভ হওয়ার ১৫ মিনিট আগে সতর্কতামূলক একটি ঘণ্টা বাজানো হবে। ঘণ্টা বাজানোর সঙ্গে সঙ্গে পরীক্ষার্থীদের অভিভাবকবৃন্দ পরীক্ষা কেন্দ্রের</w:t>
-            </w:r>
-            <w:r>
-              <w:rPr>
-                <w:rStyle w:val="8"/>
+              <w:t>পরীক্ষা আরম্ভ হওয়ার ৩০ মিনিট পূর্বে পরীক্ষার্থীদের পরীক</w:t>
+            </w:r>
+            <w:r>
+              <w:rPr>
+                <w:rStyle w:val="Strong"/>
                 <w:rFonts w:ascii="Kalpurush" w:hAnsi="Kalpurush" w:cs="Kalpurush"/>
                 <w:b w:val="0"/>
                 <w:bCs w:val="0"/>
-                <w:lang w:bidi="bn-IN"/>
-              </w:rPr>
-              <w:t xml:space="preserve"> </w:t>
-            </w:r>
-            <w:r>
-              <w:rPr>
-                <w:rStyle w:val="8"/>
+                <w:cs/>
+                <w:lang w:bidi="bn-IN"/>
+              </w:rPr>
+              <w:t>্ষা কেন্দ্রে উপস্থিত থাকতে হবে।</w:t>
+            </w:r>
+            <w:r>
+              <w:rPr>
+                <w:rStyle w:val="Strong"/>
                 <w:rFonts w:ascii="Kalpurush" w:hAnsi="Kalpurush" w:cs="Kalpurush"/>
                 <w:b w:val="0"/>
                 <w:bCs w:val="0"/>
                 <w:cs/>
                 <w:lang w:bidi="bn-IN"/>
               </w:rPr>
-              <w:t>বাইরে অবস্থান করবেন</w:t>
-            </w:r>
-            <w:r>
-              <w:rPr>
-                <w:rStyle w:val="8"/>
+              <w:t xml:space="preserve"> পরীক্ষা আরম্ভ হওয়ার ১৫ মিনিট আগে সতর্কতামূলক একটি ঘণ্টা বাজানো হবে। ঘণ্টা বাজানোর সঙ্গে সঙ্গে পরীক্ষার্থীদের অভিভাবকবৃন্দ পরীক্ষ</w:t>
+            </w:r>
+            <w:r>
+              <w:rPr>
+                <w:rStyle w:val="Strong"/>
+                <w:rFonts w:ascii="Kalpurush" w:hAnsi="Kalpurush" w:cs="Kalpurush"/>
+                <w:b w:val="0"/>
+                <w:bCs w:val="0"/>
+                <w:cs/>
+                <w:lang w:bidi="bn-IN"/>
+              </w:rPr>
+              <w:t>া কেন্দ্রের</w:t>
+            </w:r>
+            <w:r>
+              <w:rPr>
+                <w:rStyle w:val="Strong"/>
+                <w:rFonts w:ascii="Kalpurush" w:hAnsi="Kalpurush" w:cs="Kalpurush"/>
+                <w:b w:val="0"/>
+                <w:bCs w:val="0"/>
+                <w:lang w:bidi="bn-IN"/>
+              </w:rPr>
+              <w:t xml:space="preserve"> </w:t>
+            </w:r>
+            <w:r>
+              <w:rPr>
+                <w:rStyle w:val="Strong"/>
+                <w:rFonts w:ascii="Kalpurush" w:hAnsi="Kalpurush" w:cs="Kalpurush"/>
+                <w:b w:val="0"/>
+                <w:bCs w:val="0"/>
+                <w:cs/>
+                <w:lang w:bidi="bn-IN"/>
+              </w:rPr>
+              <w:t>বাইরে</w:t>
+            </w:r>
+            <w:r>
+              <w:rPr>
+                <w:rStyle w:val="Strong"/>
+                <w:rFonts w:ascii="Kalpurush" w:hAnsi="Kalpurush" w:cs="Kalpurush"/>
+                <w:b w:val="0"/>
+                <w:bCs w:val="0"/>
+                <w:cs/>
+                <w:lang w:bidi="bn-IN"/>
+              </w:rPr>
+              <w:t xml:space="preserve"> অবস্থান করবেন</w:t>
+            </w:r>
+            <w:r>
+              <w:rPr>
+                <w:rStyle w:val="Strong"/>
                 <w:rFonts w:ascii="Kalpurush" w:hAnsi="Kalpurush" w:cs="Mangal"/>
                 <w:b w:val="0"/>
                 <w:bCs w:val="0"/>
@@ -1329,7 +1209,7 @@
           </w:p>
           <w:p>
             <w:pPr>
-              <w:spacing w:before="60" w:after="0" w:line="360" w:lineRule="auto"/>
+              <w:spacing w:before="60" w:line="360" w:lineRule="auto"/>
               <w:rPr>
                 <w:rFonts w:ascii="Kalpurush" w:hAnsi="Kalpurush" w:cs="Kalpurush"/>
                 <w:cs/>
@@ -1358,7 +1238,15 @@
                 <w:cs/>
                 <w:lang w:bidi="bn-IN"/>
               </w:rPr>
-              <w:t xml:space="preserve"> পরীক্ষার্থীর</w:t>
+              <w:t xml:space="preserve"> </w:t>
+            </w:r>
+            <w:r>
+              <w:rPr>
+                <w:rFonts w:ascii="Kalpurush" w:hAnsi="Kalpurush" w:cs="Kalpurush"/>
+                <w:cs/>
+                <w:lang w:bidi="bn-IN"/>
+              </w:rPr>
+              <w:t>পরীক্ষার্থীর</w:t>
             </w:r>
             <w:r>
               <w:rPr>
@@ -1470,7 +1358,15 @@
                 <w:cs/>
                 <w:lang w:bidi="bn-IN"/>
               </w:rPr>
-              <w:t>বইপত্র,</w:t>
+              <w:t>বইপত্র</w:t>
+            </w:r>
+            <w:r>
+              <w:rPr>
+                <w:rFonts w:ascii="Kalpurush" w:hAnsi="Kalpurush" w:cs="Kalpurush"/>
+                <w:cs/>
+                <w:lang w:bidi="bn-IN"/>
+              </w:rPr>
+              <w:t>,</w:t>
             </w:r>
             <w:r>
               <w:rPr>
@@ -1567,7 +1463,7 @@
           </w:p>
           <w:p>
             <w:pPr>
-              <w:spacing w:before="60" w:after="0" w:line="360" w:lineRule="auto"/>
+              <w:spacing w:before="60" w:line="360" w:lineRule="auto"/>
               <w:rPr>
                 <w:rFonts w:ascii="Kalpurush" w:hAnsi="Kalpurush" w:cs="Kalpurush"/>
                 <w:cs/>
@@ -1596,12 +1492,20 @@
                 <w:cs/>
                 <w:lang w:bidi="bn-IN"/>
               </w:rPr>
-              <w:t xml:space="preserve"> পরীক্ষার্থীরা প্রয়োজনে সাধারণ ক্যালকুলেটর ব্যবহার করতে পারবে। সায়েন্টিফিক ক্যালকুলেটর ব্যবহার পরীক্ষা কেন্দ্রের অভ্যন্তরে নিষিদ্ধ থাকবে।</w:t>
+              <w:t xml:space="preserve"> </w:t>
+            </w:r>
+            <w:r>
+              <w:rPr>
+                <w:rFonts w:ascii="Kalpurush" w:hAnsi="Kalpurush" w:cs="Kalpurush"/>
+                <w:cs/>
+                <w:lang w:bidi="bn-IN"/>
+              </w:rPr>
+              <w:t>পরীক্ষার্থীরা প্রয়োজনে সাধারণ ক্যালকুলেটর ব্যবহার করতে পারবে। সায়েন্টিফিক ক্যালকুলেটর ব্যবহার পরীক্ষা কেন্দ্রের অভ্যন্তরে নিষিদ্ধ থাকবে।</w:t>
             </w:r>
           </w:p>
           <w:p>
             <w:pPr>
-              <w:spacing w:before="240" w:after="0" w:line="360" w:lineRule="auto"/>
+              <w:spacing w:before="240" w:line="360" w:lineRule="auto"/>
               <w:rPr>
                 <w:rFonts w:ascii="Kalpurush" w:hAnsi="Kalpurush" w:cs="Kalpurush"/>
               </w:rPr>
@@ -1621,7 +1525,7 @@
             </w:r>
             <w:r>
               <w:rPr>
-                <w:rFonts w:hint="cs" w:ascii="Kalpurush" w:hAnsi="Kalpurush" w:cs="Kalpurush"/>
+                <w:rFonts w:ascii="Kalpurush" w:hAnsi="Kalpurush" w:cs="Kalpurush" w:hint="cs"/>
                 <w:b/>
                 <w:bCs/>
                 <w:sz w:val="24"/>
@@ -1681,7 +1585,7 @@
             </w:r>
             <w:r>
               <w:rPr>
-                <w:rFonts w:hint="cs" w:ascii="Kalpurush" w:hAnsi="Kalpurush" w:cs="Kalpurush"/>
+                <w:rFonts w:ascii="Kalpurush" w:hAnsi="Kalpurush" w:cs="Kalpurush" w:hint="cs"/>
                 <w:sz w:val="24"/>
                 <w:szCs w:val="24"/>
                 <w:cs/>
@@ -1882,11 +1786,12 @@
       <w:r>
         <w:rPr>
           <w:rFonts w:ascii="SolaimanLipi" w:hAnsi="SolaimanLipi" w:cs="SolaimanLipi"/>
+          <w:noProof/>
         </w:rPr>
         <mc:AlternateContent>
           <mc:Choice Requires="wps">
             <w:drawing>
-              <wp:anchor distT="0" distB="0" distL="114300" distR="114300" simplePos="0" relativeHeight="251661312" behindDoc="0" locked="0" layoutInCell="1" allowOverlap="1">
+              <wp:anchor distT="0" distB="0" distL="114300" distR="114300" simplePos="0" relativeHeight="251660288" behindDoc="0" locked="0" layoutInCell="1" allowOverlap="1" wp14:anchorId="4CF4EAFB" wp14:editId="6AE76B15">
                 <wp:simplePos x="0" y="0"/>
                 <wp:positionH relativeFrom="margin">
                   <wp:align>right</wp:align>
@@ -1937,21 +1842,27 @@
                         </a:fontRef>
                       </wps:style>
                       <wps:bodyPr rot="0" spcFirstLastPara="0" vertOverflow="overflow" horzOverflow="overflow" vert="horz" wrap="square" lIns="91440" tIns="45720" rIns="91440" bIns="45720" numCol="1" spcCol="0" rtlCol="0" fromWordArt="0" anchor="ctr" anchorCtr="0" forceAA="0" compatLnSpc="1">
+                        <a:prstTxWarp prst="textNoShape">
+                          <a:avLst/>
+                        </a:prstTxWarp>
                         <a:noAutofit/>
                       </wps:bodyPr>
                     </wps:wsp>
                   </a:graphicData>
                 </a:graphic>
+                <wp14:sizeRelH relativeFrom="margin">
+                  <wp14:pctWidth>0</wp14:pctWidth>
+                </wp14:sizeRelH>
+                <wp14:sizeRelV relativeFrom="margin">
+                  <wp14:pctHeight>0</wp14:pctHeight>
+                </wp14:sizeRelV>
               </wp:anchor>
             </w:drawing>
           </mc:Choice>
           <mc:Fallback>
             <w:pict>
-              <v:rect id="_x0000_s1026" o:spid="_x0000_s1026" o:spt="1" style="position:absolute;left:0pt;margin-top:10.95pt;height:9pt;width:538.5pt;mso-position-horizontal:right;mso-position-horizontal-relative:margin;z-index:251661312;v-text-anchor:middle;mso-width-relative:page;mso-height-relative:page;" fillcolor="#008000" filled="t" stroked="t" coordsize="21600,21600" o:gfxdata="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">
-                <v:fill on="t" focussize="0,0"/>
-                <v:stroke weight="1pt" color="#008000 [3204]" miterlimit="8" joinstyle="miter"/>
-                <v:imagedata o:title=""/>
-                <o:lock v:ext="edit" aspectratio="f"/>
+              <v:rect w14:anchorId="3D7E480A" id="Rectangle 952241350" o:spid="_x0000_s1026" style="position:absolute;margin-left:487.3pt;margin-top:10.95pt;width:538.5pt;height:9pt;z-index:251660288;visibility:visible;mso-wrap-style:square;mso-width-percent:0;mso-height-percent:0;mso-wrap-distance-left:9pt;mso-wrap-distance-top:0;mso-wrap-distance-right:9pt;mso-wrap-distance-bottom:0;mso-position-horizontal:right;mso-position-horizontal-relative:margin;mso-position-vertical:absolute;mso-position-vertical-relative:text;mso-width-percent:0;mso-height-percent:0;mso-width-relative:margin;mso-height-relative:margin;v-text-anchor:middle" o:gfxdata="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" fillcolor="green" strokecolor="green" strokeweight="1pt">
+                <w10:wrap anchorx="margin"/>
               </v:rect>
             </w:pict>
           </mc:Fallback>
@@ -1959,35 +1870,35 @@
       </w:r>
     </w:p>
     <w:sectPr>
-      <w:headerReference r:id="rId7" w:type="first"/>
-      <w:headerReference r:id="rId5" w:type="default"/>
-      <w:footerReference r:id="rId8" w:type="default"/>
-      <w:headerReference r:id="rId6" w:type="even"/>
+      <w:headerReference w:type="even" r:id="rId8"/>
+      <w:headerReference w:type="default" r:id="rId9"/>
+      <w:footerReference w:type="default" r:id="rId10"/>
+      <w:headerReference w:type="first" r:id="rId11"/>
       <w:pgSz w:w="12240" w:h="15840"/>
       <w:pgMar w:top="720" w:right="720" w:bottom="720" w:left="720" w:header="720" w:footer="720" w:gutter="0"/>
-      <w:cols w:space="720" w:num="1"/>
-      <w:docGrid w:linePitch="360" w:charSpace="0"/>
+      <w:cols w:space="720"/>
+      <w:docGrid w:linePitch="360"/>
     </w:sectPr>
   </w:body>
 </w:document>
 </file>
 
 <file path=word/endnotes.xml><?xml version="1.0" encoding="utf-8"?>
-<w:endnotes xmlns:wpc="http://schemas.microsoft.com/office/word/2010/wordprocessingCanvas" xmlns:mc="http://schemas.openxmlformats.org/markup-compatibility/2006" xmlns:o="urn:schemas-microsoft-com:office:office" xmlns:r="http://schemas.openxmlformats.org/officeDocument/2006/relationships" xmlns:m="http://schemas.openxmlformats.org/officeDocument/2006/math" xmlns:v="urn:schemas-microsoft-com:vml" xmlns:wp14="http://schemas.microsoft.com/office/word/2010/wordprocessingDrawing" xmlns:wp="http://schemas.openxmlformats.org/drawingml/2006/wordprocessingDrawing" xmlns:w="http://schemas.openxmlformats.org/wordprocessingml/2006/main" xmlns:w14="http://schemas.microsoft.com/office/word/2010/wordml" xmlns:w15="http://schemas.microsoft.com/office/word/2012/wordml" xmlns:w10="urn:schemas-microsoft-com:office:word" xmlns:wpg="http://schemas.microsoft.com/office/word/2010/wordprocessingGroup" xmlns:wpi="http://schemas.microsoft.com/office/word/2010/wordprocessingInk" xmlns:wne="http://schemas.microsoft.com/office/word/2006/wordml" xmlns:wps="http://schemas.microsoft.com/office/word/2010/wordprocessingShape" xmlns:wpsCustomData="http://www.wps.cn/officeDocument/2013/wpsCustomData" mc:Ignorable="w14 w15 wp14">
-  <w:endnote w:type="separator" w:id="0">
+<w:endnotes xmlns:wpc="http://schemas.microsoft.com/office/word/2010/wordprocessingCanvas" xmlns:cx="http://schemas.microsoft.com/office/drawing/2014/chartex" xmlns:cx1="http://schemas.microsoft.com/office/drawing/2015/9/8/chartex" xmlns:cx2="http://schemas.microsoft.com/office/drawing/2015/10/21/chartex" xmlns:cx3="http://schemas.microsoft.com/office/drawing/2016/5/9/chartex" xmlns:cx4="http://schemas.microsoft.com/office/drawing/2016/5/10/chartex" xmlns:cx5="http://schemas.microsoft.com/office/drawing/2016/5/11/chartex" xmlns:cx6="http://schemas.microsoft.com/office/drawing/2016/5/12/chartex" xmlns:cx7="http://schemas.microsoft.com/office/drawing/2016/5/13/chartex" xmlns:cx8="http://schemas.microsoft.com/office/drawing/2016/5/14/chartex" xmlns:mc="http://schemas.openxmlformats.org/markup-compatibility/2006" xmlns:aink="http://schemas.microsoft.com/office/drawing/2016/ink" xmlns:am3d="http://schemas.microsoft.com/office/drawing/2017/model3d" xmlns:o="urn:schemas-microsoft-com:office:office" xmlns:r="http://schemas.openxmlformats.org/officeDocument/2006/relationships" xmlns:m="http://schemas.openxmlformats.org/officeDocument/2006/math" xmlns:v="urn:schemas-microsoft-com:vml" xmlns:wp14="http://schemas.microsoft.com/office/word/2010/wordprocessingDrawing" xmlns:wp="http://schemas.openxmlformats.org/drawingml/2006/wordprocessingDrawing" xmlns:w10="urn:schemas-microsoft-com:office:word" xmlns:w="http://schemas.openxmlformats.org/wordprocessingml/2006/main" xmlns:w14="http://schemas.microsoft.com/office/word/2010/wordml" xmlns:w15="http://schemas.microsoft.com/office/word/2012/wordml" xmlns:w16cex="http://schemas.microsoft.com/office/word/2018/wordml/cex" xmlns:w16cid="http://schemas.microsoft.com/office/word/2016/wordml/cid" xmlns:w16="http://schemas.microsoft.com/office/word/2018/wordml" xmlns:w16sdtdh="http://schemas.microsoft.com/office/word/2020/wordml/sdtdatahash" xmlns:w16se="http://schemas.microsoft.com/office/word/2015/wordml/symex" xmlns:wpg="http://schemas.microsoft.com/office/word/2010/wordprocessingGroup" xmlns:wpi="http://schemas.microsoft.com/office/word/2010/wordprocessingInk" xmlns:wne="http://schemas.microsoft.com/office/word/2006/wordml" xmlns:wps="http://schemas.microsoft.com/office/word/2010/wordprocessingShape" mc:Ignorable="w14 w15 w16se w16cid w16 w16cex w16sdtdh wp14">
+  <w:endnote w:type="separator" w:id="-1">
     <w:p>
       <w:pPr>
-        <w:spacing w:line="240" w:lineRule="auto"/>
+        <w:spacing w:after="0" w:line="240" w:lineRule="auto"/>
       </w:pPr>
       <w:r>
         <w:separator/>
       </w:r>
     </w:p>
   </w:endnote>
-  <w:endnote w:type="continuationSeparator" w:id="1">
+  <w:endnote w:type="continuationSeparator" w:id="0">
     <w:p>
       <w:pPr>
-        <w:spacing w:line="240" w:lineRule="auto"/>
+        <w:spacing w:after="0" w:line="240" w:lineRule="auto"/>
       </w:pPr>
       <w:r>
         <w:continuationSeparator/>
@@ -1998,27 +1909,28 @@
 </file>
 
 <file path=word/footer1.xml><?xml version="1.0" encoding="utf-8"?>
-<w:ftr xmlns:wpc="http://schemas.microsoft.com/office/word/2010/wordprocessingCanvas" xmlns:mc="http://schemas.openxmlformats.org/markup-compatibility/2006" xmlns:o="urn:schemas-microsoft-com:office:office" xmlns:r="http://schemas.openxmlformats.org/officeDocument/2006/relationships" xmlns:m="http://schemas.openxmlformats.org/officeDocument/2006/math" xmlns:v="urn:schemas-microsoft-com:vml" xmlns:wp14="http://schemas.microsoft.com/office/word/2010/wordprocessingDrawing" xmlns:wp="http://schemas.openxmlformats.org/drawingml/2006/wordprocessingDrawing" xmlns:w10="urn:schemas-microsoft-com:office:word" xmlns:w="http://schemas.openxmlformats.org/wordprocessingml/2006/main" xmlns:w14="http://schemas.microsoft.com/office/word/2010/wordml" xmlns:w15="http://schemas.microsoft.com/office/word/2012/wordml" xmlns:wpg="http://schemas.microsoft.com/office/word/2010/wordprocessingGroup" xmlns:wpi="http://schemas.microsoft.com/office/word/2010/wordprocessingInk" xmlns:wne="http://schemas.microsoft.com/office/word/2006/wordml" xmlns:wps="http://schemas.microsoft.com/office/word/2010/wordprocessingShape" xmlns:wpsCustomData="http://www.wps.cn/officeDocument/2013/wpsCustomData" mc:Ignorable="w14 w15 wp14">
+<w:ftr xmlns:wpc="http://schemas.microsoft.com/office/word/2010/wordprocessingCanvas" xmlns:cx="http://schemas.microsoft.com/office/drawing/2014/chartex" xmlns:cx1="http://schemas.microsoft.com/office/drawing/2015/9/8/chartex" xmlns:cx2="http://schemas.microsoft.com/office/drawing/2015/10/21/chartex" xmlns:cx3="http://schemas.microsoft.com/office/drawing/2016/5/9/chartex" xmlns:cx4="http://schemas.microsoft.com/office/drawing/2016/5/10/chartex" xmlns:cx5="http://schemas.microsoft.com/office/drawing/2016/5/11/chartex" xmlns:cx6="http://schemas.microsoft.com/office/drawing/2016/5/12/chartex" xmlns:cx7="http://schemas.microsoft.com/office/drawing/2016/5/13/chartex" xmlns:cx8="http://schemas.microsoft.com/office/drawing/2016/5/14/chartex" xmlns:mc="http://schemas.openxmlformats.org/markup-compatibility/2006" xmlns:aink="http://schemas.microsoft.com/office/drawing/2016/ink" xmlns:am3d="http://schemas.microsoft.com/office/drawing/2017/model3d" xmlns:o="urn:schemas-microsoft-com:office:office" xmlns:r="http://schemas.openxmlformats.org/officeDocument/2006/relationships" xmlns:m="http://schemas.openxmlformats.org/officeDocument/2006/math" xmlns:v="urn:schemas-microsoft-com:vml" xmlns:wp14="http://schemas.microsoft.com/office/word/2010/wordprocessingDrawing" xmlns:wp="http://schemas.openxmlformats.org/drawingml/2006/wordprocessingDrawing" xmlns:w10="urn:schemas-microsoft-com:office:word" xmlns:w="http://schemas.openxmlformats.org/wordprocessingml/2006/main" xmlns:w14="http://schemas.microsoft.com/office/word/2010/wordml" xmlns:w15="http://schemas.microsoft.com/office/word/2012/wordml" xmlns:w16cex="http://schemas.microsoft.com/office/word/2018/wordml/cex" xmlns:w16cid="http://schemas.microsoft.com/office/word/2016/wordml/cid" xmlns:w16="http://schemas.microsoft.com/office/word/2018/wordml" xmlns:w16sdtdh="http://schemas.microsoft.com/office/word/2020/wordml/sdtdatahash" xmlns:w16se="http://schemas.microsoft.com/office/word/2015/wordml/symex" xmlns:wpg="http://schemas.microsoft.com/office/word/2010/wordprocessingGroup" xmlns:wpi="http://schemas.microsoft.com/office/word/2010/wordprocessingInk" xmlns:wne="http://schemas.microsoft.com/office/word/2006/wordml" xmlns:wps="http://schemas.microsoft.com/office/word/2010/wordprocessingShape" mc:Ignorable="w14 w15 w16se w16cid w16 w16cex w16sdtdh wp14">
   <w:p>
     <w:pPr>
-      <w:pStyle w:val="5"/>
+      <w:pStyle w:val="Footer"/>
     </w:pPr>
     <w:r>
       <w:rPr>
         <w:rFonts w:ascii="SolaimanLipi" w:hAnsi="SolaimanLipi" w:cs="SolaimanLipi"/>
+        <w:noProof/>
       </w:rPr>
       <mc:AlternateContent>
         <mc:Choice Requires="wps">
           <w:drawing>
-            <wp:anchor distT="0" distB="0" distL="114300" distR="114300" simplePos="0" relativeHeight="251666432" behindDoc="0" locked="0" layoutInCell="1" allowOverlap="1">
+            <wp:anchor distT="0" distB="0" distL="114300" distR="114300" simplePos="0" relativeHeight="251666432" behindDoc="0" locked="0" layoutInCell="1" allowOverlap="1" wp14:anchorId="438B5D48" wp14:editId="548675FC">
               <wp:simplePos x="0" y="0"/>
               <wp:positionH relativeFrom="page">
                 <wp:align>right</wp:align>
               </wp:positionH>
               <wp:positionV relativeFrom="paragraph">
-                <wp:posOffset>-6985</wp:posOffset>
+                <wp:posOffset>-7409</wp:posOffset>
               </wp:positionV>
-              <wp:extent cx="7755255" cy="660400"/>
+              <wp:extent cx="7755467" cy="660189"/>
               <wp:effectExtent l="0" t="0" r="17145" b="26035"/>
               <wp:wrapNone/>
               <wp:docPr id="2" name="Rectangle 2"/>
@@ -2076,16 +1988,12 @@
                               <w:color w:val="FFFFFF" w:themeColor="background1"/>
                               <w:sz w:val="24"/>
                               <w:szCs w:val="24"/>
-                              <w14:textFill>
-                                <w14:solidFill>
-                                  <w14:schemeClr w14:val="bg1"/>
-                                </w14:solidFill>
-                              </w14:textFill>
                             </w:rPr>
                           </w:pPr>
+                          <w:proofErr w:type="spellStart"/>
                           <w:r>
                             <w:rPr>
-                              <w:rStyle w:val="13"/>
+                              <w:rStyle w:val="oypena"/>
                               <w:rFonts w:ascii="Arial Black" w:hAnsi="Arial Black" w:cstheme="majorBidi"/>
                               <w:b/>
                               <w:bCs/>
@@ -2093,14 +2001,122 @@
                               <w:sz w:val="24"/>
                               <w:szCs w:val="24"/>
                               <w:lang w:bidi="bn-IN"/>
-                              <w14:textFill>
-                                <w14:solidFill>
-                                  <w14:schemeClr w14:val="bg1"/>
-                                </w14:solidFill>
-                              </w14:textFill>
                             </w:rPr>
-                            <w:t>Aunkur Shishu-Kishor Sahittya Sangskritik Sangsad</w:t>
+                            <w:t>Aunkur</w:t>
                           </w:r>
+                          <w:proofErr w:type="spellEnd"/>
+                          <w:r>
+                            <w:rPr>
+                              <w:rStyle w:val="oypena"/>
+                              <w:rFonts w:ascii="Arial Black" w:hAnsi="Arial Black" w:cstheme="majorBidi"/>
+                              <w:b/>
+                              <w:bCs/>
+                              <w:color w:val="FFFFFF" w:themeColor="background1"/>
+                              <w:sz w:val="24"/>
+                              <w:szCs w:val="24"/>
+                              <w:lang w:bidi="bn-IN"/>
+                            </w:rPr>
+                            <w:t xml:space="preserve"> </w:t>
+                          </w:r>
+                          <w:proofErr w:type="spellStart"/>
+                          <w:r>
+                            <w:rPr>
+                              <w:rStyle w:val="oypena"/>
+                              <w:rFonts w:ascii="Arial Black" w:hAnsi="Arial Black" w:cstheme="majorBidi"/>
+                              <w:b/>
+                              <w:bCs/>
+                              <w:color w:val="FFFFFF" w:themeColor="background1"/>
+                              <w:sz w:val="24"/>
+                              <w:szCs w:val="24"/>
+                              <w:lang w:bidi="bn-IN"/>
+                            </w:rPr>
+                            <w:t>Shishu</w:t>
+                          </w:r>
+                          <w:proofErr w:type="spellEnd"/>
+                          <w:r>
+                            <w:rPr>
+                              <w:rStyle w:val="oypena"/>
+                              <w:rFonts w:ascii="Arial Black" w:hAnsi="Arial Black" w:cstheme="majorBidi"/>
+                              <w:b/>
+                              <w:bCs/>
+                              <w:color w:val="FFFFFF" w:themeColor="background1"/>
+                              <w:sz w:val="24"/>
+                              <w:szCs w:val="24"/>
+                              <w:lang w:bidi="bn-IN"/>
+                            </w:rPr>
+                            <w:t xml:space="preserve">-Kishor </w:t>
+                          </w:r>
+                          <w:proofErr w:type="spellStart"/>
+                          <w:r>
+                            <w:rPr>
+                              <w:rStyle w:val="oypena"/>
+                              <w:rFonts w:ascii="Arial Black" w:hAnsi="Arial Black" w:cstheme="majorBidi"/>
+                              <w:b/>
+                              <w:bCs/>
+                              <w:color w:val="FFFFFF" w:themeColor="background1"/>
+                              <w:sz w:val="24"/>
+                              <w:szCs w:val="24"/>
+                              <w:lang w:bidi="bn-IN"/>
+                            </w:rPr>
+                            <w:t>Sahittya</w:t>
+                          </w:r>
+                          <w:proofErr w:type="spellEnd"/>
+                          <w:r>
+                            <w:rPr>
+                              <w:rStyle w:val="oypena"/>
+                              <w:rFonts w:ascii="Arial Black" w:hAnsi="Arial Black" w:cstheme="majorBidi"/>
+                              <w:b/>
+                              <w:bCs/>
+                              <w:color w:val="FFFFFF" w:themeColor="background1"/>
+                              <w:sz w:val="24"/>
+                              <w:szCs w:val="24"/>
+                              <w:lang w:bidi="bn-IN"/>
+                            </w:rPr>
+                            <w:t xml:space="preserve"> </w:t>
+                          </w:r>
+                          <w:proofErr w:type="spellStart"/>
+                          <w:r>
+                            <w:rPr>
+                              <w:rStyle w:val="oypena"/>
+                              <w:rFonts w:ascii="Arial Black" w:hAnsi="Arial Black" w:cstheme="majorBidi"/>
+                              <w:b/>
+                              <w:bCs/>
+                              <w:color w:val="FFFFFF" w:themeColor="background1"/>
+                              <w:sz w:val="24"/>
+                              <w:szCs w:val="24"/>
+                              <w:lang w:bidi="bn-IN"/>
+                            </w:rPr>
+                            <w:t>Sangskritik</w:t>
+                          </w:r>
+                          <w:proofErr w:type="spellEnd"/>
+                          <w:r>
+                            <w:rPr>
+                              <w:rStyle w:val="oypena"/>
+                              <w:rFonts w:ascii="Arial Black" w:hAnsi="Arial Black" w:cstheme="majorBidi"/>
+                              <w:b/>
+                              <w:bCs/>
+                              <w:color w:val="FFFFFF" w:themeColor="background1"/>
+                              <w:sz w:val="24"/>
+                              <w:szCs w:val="24"/>
+                              <w:lang w:bidi="bn-IN"/>
+                            </w:rPr>
+                            <w:t xml:space="preserve"> </w:t>
+                          </w:r>
+                          <w:proofErr w:type="spellStart"/>
+                          <w:r>
+                            <w:rPr>
+                              <w:rStyle w:val="oypena"/>
+                              <w:rFonts w:ascii="Arial Black" w:hAnsi="Arial Black" w:cstheme="majorBidi"/>
+                              <w:b/>
+                              <w:bCs/>
+                              <w:color w:val="FFFFFF" w:themeColor="background1"/>
+                              <w:sz w:val="24"/>
+                              <w:szCs w:val="24"/>
+                              <w:lang w:bidi="bn-IN"/>
+                            </w:rPr>
+                            <w:t>Sangsad</w:t>
+                          </w:r>
+                          <w:proofErr w:type="spellEnd"/>
                         </w:p>
                         <w:p>
                           <w:pPr>
@@ -2124,21 +2140,26 @@
                       </w:txbxContent>
                     </wps:txbx>
                     <wps:bodyPr rot="0" spcFirstLastPara="0" vertOverflow="overflow" horzOverflow="overflow" vert="horz" wrap="square" lIns="91440" tIns="45720" rIns="91440" bIns="45720" numCol="1" spcCol="0" rtlCol="0" fromWordArt="0" anchor="ctr" anchorCtr="0" forceAA="0" compatLnSpc="1">
+                      <a:prstTxWarp prst="textNoShape">
+                        <a:avLst/>
+                      </a:prstTxWarp>
                       <a:noAutofit/>
                     </wps:bodyPr>
                   </wps:wsp>
                 </a:graphicData>
               </a:graphic>
+              <wp14:sizeRelH relativeFrom="margin">
+                <wp14:pctWidth>0</wp14:pctWidth>
+              </wp14:sizeRelH>
+              <wp14:sizeRelV relativeFrom="margin">
+                <wp14:pctHeight>0</wp14:pctHeight>
+              </wp14:sizeRelV>
             </wp:anchor>
           </w:drawing>
         </mc:Choice>
         <mc:Fallback>
           <w:pict>
-            <v:rect id="_x0000_s1026" o:spid="_x0000_s1026" o:spt="1" style="position:absolute;left:0pt;margin-top:-0.55pt;height:52pt;width:610.65pt;mso-position-horizontal:right;mso-position-horizontal-relative:page;z-index:251666432;v-text-anchor:middle;mso-width-relative:page;mso-height-relative:page;" fillcolor="#004D00" filled="t" stroked="t" coordsize="21600,21600" o:gfxdata="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">
-              <v:fill on="t" focussize="0,0"/>
-              <v:stroke weight="1pt" color="#008000 [3204]" miterlimit="8" joinstyle="miter"/>
-              <v:imagedata o:title=""/>
-              <o:lock v:ext="edit" aspectratio="f"/>
+            <v:rect w14:anchorId="3DFC557E" id="_x0000_s1028" style="position:absolute;margin-left:559.45pt;margin-top:-.6pt;width:610.65pt;height:52pt;z-index:251666432;visibility:visible;mso-wrap-style:square;mso-width-percent:0;mso-height-percent:0;mso-wrap-distance-left:9pt;mso-wrap-distance-top:0;mso-wrap-distance-right:9pt;mso-wrap-distance-bottom:0;mso-position-horizontal:right;mso-position-horizontal-relative:page;mso-position-vertical:absolute;mso-position-vertical-relative:text;mso-width-percent:0;mso-height-percent:0;mso-width-relative:margin;mso-height-relative:margin;v-text-anchor:middle" o:gfxdata="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" fillcolor="#004d00" strokecolor="green" strokeweight="1pt">
               <v:textbox>
                 <w:txbxContent>
                   <w:p>
@@ -2152,16 +2173,12 @@
                         <w:color w:val="FFFFFF" w:themeColor="background1"/>
                         <w:sz w:val="24"/>
                         <w:szCs w:val="24"/>
-                        <w14:textFill>
-                          <w14:solidFill>
-                            <w14:schemeClr w14:val="bg1"/>
-                          </w14:solidFill>
-                        </w14:textFill>
                       </w:rPr>
                     </w:pPr>
+                    <w:proofErr w:type="spellStart"/>
                     <w:r>
                       <w:rPr>
-                        <w:rStyle w:val="13"/>
+                        <w:rStyle w:val="oypena"/>
                         <w:rFonts w:ascii="Arial Black" w:hAnsi="Arial Black" w:cstheme="majorBidi"/>
                         <w:b/>
                         <w:bCs/>
@@ -2169,14 +2186,122 @@
                         <w:sz w:val="24"/>
                         <w:szCs w:val="24"/>
                         <w:lang w:bidi="bn-IN"/>
-                        <w14:textFill>
-                          <w14:solidFill>
-                            <w14:schemeClr w14:val="bg1"/>
-                          </w14:solidFill>
-                        </w14:textFill>
                       </w:rPr>
-                      <w:t>Aunkur Shishu-Kishor Sahittya Sangskritik Sangsad</w:t>
+                      <w:t>Aunkur</w:t>
                     </w:r>
+                    <w:proofErr w:type="spellEnd"/>
+                    <w:r>
+                      <w:rPr>
+                        <w:rStyle w:val="oypena"/>
+                        <w:rFonts w:ascii="Arial Black" w:hAnsi="Arial Black" w:cstheme="majorBidi"/>
+                        <w:b/>
+                        <w:bCs/>
+                        <w:color w:val="FFFFFF" w:themeColor="background1"/>
+                        <w:sz w:val="24"/>
+                        <w:szCs w:val="24"/>
+                        <w:lang w:bidi="bn-IN"/>
+                      </w:rPr>
+                      <w:t xml:space="preserve"> </w:t>
+                    </w:r>
+                    <w:proofErr w:type="spellStart"/>
+                    <w:r>
+                      <w:rPr>
+                        <w:rStyle w:val="oypena"/>
+                        <w:rFonts w:ascii="Arial Black" w:hAnsi="Arial Black" w:cstheme="majorBidi"/>
+                        <w:b/>
+                        <w:bCs/>
+                        <w:color w:val="FFFFFF" w:themeColor="background1"/>
+                        <w:sz w:val="24"/>
+                        <w:szCs w:val="24"/>
+                        <w:lang w:bidi="bn-IN"/>
+                      </w:rPr>
+                      <w:t>Shishu-Kishor</w:t>
+                    </w:r>
+                    <w:proofErr w:type="spellEnd"/>
+                    <w:r>
+                      <w:rPr>
+                        <w:rStyle w:val="oypena"/>
+                        <w:rFonts w:ascii="Arial Black" w:hAnsi="Arial Black" w:cstheme="majorBidi"/>
+                        <w:b/>
+                        <w:bCs/>
+                        <w:color w:val="FFFFFF" w:themeColor="background1"/>
+                        <w:sz w:val="24"/>
+                        <w:szCs w:val="24"/>
+                        <w:lang w:bidi="bn-IN"/>
+                      </w:rPr>
+                      <w:t xml:space="preserve"> </w:t>
+                    </w:r>
+                    <w:proofErr w:type="spellStart"/>
+                    <w:r>
+                      <w:rPr>
+                        <w:rStyle w:val="oypena"/>
+                        <w:rFonts w:ascii="Arial Black" w:hAnsi="Arial Black" w:cstheme="majorBidi"/>
+                        <w:b/>
+                        <w:bCs/>
+                        <w:color w:val="FFFFFF" w:themeColor="background1"/>
+                        <w:sz w:val="24"/>
+                        <w:szCs w:val="24"/>
+                        <w:lang w:bidi="bn-IN"/>
+                      </w:rPr>
+                      <w:t>Sahittya</w:t>
+                    </w:r>
+                    <w:proofErr w:type="spellEnd"/>
+                    <w:r>
+                      <w:rPr>
+                        <w:rStyle w:val="oypena"/>
+                        <w:rFonts w:ascii="Arial Black" w:hAnsi="Arial Black" w:cstheme="majorBidi"/>
+                        <w:b/>
+                        <w:bCs/>
+                        <w:color w:val="FFFFFF" w:themeColor="background1"/>
+                        <w:sz w:val="24"/>
+                        <w:szCs w:val="24"/>
+                        <w:lang w:bidi="bn-IN"/>
+                      </w:rPr>
+                      <w:t xml:space="preserve"> </w:t>
+                    </w:r>
+                    <w:proofErr w:type="spellStart"/>
+                    <w:r>
+                      <w:rPr>
+                        <w:rStyle w:val="oypena"/>
+                        <w:rFonts w:ascii="Arial Black" w:hAnsi="Arial Black" w:cstheme="majorBidi"/>
+                        <w:b/>
+                        <w:bCs/>
+                        <w:color w:val="FFFFFF" w:themeColor="background1"/>
+                        <w:sz w:val="24"/>
+                        <w:szCs w:val="24"/>
+                        <w:lang w:bidi="bn-IN"/>
+                      </w:rPr>
+                      <w:t>Sangskritik</w:t>
+                    </w:r>
+                    <w:proofErr w:type="spellEnd"/>
+                    <w:r>
+                      <w:rPr>
+                        <w:rStyle w:val="oypena"/>
+                        <w:rFonts w:ascii="Arial Black" w:hAnsi="Arial Black" w:cstheme="majorBidi"/>
+                        <w:b/>
+                        <w:bCs/>
+                        <w:color w:val="FFFFFF" w:themeColor="background1"/>
+                        <w:sz w:val="24"/>
+                        <w:szCs w:val="24"/>
+                        <w:lang w:bidi="bn-IN"/>
+                      </w:rPr>
+                      <w:t xml:space="preserve"> </w:t>
+                    </w:r>
+                    <w:proofErr w:type="spellStart"/>
+                    <w:r>
+                      <w:rPr>
+                        <w:rStyle w:val="oypena"/>
+                        <w:rFonts w:ascii="Arial Black" w:hAnsi="Arial Black" w:cstheme="majorBidi"/>
+                        <w:b/>
+                        <w:bCs/>
+                        <w:color w:val="FFFFFF" w:themeColor="background1"/>
+                        <w:sz w:val="24"/>
+                        <w:szCs w:val="24"/>
+                        <w:lang w:bidi="bn-IN"/>
+                      </w:rPr>
+                      <w:t>Sangsad</w:t>
+                    </w:r>
+                    <w:proofErr w:type="spellEnd"/>
                   </w:p>
                   <w:p>
                     <w:pPr>
@@ -2188,17 +2313,28 @@
                         <w:szCs w:val="20"/>
                       </w:rPr>
                     </w:pPr>
+                    <w:proofErr w:type="spellStart"/>
                     <w:r>
                       <w:rPr>
                         <w:rFonts w:ascii="Arial Black" w:hAnsi="Arial Black"/>
                         <w:sz w:val="24"/>
                         <w:szCs w:val="24"/>
                       </w:rPr>
-                      <w:t>Chattogram City South</w:t>
+                      <w:t>Chattogram</w:t>
+                    </w:r>
+                    <w:proofErr w:type="spellEnd"/>
+                    <w:r>
+                      <w:rPr>
+                        <w:rFonts w:ascii="Arial Black" w:hAnsi="Arial Black"/>
+                        <w:sz w:val="24"/>
+                        <w:szCs w:val="24"/>
+                      </w:rPr>
+                      <w:t xml:space="preserve"> City South</w:t>
                     </w:r>
                   </w:p>
                 </w:txbxContent>
               </v:textbox>
+              <w10:wrap anchorx="page"/>
             </v:rect>
           </w:pict>
         </mc:Fallback>
@@ -2207,15 +2343,16 @@
     <w:r>
       <w:rPr>
         <w:rFonts w:ascii="SolaimanLipi" w:hAnsi="SolaimanLipi" w:cs="SolaimanLipi"/>
+        <w:noProof/>
       </w:rPr>
       <w:drawing>
-        <wp:anchor distT="0" distB="0" distL="114300" distR="114300" simplePos="0" relativeHeight="251667456" behindDoc="1" locked="0" layoutInCell="1" allowOverlap="1">
+        <wp:anchor distT="0" distB="0" distL="114300" distR="114300" simplePos="0" relativeHeight="251670528" behindDoc="1" locked="0" layoutInCell="1" allowOverlap="1" wp14:anchorId="456934CA" wp14:editId="701B06F7">
           <wp:simplePos x="0" y="0"/>
           <wp:positionH relativeFrom="column">
             <wp:posOffset>-304800</wp:posOffset>
           </wp:positionH>
           <wp:positionV relativeFrom="paragraph">
-            <wp:posOffset>153670</wp:posOffset>
+            <wp:posOffset>153882</wp:posOffset>
           </wp:positionV>
           <wp:extent cx="266700" cy="266700"/>
           <wp:effectExtent l="0" t="0" r="0" b="0"/>
@@ -2228,16 +2365,17 @@
             <a:graphicData uri="http://schemas.openxmlformats.org/drawingml/2006/picture">
               <pic:pic xmlns:pic="http://schemas.openxmlformats.org/drawingml/2006/picture">
                 <pic:nvPicPr>
-                  <pic:cNvPr id="3" name="Picture 1"/>
-                  <pic:cNvPicPr>
-                    <a:picLocks noChangeAspect="1"/>
-                  </pic:cNvPicPr>
+                  <pic:cNvPr id="429108925" name="Picture 429108925"/>
+                  <pic:cNvPicPr/>
                 </pic:nvPicPr>
                 <pic:blipFill>
                   <a:blip r:embed="rId1" cstate="print">
                     <a:extLst>
                       <a:ext uri="{28A0092B-C50C-407E-A947-70E740481C1C}">
                         <a14:useLocalDpi xmlns:a14="http://schemas.microsoft.com/office/drawing/2010/main" val="0"/>
+                      </a:ext>
+                      <a:ext uri="{837473B0-CC2E-450A-ABE3-18F120FF3D39}">
+                        <a1611:picAttrSrcUrl xmlns:a1611="http://schemas.microsoft.com/office/drawing/2016/11/main" r:id="rId2"/>
                       </a:ext>
                     </a:extLst>
                   </a:blip>
@@ -2257,6 +2395,12 @@
               </pic:pic>
             </a:graphicData>
           </a:graphic>
+          <wp14:sizeRelH relativeFrom="page">
+            <wp14:pctWidth>0</wp14:pctWidth>
+          </wp14:sizeRelH>
+          <wp14:sizeRelV relativeFrom="page">
+            <wp14:pctHeight>0</wp14:pctHeight>
+          </wp14:sizeRelV>
         </wp:anchor>
       </w:drawing>
     </w:r>
@@ -2265,21 +2409,21 @@
 </file>
 
 <file path=word/footnotes.xml><?xml version="1.0" encoding="utf-8"?>
-<w:footnotes xmlns:wpc="http://schemas.microsoft.com/office/word/2010/wordprocessingCanvas" xmlns:mc="http://schemas.openxmlformats.org/markup-compatibility/2006" xmlns:o="urn:schemas-microsoft-com:office:office" xmlns:r="http://schemas.openxmlformats.org/officeDocument/2006/relationships" xmlns:m="http://schemas.openxmlformats.org/officeDocument/2006/math" xmlns:v="urn:schemas-microsoft-com:vml" xmlns:wp14="http://schemas.microsoft.com/office/word/2010/wordprocessingDrawing" xmlns:wp="http://schemas.openxmlformats.org/drawingml/2006/wordprocessingDrawing" xmlns:w="http://schemas.openxmlformats.org/wordprocessingml/2006/main" xmlns:w14="http://schemas.microsoft.com/office/word/2010/wordml" xmlns:w15="http://schemas.microsoft.com/office/word/2012/wordml" xmlns:w10="urn:schemas-microsoft-com:office:word" xmlns:wpg="http://schemas.microsoft.com/office/word/2010/wordprocessingGroup" xmlns:wpi="http://schemas.microsoft.com/office/word/2010/wordprocessingInk" xmlns:wne="http://schemas.microsoft.com/office/word/2006/wordml" xmlns:wps="http://schemas.microsoft.com/office/word/2010/wordprocessingShape" xmlns:wpsCustomData="http://www.wps.cn/officeDocument/2013/wpsCustomData" mc:Ignorable="w14 w15 wp14">
-  <w:footnote w:type="separator" w:id="0">
+<w:footnotes xmlns:wpc="http://schemas.microsoft.com/office/word/2010/wordprocessingCanvas" xmlns:cx="http://schemas.microsoft.com/office/drawing/2014/chartex" xmlns:cx1="http://schemas.microsoft.com/office/drawing/2015/9/8/chartex" xmlns:cx2="http://schemas.microsoft.com/office/drawing/2015/10/21/chartex" xmlns:cx3="http://schemas.microsoft.com/office/drawing/2016/5/9/chartex" xmlns:cx4="http://schemas.microsoft.com/office/drawing/2016/5/10/chartex" xmlns:cx5="http://schemas.microsoft.com/office/drawing/2016/5/11/chartex" xmlns:cx6="http://schemas.microsoft.com/office/drawing/2016/5/12/chartex" xmlns:cx7="http://schemas.microsoft.com/office/drawing/2016/5/13/chartex" xmlns:cx8="http://schemas.microsoft.com/office/drawing/2016/5/14/chartex" xmlns:mc="http://schemas.openxmlformats.org/markup-compatibility/2006" xmlns:aink="http://schemas.microsoft.com/office/drawing/2016/ink" xmlns:am3d="http://schemas.microsoft.com/office/drawing/2017/model3d" xmlns:o="urn:schemas-microsoft-com:office:office" xmlns:r="http://schemas.openxmlformats.org/officeDocument/2006/relationships" xmlns:m="http://schemas.openxmlformats.org/officeDocument/2006/math" xmlns:v="urn:schemas-microsoft-com:vml" xmlns:wp14="http://schemas.microsoft.com/office/word/2010/wordprocessingDrawing" xmlns:wp="http://schemas.openxmlformats.org/drawingml/2006/wordprocessingDrawing" xmlns:w10="urn:schemas-microsoft-com:office:word" xmlns:w="http://schemas.openxmlformats.org/wordprocessingml/2006/main" xmlns:w14="http://schemas.microsoft.com/office/word/2010/wordml" xmlns:w15="http://schemas.microsoft.com/office/word/2012/wordml" xmlns:w16cex="http://schemas.microsoft.com/office/word/2018/wordml/cex" xmlns:w16cid="http://schemas.microsoft.com/office/word/2016/wordml/cid" xmlns:w16="http://schemas.microsoft.com/office/word/2018/wordml" xmlns:w16sdtdh="http://schemas.microsoft.com/office/word/2020/wordml/sdtdatahash" xmlns:w16se="http://schemas.microsoft.com/office/word/2015/wordml/symex" xmlns:wpg="http://schemas.microsoft.com/office/word/2010/wordprocessingGroup" xmlns:wpi="http://schemas.microsoft.com/office/word/2010/wordprocessingInk" xmlns:wne="http://schemas.microsoft.com/office/word/2006/wordml" xmlns:wps="http://schemas.microsoft.com/office/word/2010/wordprocessingShape" mc:Ignorable="w14 w15 w16se w16cid w16 w16cex w16sdtdh wp14">
+  <w:footnote w:type="separator" w:id="-1">
     <w:p>
       <w:pPr>
-        <w:spacing w:before="0" w:after="0" w:line="259" w:lineRule="auto"/>
+        <w:spacing w:after="0" w:line="240" w:lineRule="auto"/>
       </w:pPr>
       <w:r>
         <w:separator/>
       </w:r>
     </w:p>
   </w:footnote>
-  <w:footnote w:type="continuationSeparator" w:id="1">
+  <w:footnote w:type="continuationSeparator" w:id="0">
     <w:p>
       <w:pPr>
-        <w:spacing w:before="0" w:after="0" w:line="259" w:lineRule="auto"/>
+        <w:spacing w:after="0" w:line="240" w:lineRule="auto"/>
       </w:pPr>
       <w:r>
         <w:continuationSeparator/>
@@ -2290,27 +2434,68 @@
 </file>
 
 <file path=word/header1.xml><?xml version="1.0" encoding="utf-8"?>
-<w:hdr xmlns:wpc="http://schemas.microsoft.com/office/word/2010/wordprocessingCanvas" xmlns:mc="http://schemas.openxmlformats.org/markup-compatibility/2006" xmlns:o="urn:schemas-microsoft-com:office:office" xmlns:r="http://schemas.openxmlformats.org/officeDocument/2006/relationships" xmlns:m="http://schemas.openxmlformats.org/officeDocument/2006/math" xmlns:v="urn:schemas-microsoft-com:vml" xmlns:wp14="http://schemas.microsoft.com/office/word/2010/wordprocessingDrawing" xmlns:wp="http://schemas.openxmlformats.org/drawingml/2006/wordprocessingDrawing" xmlns:w10="urn:schemas-microsoft-com:office:word" xmlns:w="http://schemas.openxmlformats.org/wordprocessingml/2006/main" xmlns:w14="http://schemas.microsoft.com/office/word/2010/wordml" xmlns:w15="http://schemas.microsoft.com/office/word/2012/wordml" xmlns:wpg="http://schemas.microsoft.com/office/word/2010/wordprocessingGroup" xmlns:wpi="http://schemas.microsoft.com/office/word/2010/wordprocessingInk" xmlns:wne="http://schemas.microsoft.com/office/word/2006/wordml" xmlns:wps="http://schemas.microsoft.com/office/word/2010/wordprocessingShape" xmlns:wpsCustomData="http://www.wps.cn/officeDocument/2013/wpsCustomData" mc:Ignorable="w14 w15 wp14">
+<w:hdr xmlns:wpc="http://schemas.microsoft.com/office/word/2010/wordprocessingCanvas" xmlns:cx="http://schemas.microsoft.com/office/drawing/2014/chartex" xmlns:cx1="http://schemas.microsoft.com/office/drawing/2015/9/8/chartex" xmlns:cx2="http://schemas.microsoft.com/office/drawing/2015/10/21/chartex" xmlns:cx3="http://schemas.microsoft.com/office/drawing/2016/5/9/chartex" xmlns:cx4="http://schemas.microsoft.com/office/drawing/2016/5/10/chartex" xmlns:cx5="http://schemas.microsoft.com/office/drawing/2016/5/11/chartex" xmlns:cx6="http://schemas.microsoft.com/office/drawing/2016/5/12/chartex" xmlns:cx7="http://schemas.microsoft.com/office/drawing/2016/5/13/chartex" xmlns:cx8="http://schemas.microsoft.com/office/drawing/2016/5/14/chartex" xmlns:mc="http://schemas.openxmlformats.org/markup-compatibility/2006" xmlns:aink="http://schemas.microsoft.com/office/drawing/2016/ink" xmlns:am3d="http://schemas.microsoft.com/office/drawing/2017/model3d" xmlns:o="urn:schemas-microsoft-com:office:office" xmlns:r="http://schemas.openxmlformats.org/officeDocument/2006/relationships" xmlns:m="http://schemas.openxmlformats.org/officeDocument/2006/math" xmlns:v="urn:schemas-microsoft-com:vml" xmlns:wp14="http://schemas.microsoft.com/office/word/2010/wordprocessingDrawing" xmlns:wp="http://schemas.openxmlformats.org/drawingml/2006/wordprocessingDrawing" xmlns:w10="urn:schemas-microsoft-com:office:word" xmlns:w="http://schemas.openxmlformats.org/wordprocessingml/2006/main" xmlns:w14="http://schemas.microsoft.com/office/word/2010/wordml" xmlns:w15="http://schemas.microsoft.com/office/word/2012/wordml" xmlns:w16cex="http://schemas.microsoft.com/office/word/2018/wordml/cex" xmlns:w16cid="http://schemas.microsoft.com/office/word/2016/wordml/cid" xmlns:w16="http://schemas.microsoft.com/office/word/2018/wordml" xmlns:w16sdtdh="http://schemas.microsoft.com/office/word/2020/wordml/sdtdatahash" xmlns:w16se="http://schemas.microsoft.com/office/word/2015/wordml/symex" xmlns:wpg="http://schemas.microsoft.com/office/word/2010/wordprocessingGroup" xmlns:wpi="http://schemas.microsoft.com/office/word/2010/wordprocessingInk" xmlns:wne="http://schemas.microsoft.com/office/word/2006/wordml" xmlns:wps="http://schemas.microsoft.com/office/word/2010/wordprocessingShape" mc:Ignorable="w14 w15 w16se w16cid w16 w16cex w16sdtdh wp14">
   <w:p>
     <w:pPr>
-      <w:pStyle w:val="6"/>
+      <w:pStyle w:val="Header"/>
+    </w:pPr>
+    <w:r>
+      <w:rPr>
+        <w:noProof/>
+      </w:rPr>
+      <w:pict w14:anchorId="0B608CBB">
+        <v:shapetype id="_x0000_t75" coordsize="21600,21600" o:spt="75" o:preferrelative="t" path="m@4@5l@4@11@9@11@9@5xe" filled="f" stroked="f">
+          <v:stroke joinstyle="miter"/>
+          <v:formulas>
+            <v:f eqn="if lineDrawn pixelLineWidth 0"/>
+            <v:f eqn="sum @0 1 0"/>
+            <v:f eqn="sum 0 0 @1"/>
+            <v:f eqn="prod @2 1 2"/>
+            <v:f eqn="prod @3 21600 pixelWidth"/>
+            <v:f eqn="prod @3 21600 pixelHeight"/>
+            <v:f eqn="sum @0 0 1"/>
+            <v:f eqn="prod @6 1 2"/>
+            <v:f eqn="prod @7 21600 pixelWidth"/>
+            <v:f eqn="sum @8 21600 0"/>
+            <v:f eqn="prod @7 21600 pixelHeight"/>
+            <v:f eqn="sum @10 21600 0"/>
+          </v:formulas>
+          <v:path o:extrusionok="f" gradientshapeok="t" o:connecttype="rect"/>
+          <o:lock v:ext="edit" aspectratio="t"/>
+        </v:shapetype>
+        <v:shape id="WordPictureWatermark13581782" o:spid="_x0000_s2053" type="#_x0000_t75" style="position:absolute;margin-left:0;margin-top:0;width:375pt;height:375pt;z-index:-251653120;mso-position-horizontal:center;mso-position-horizontal-relative:margin;mso-position-vertical:center;mso-position-vertical-relative:margin" o:allowincell="f">
+          <v:imagedata r:id="rId1" o:title="Aunkur_English_Logo__2_-removebg-preview" gain="19661f" blacklevel="22938f"/>
+          <w10:wrap anchorx="margin" anchory="margin"/>
+        </v:shape>
+      </w:pict>
+    </w:r>
+  </w:p>
+</w:hdr>
+</file>
+
+<file path=word/header2.xml><?xml version="1.0" encoding="utf-8"?>
+<w:hdr xmlns:wpc="http://schemas.microsoft.com/office/word/2010/wordprocessingCanvas" xmlns:cx="http://schemas.microsoft.com/office/drawing/2014/chartex" xmlns:cx1="http://schemas.microsoft.com/office/drawing/2015/9/8/chartex" xmlns:cx2="http://schemas.microsoft.com/office/drawing/2015/10/21/chartex" xmlns:cx3="http://schemas.microsoft.com/office/drawing/2016/5/9/chartex" xmlns:cx4="http://schemas.microsoft.com/office/drawing/2016/5/10/chartex" xmlns:cx5="http://schemas.microsoft.com/office/drawing/2016/5/11/chartex" xmlns:cx6="http://schemas.microsoft.com/office/drawing/2016/5/12/chartex" xmlns:cx7="http://schemas.microsoft.com/office/drawing/2016/5/13/chartex" xmlns:cx8="http://schemas.microsoft.com/office/drawing/2016/5/14/chartex" xmlns:mc="http://schemas.openxmlformats.org/markup-compatibility/2006" xmlns:aink="http://schemas.microsoft.com/office/drawing/2016/ink" xmlns:am3d="http://schemas.microsoft.com/office/drawing/2017/model3d" xmlns:o="urn:schemas-microsoft-com:office:office" xmlns:r="http://schemas.openxmlformats.org/officeDocument/2006/relationships" xmlns:m="http://schemas.openxmlformats.org/officeDocument/2006/math" xmlns:v="urn:schemas-microsoft-com:vml" xmlns:wp14="http://schemas.microsoft.com/office/word/2010/wordprocessingDrawing" xmlns:wp="http://schemas.openxmlformats.org/drawingml/2006/wordprocessingDrawing" xmlns:w10="urn:schemas-microsoft-com:office:word" xmlns:w="http://schemas.openxmlformats.org/wordprocessingml/2006/main" xmlns:w14="http://schemas.microsoft.com/office/word/2010/wordml" xmlns:w15="http://schemas.microsoft.com/office/word/2012/wordml" xmlns:w16cex="http://schemas.microsoft.com/office/word/2018/wordml/cex" xmlns:w16cid="http://schemas.microsoft.com/office/word/2016/wordml/cid" xmlns:w16="http://schemas.microsoft.com/office/word/2018/wordml" xmlns:w16sdtdh="http://schemas.microsoft.com/office/word/2020/wordml/sdtdatahash" xmlns:w16se="http://schemas.microsoft.com/office/word/2015/wordml/symex" xmlns:wpg="http://schemas.microsoft.com/office/word/2010/wordprocessingGroup" xmlns:wpi="http://schemas.microsoft.com/office/word/2010/wordprocessingInk" xmlns:wne="http://schemas.microsoft.com/office/word/2006/wordml" xmlns:wps="http://schemas.microsoft.com/office/word/2010/wordprocessingShape" mc:Ignorable="w14 w15 w16se w16cid w16 w16cex w16sdtdh wp14">
+  <w:p>
+    <w:pPr>
+      <w:pStyle w:val="Header"/>
     </w:pPr>
     <w:r>
       <w:rPr>
         <w:rFonts w:ascii="SolaimanLipi" w:hAnsi="SolaimanLipi" w:cs="SolaimanLipi"/>
+        <w:noProof/>
       </w:rPr>
       <mc:AlternateContent>
         <mc:Choice Requires="wps">
           <w:drawing>
-            <wp:anchor distT="0" distB="0" distL="114300" distR="114300" simplePos="0" relativeHeight="251660288" behindDoc="0" locked="0" layoutInCell="1" allowOverlap="1">
+            <wp:anchor distT="0" distB="0" distL="114300" distR="114300" simplePos="0" relativeHeight="251659264" behindDoc="0" locked="0" layoutInCell="1" allowOverlap="1" wp14:anchorId="1203988F" wp14:editId="2F006963">
               <wp:simplePos x="0" y="0"/>
               <wp:positionH relativeFrom="page">
-                <wp:posOffset>8255</wp:posOffset>
+                <wp:posOffset>8467</wp:posOffset>
               </wp:positionH>
               <wp:positionV relativeFrom="paragraph">
                 <wp:posOffset>-457200</wp:posOffset>
               </wp:positionV>
-              <wp:extent cx="7747000" cy="1925955"/>
+              <wp:extent cx="7746788" cy="1925782"/>
               <wp:effectExtent l="0" t="0" r="26035" b="17780"/>
               <wp:wrapNone/>
               <wp:docPr id="1" name="Rectangle 2"/>
@@ -2327,6 +2512,26 @@
                       <a:custGeom>
                         <a:avLst/>
                         <a:gdLst>
+                          <a:gd name="connsiteX0" fmla="*/ 0 w 6838950"/>
+                          <a:gd name="connsiteY0" fmla="*/ 0 h 1447800"/>
+                          <a:gd name="connsiteX1" fmla="*/ 6838950 w 6838950"/>
+                          <a:gd name="connsiteY1" fmla="*/ 0 h 1447800"/>
+                          <a:gd name="connsiteX2" fmla="*/ 6838950 w 6838950"/>
+                          <a:gd name="connsiteY2" fmla="*/ 1447800 h 1447800"/>
+                          <a:gd name="connsiteX3" fmla="*/ 0 w 6838950"/>
+                          <a:gd name="connsiteY3" fmla="*/ 1447800 h 1447800"/>
+                          <a:gd name="connsiteX4" fmla="*/ 0 w 6838950"/>
+                          <a:gd name="connsiteY4" fmla="*/ 0 h 1447800"/>
+                          <a:gd name="connsiteX0" fmla="*/ 0 w 6838950"/>
+                          <a:gd name="connsiteY0" fmla="*/ 0 h 2074333"/>
+                          <a:gd name="connsiteX1" fmla="*/ 6838950 w 6838950"/>
+                          <a:gd name="connsiteY1" fmla="*/ 0 h 2074333"/>
+                          <a:gd name="connsiteX2" fmla="*/ 6838950 w 6838950"/>
+                          <a:gd name="connsiteY2" fmla="*/ 1447800 h 2074333"/>
+                          <a:gd name="connsiteX3" fmla="*/ 0 w 6838950"/>
+                          <a:gd name="connsiteY3" fmla="*/ 1447800 h 2074333"/>
+                          <a:gd name="connsiteX4" fmla="*/ 0 w 6838950"/>
+                          <a:gd name="connsiteY4" fmla="*/ 0 h 2074333"/>
                           <a:gd name="connsiteX0" fmla="*/ 0 w 6838950"/>
                           <a:gd name="connsiteY0" fmla="*/ 0 h 2475170"/>
                           <a:gd name="connsiteX1" fmla="*/ 6838950 w 6838950"/>
@@ -2463,28 +2668,90 @@
                               <w:sz w:val="20"/>
                               <w:szCs w:val="20"/>
                             </w:rPr>
-                            <w:t>Web: www.aunkurctgsouth.org | | Mobile: 01785903356</w:t>
+                            <w:t>Web</w:t>
+                          </w:r>
+                          <w:r>
+                            <w:rPr>
+                              <w:rFonts w:asciiTheme="majorBidi" w:hAnsiTheme="majorBidi" w:cstheme="majorBidi"/>
+                              <w:b/>
+                              <w:sz w:val="20"/>
+                              <w:szCs w:val="20"/>
+                            </w:rPr>
+                            <w:t>:</w:t>
+                          </w:r>
+                          <w:r>
+                            <w:rPr>
+                              <w:rFonts w:asciiTheme="majorBidi" w:hAnsiTheme="majorBidi" w:cstheme="majorBidi"/>
+                              <w:b/>
+                              <w:sz w:val="20"/>
+                              <w:szCs w:val="20"/>
+                            </w:rPr>
+                            <w:t xml:space="preserve"> www.aunkurctgsouth.org |</w:t>
+                          </w:r>
+                          <w:r>
+                            <w:rPr>
+                              <w:rFonts w:asciiTheme="majorBidi" w:hAnsiTheme="majorBidi" w:cstheme="majorBidi"/>
+                              <w:b/>
+                              <w:sz w:val="20"/>
+                              <w:szCs w:val="20"/>
+                            </w:rPr>
+                            <w:t xml:space="preserve"> </w:t>
+                          </w:r>
+                          <w:r>
+                            <w:rPr>
+                              <w:rFonts w:asciiTheme="majorBidi" w:hAnsiTheme="majorBidi" w:cstheme="majorBidi"/>
+                              <w:b/>
+                              <w:sz w:val="20"/>
+                              <w:szCs w:val="20"/>
+                            </w:rPr>
+                            <w:t xml:space="preserve">| </w:t>
+                          </w:r>
+                          <w:r>
+                            <w:rPr>
+                              <w:rFonts w:asciiTheme="majorBidi" w:hAnsiTheme="majorBidi" w:cstheme="majorBidi"/>
+                              <w:b/>
+                              <w:sz w:val="20"/>
+                              <w:szCs w:val="20"/>
+                            </w:rPr>
+                            <w:t>Mobile</w:t>
+                          </w:r>
+                          <w:r>
+                            <w:rPr>
+                              <w:rFonts w:asciiTheme="majorBidi" w:hAnsiTheme="majorBidi" w:cstheme="majorBidi"/>
+                              <w:b/>
+                              <w:sz w:val="20"/>
+                              <w:szCs w:val="20"/>
+                            </w:rPr>
+                            <w:t>: 01785903356</w:t>
                           </w:r>
                         </w:p>
                       </w:txbxContent>
                     </wps:txbx>
                     <wps:bodyPr rot="0" spcFirstLastPara="0" vertOverflow="overflow" horzOverflow="overflow" vert="horz" wrap="square" lIns="91440" tIns="45720" rIns="91440" bIns="45720" numCol="1" spcCol="0" rtlCol="0" fromWordArt="0" anchor="ctr" anchorCtr="0" forceAA="0" compatLnSpc="1">
+                      <a:prstTxWarp prst="textNoShape">
+                        <a:avLst/>
+                      </a:prstTxWarp>
                       <a:noAutofit/>
                     </wps:bodyPr>
                   </wps:wsp>
                 </a:graphicData>
               </a:graphic>
+              <wp14:sizeRelH relativeFrom="margin">
+                <wp14:pctWidth>0</wp14:pctWidth>
+              </wp14:sizeRelH>
+              <wp14:sizeRelV relativeFrom="margin">
+                <wp14:pctHeight>0</wp14:pctHeight>
+              </wp14:sizeRelV>
             </wp:anchor>
           </w:drawing>
         </mc:Choice>
         <mc:Fallback>
           <w:pict>
-            <v:shape id="Rectangle 2" o:spid="_x0000_s1026" o:spt="100" style="position:absolute;left:0pt;margin-left:0.65pt;margin-top:-36pt;height:151.65pt;width:610pt;mso-position-horizontal-relative:page;z-index:251660288;v-text-anchor:middle;mso-width-relative:page;mso-height-relative:page;" fillcolor="#004D00" filled="t" stroked="t" coordsize="6838950,2475170" o:gfxdata="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" path="m0,0l6838950,0,6838950,1447800c4721225,3759384,2279650,1447800,0,1447800l0,0xe">
-              <v:path textboxrect="0,0,6838950,2475170" o:connectlocs="0,0;7746788,0;7746788,1126446;0,1126446;0,0" o:connectangles="0,0,0,0,0"/>
-              <v:fill type="gradient" on="t" color2="#008A00" colors="0f #004D00;32768f #007300;65536f #008A00" angle="180" focus="100%" focussize="0,0" rotate="t"/>
-              <v:stroke weight="1pt" color="#92D050 [3204]" miterlimit="8" joinstyle="miter"/>
-              <v:imagedata o:title=""/>
-              <o:lock v:ext="edit" aspectratio="f"/>
+            <v:shape w14:anchorId="000D2A39" id="Rectangle 2" o:spid="_x0000_s1026" style="position:absolute;margin-left:.65pt;margin-top:-36pt;width:610pt;height:151.65pt;z-index:251659264;visibility:visible;mso-wrap-style:square;mso-width-percent:0;mso-height-percent:0;mso-wrap-distance-left:9pt;mso-wrap-distance-top:0;mso-wrap-distance-right:9pt;mso-wrap-distance-bottom:0;mso-position-horizontal:absolute;mso-position-horizontal-relative:page;mso-position-vertical:absolute;mso-position-vertical-relative:text;mso-width-percent:0;mso-height-percent:0;mso-width-relative:margin;mso-height-relative:margin;v-text-anchor:middle" coordsize="6838950,2475170" o:spt="100" o:gfxdata="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" adj="-11796480,,5400" path="m,l6838950,r,1447800c4721225,3759384,2279650,1447800,,1447800l,xe" fillcolor="#004d00" strokecolor="#92d050" strokeweight="1pt">
+              <v:fill color2="#008a00" rotate="t" angle="180" colors="0 #004d00;.5 #007300;1 #008a00" focus="100%" type="gradient"/>
+              <v:stroke joinstyle="miter"/>
+              <v:formulas/>
+              <v:path arrowok="t" o:connecttype="custom" o:connectlocs="0,0;7746788,0;7746788,1126447;0,1126447;0,0" o:connectangles="0,0,0,0,0" textboxrect="0,0,6838950,2475170"/>
               <v:textbox>
                 <w:txbxContent>
                   <w:p>
@@ -2522,11 +2789,66 @@
                         <w:sz w:val="20"/>
                         <w:szCs w:val="20"/>
                       </w:rPr>
-                      <w:t>Web: www.aunkurctgsouth.org | | Mobile: 01785903356</w:t>
+                      <w:t>Web</w:t>
+                    </w:r>
+                    <w:r>
+                      <w:rPr>
+                        <w:rFonts w:asciiTheme="majorBidi" w:hAnsiTheme="majorBidi" w:cstheme="majorBidi"/>
+                        <w:b/>
+                        <w:sz w:val="20"/>
+                        <w:szCs w:val="20"/>
+                      </w:rPr>
+                      <w:t>:</w:t>
+                    </w:r>
+                    <w:r>
+                      <w:rPr>
+                        <w:rFonts w:asciiTheme="majorBidi" w:hAnsiTheme="majorBidi" w:cstheme="majorBidi"/>
+                        <w:b/>
+                        <w:sz w:val="20"/>
+                        <w:szCs w:val="20"/>
+                      </w:rPr>
+                      <w:t xml:space="preserve"> www.aunkurctgsouth.org |</w:t>
+                    </w:r>
+                    <w:r>
+                      <w:rPr>
+                        <w:rFonts w:asciiTheme="majorBidi" w:hAnsiTheme="majorBidi" w:cstheme="majorBidi"/>
+                        <w:b/>
+                        <w:sz w:val="20"/>
+                        <w:szCs w:val="20"/>
+                      </w:rPr>
+                      <w:t xml:space="preserve"> </w:t>
+                    </w:r>
+                    <w:r>
+                      <w:rPr>
+                        <w:rFonts w:asciiTheme="majorBidi" w:hAnsiTheme="majorBidi" w:cstheme="majorBidi"/>
+                        <w:b/>
+                        <w:sz w:val="20"/>
+                        <w:szCs w:val="20"/>
+                      </w:rPr>
+                      <w:t xml:space="preserve">| </w:t>
+                    </w:r>
+                    <w:r>
+                      <w:rPr>
+                        <w:rFonts w:asciiTheme="majorBidi" w:hAnsiTheme="majorBidi" w:cstheme="majorBidi"/>
+                        <w:b/>
+                        <w:sz w:val="20"/>
+                        <w:szCs w:val="20"/>
+                      </w:rPr>
+                      <w:t>Mobile</w:t>
+                    </w:r>
+                    <w:r>
+                      <w:rPr>
+                        <w:rFonts w:asciiTheme="majorBidi" w:hAnsiTheme="majorBidi" w:cstheme="majorBidi"/>
+                        <w:b/>
+                        <w:sz w:val="20"/>
+                        <w:szCs w:val="20"/>
+                      </w:rPr>
+                      <w:t>: 01785903356</w:t>
                     </w:r>
                   </w:p>
                 </w:txbxContent>
               </v:textbox>
+              <w10:wrap anchorx="page"/>
             </v:shape>
           </w:pict>
         </mc:Fallback>
@@ -2535,31 +2857,49 @@
     <w:r>
       <w:rPr>
         <w:rFonts w:ascii="SolaimanLipi" w:hAnsi="SolaimanLipi" w:cs="SolaimanLipi"/>
+        <w:noProof/>
       </w:rPr>
-      <w:pict>
-        <v:shape id="WordPictureWatermark13581783" o:spid="_x0000_s2054" o:spt="75" type="#_x0000_t75" style="position:absolute;left:0pt;height:375pt;width:375pt;mso-position-horizontal:center;mso-position-horizontal-relative:margin;mso-position-vertical:center;mso-position-vertical-relative:margin;z-index:-251651072;mso-width-relative:page;mso-height-relative:page;" filled="f" o:preferrelative="t" stroked="f" coordsize="21600,21600" o:allowincell="f">
-          <v:path/>
-          <v:fill on="f" focussize="0,0"/>
-          <v:stroke on="f" joinstyle="miter"/>
-          <v:imagedata r:id="rId1" gain="19661f" blacklevel="22938f" o:title="Aunkur_English_Logo__2_-removebg-preview"/>
+      <w:pict w14:anchorId="3DD7C0B9">
+        <v:shapetype id="_x0000_t75" coordsize="21600,21600" o:spt="75" o:preferrelative="t" path="m@4@5l@4@11@9@11@9@5xe" filled="f" stroked="f">
+          <v:stroke joinstyle="miter"/>
+          <v:formulas>
+            <v:f eqn="if lineDrawn pixelLineWidth 0"/>
+            <v:f eqn="sum @0 1 0"/>
+            <v:f eqn="sum 0 0 @1"/>
+            <v:f eqn="prod @2 1 2"/>
+            <v:f eqn="prod @3 21600 pixelWidth"/>
+            <v:f eqn="prod @3 21600 pixelHeight"/>
+            <v:f eqn="sum @0 0 1"/>
+            <v:f eqn="prod @6 1 2"/>
+            <v:f eqn="prod @7 21600 pixelWidth"/>
+            <v:f eqn="sum @8 21600 0"/>
+            <v:f eqn="prod @7 21600 pixelHeight"/>
+            <v:f eqn="sum @10 21600 0"/>
+          </v:formulas>
+          <v:path o:extrusionok="f" gradientshapeok="t" o:connecttype="rect"/>
           <o:lock v:ext="edit" aspectratio="t"/>
+        </v:shapetype>
+        <v:shape id="WordPictureWatermark13581783" o:spid="_x0000_s2054" type="#_x0000_t75" style="position:absolute;margin-left:0;margin-top:0;width:375pt;height:375pt;z-index:-251652096;mso-position-horizontal:center;mso-position-horizontal-relative:margin;mso-position-vertical:center;mso-position-vertical-relative:margin" o:allowincell="f">
+          <v:imagedata r:id="rId1" o:title="Aunkur_English_Logo__2_-removebg-preview" gain="19661f" blacklevel="22938f"/>
+          <w10:wrap anchorx="margin" anchory="margin"/>
         </v:shape>
       </w:pict>
     </w:r>
     <w:r>
       <w:rPr>
         <w:rFonts w:ascii="SolaimanLipi" w:hAnsi="SolaimanLipi" w:cs="SolaimanLipi"/>
+        <w:noProof/>
       </w:rPr>
       <mc:AlternateContent>
         <mc:Choice Requires="wps">
           <w:drawing>
-            <wp:anchor distT="0" distB="0" distL="114300" distR="114300" simplePos="0" relativeHeight="251662336" behindDoc="0" locked="0" layoutInCell="1" allowOverlap="1">
+            <wp:anchor distT="0" distB="0" distL="114300" distR="114300" simplePos="0" relativeHeight="251661312" behindDoc="0" locked="0" layoutInCell="1" allowOverlap="1" wp14:anchorId="1909572B" wp14:editId="1661DDEC">
               <wp:simplePos x="0" y="0"/>
               <wp:positionH relativeFrom="margin">
                 <wp:align>center</wp:align>
               </wp:positionH>
               <wp:positionV relativeFrom="paragraph">
-                <wp:posOffset>-338455</wp:posOffset>
+                <wp:posOffset>-338667</wp:posOffset>
               </wp:positionV>
               <wp:extent cx="2266950" cy="419100"/>
               <wp:effectExtent l="0" t="0" r="19050" b="19050"/>
@@ -2628,6 +2968,9 @@
                       </w:txbxContent>
                     </wps:txbx>
                     <wps:bodyPr rot="0" spcFirstLastPara="0" vertOverflow="overflow" horzOverflow="overflow" vert="horz" wrap="square" lIns="91440" tIns="45720" rIns="91440" bIns="45720" numCol="1" spcCol="0" rtlCol="0" fromWordArt="0" anchor="ctr" anchorCtr="0" forceAA="0" compatLnSpc="1">
+                      <a:prstTxWarp prst="textNoShape">
+                        <a:avLst/>
+                      </a:prstTxWarp>
                       <a:noAutofit/>
                     </wps:bodyPr>
                   </wps:wsp>
@@ -2638,11 +2981,8 @@
         </mc:Choice>
         <mc:Fallback>
           <w:pict>
-            <v:roundrect id="Rectangle: Rounded Corners 13" o:spid="_x0000_s1026" o:spt="2" style="position:absolute;left:0pt;margin-top:-26.65pt;height:33pt;width:178.5pt;mso-position-horizontal:center;mso-position-horizontal-relative:margin;z-index:251662336;v-text-anchor:middle;mso-width-relative:page;mso-height-relative:page;" fillcolor="#00B050" filled="t" stroked="t" coordsize="21600,21600" arcsize="0.166666666666667" o:gfxdata="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">
-              <v:fill on="t" focussize="0,0"/>
-              <v:stroke weight="1pt" color="#FFFFFF [3212]" miterlimit="8" joinstyle="miter"/>
-              <v:imagedata o:title=""/>
-              <o:lock v:ext="edit" aspectratio="f"/>
+            <v:roundrect w14:anchorId="24B62477" id="Rectangle: Rounded Corners 13" o:spid="_x0000_s1027" style="position:absolute;margin-left:0;margin-top:-26.65pt;width:178.5pt;height:33pt;z-index:251661312;visibility:visible;mso-wrap-style:square;mso-wrap-distance-left:9pt;mso-wrap-distance-top:0;mso-wrap-distance-right:9pt;mso-wrap-distance-bottom:0;mso-position-horizontal:center;mso-position-horizontal-relative:margin;mso-position-vertical:absolute;mso-position-vertical-relative:text;v-text-anchor:middle" arcsize="10923f" o:gfxdata="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" fillcolor="#00b050" strokecolor="white [3212]" strokeweight="1pt">
+              <v:stroke joinstyle="miter"/>
               <v:textbox>
                 <w:txbxContent>
                   <w:p>
@@ -2667,6 +3007,7 @@
                   </w:p>
                 </w:txbxContent>
               </v:textbox>
+              <w10:wrap anchorx="margin"/>
             </v:roundrect>
           </w:pict>
         </mc:Fallback>
@@ -2676,41 +3017,39 @@
 </w:hdr>
 </file>
 
-<file path=word/header2.xml><?xml version="1.0" encoding="utf-8"?>
-<w:hdr xmlns:wpc="http://schemas.microsoft.com/office/word/2010/wordprocessingCanvas" xmlns:mc="http://schemas.openxmlformats.org/markup-compatibility/2006" xmlns:o="urn:schemas-microsoft-com:office:office" xmlns:r="http://schemas.openxmlformats.org/officeDocument/2006/relationships" xmlns:m="http://schemas.openxmlformats.org/officeDocument/2006/math" xmlns:v="urn:schemas-microsoft-com:vml" xmlns:wp14="http://schemas.microsoft.com/office/word/2010/wordprocessingDrawing" xmlns:wp="http://schemas.openxmlformats.org/drawingml/2006/wordprocessingDrawing" xmlns:w10="urn:schemas-microsoft-com:office:word" xmlns:w="http://schemas.openxmlformats.org/wordprocessingml/2006/main" xmlns:w14="http://schemas.microsoft.com/office/word/2010/wordml" xmlns:w15="http://schemas.microsoft.com/office/word/2012/wordml" xmlns:wpg="http://schemas.microsoft.com/office/word/2010/wordprocessingGroup" xmlns:wpi="http://schemas.microsoft.com/office/word/2010/wordprocessingInk" xmlns:wne="http://schemas.microsoft.com/office/word/2006/wordml" xmlns:wps="http://schemas.microsoft.com/office/word/2010/wordprocessingShape" xmlns:wpsCustomData="http://www.wps.cn/officeDocument/2013/wpsCustomData" mc:Ignorable="w14 w15 wp14">
+<file path=word/header3.xml><?xml version="1.0" encoding="utf-8"?>
+<w:hdr xmlns:wpc="http://schemas.microsoft.com/office/word/2010/wordprocessingCanvas" xmlns:cx="http://schemas.microsoft.com/office/drawing/2014/chartex" xmlns:cx1="http://schemas.microsoft.com/office/drawing/2015/9/8/chartex" xmlns:cx2="http://schemas.microsoft.com/office/drawing/2015/10/21/chartex" xmlns:cx3="http://schemas.microsoft.com/office/drawing/2016/5/9/chartex" xmlns:cx4="http://schemas.microsoft.com/office/drawing/2016/5/10/chartex" xmlns:cx5="http://schemas.microsoft.com/office/drawing/2016/5/11/chartex" xmlns:cx6="http://schemas.microsoft.com/office/drawing/2016/5/12/chartex" xmlns:cx7="http://schemas.microsoft.com/office/drawing/2016/5/13/chartex" xmlns:cx8="http://schemas.microsoft.com/office/drawing/2016/5/14/chartex" xmlns:mc="http://schemas.openxmlformats.org/markup-compatibility/2006" xmlns:aink="http://schemas.microsoft.com/office/drawing/2016/ink" xmlns:am3d="http://schemas.microsoft.com/office/drawing/2017/model3d" xmlns:o="urn:schemas-microsoft-com:office:office" xmlns:r="http://schemas.openxmlformats.org/officeDocument/2006/relationships" xmlns:m="http://schemas.openxmlformats.org/officeDocument/2006/math" xmlns:v="urn:schemas-microsoft-com:vml" xmlns:wp14="http://schemas.microsoft.com/office/word/2010/wordprocessingDrawing" xmlns:wp="http://schemas.openxmlformats.org/drawingml/2006/wordprocessingDrawing" xmlns:w10="urn:schemas-microsoft-com:office:word" xmlns:w="http://schemas.openxmlformats.org/wordprocessingml/2006/main" xmlns:w14="http://schemas.microsoft.com/office/word/2010/wordml" xmlns:w15="http://schemas.microsoft.com/office/word/2012/wordml" xmlns:w16cex="http://schemas.microsoft.com/office/word/2018/wordml/cex" xmlns:w16cid="http://schemas.microsoft.com/office/word/2016/wordml/cid" xmlns:w16="http://schemas.microsoft.com/office/word/2018/wordml" xmlns:w16sdtdh="http://schemas.microsoft.com/office/word/2020/wordml/sdtdatahash" xmlns:w16se="http://schemas.microsoft.com/office/word/2015/wordml/symex" xmlns:wpg="http://schemas.microsoft.com/office/word/2010/wordprocessingGroup" xmlns:wpi="http://schemas.microsoft.com/office/word/2010/wordprocessingInk" xmlns:wne="http://schemas.microsoft.com/office/word/2006/wordml" xmlns:wps="http://schemas.microsoft.com/office/word/2010/wordprocessingShape" mc:Ignorable="w14 w15 w16se w16cid w16 w16cex w16sdtdh wp14">
   <w:p>
     <w:pPr>
-      <w:pStyle w:val="6"/>
+      <w:pStyle w:val="Header"/>
     </w:pPr>
     <w:r>
-      <w:pict>
-        <v:shape id="WordPictureWatermark13581782" o:spid="_x0000_s2053" o:spt="75" type="#_x0000_t75" style="position:absolute;left:0pt;height:375pt;width:375pt;mso-position-horizontal:center;mso-position-horizontal-relative:margin;mso-position-vertical:center;mso-position-vertical-relative:margin;z-index:-251652096;mso-width-relative:page;mso-height-relative:page;" filled="f" o:preferrelative="t" stroked="f" coordsize="21600,21600" o:allowincell="f">
-          <v:path/>
-          <v:fill on="f" focussize="0,0"/>
-          <v:stroke on="f" joinstyle="miter"/>
-          <v:imagedata r:id="rId1" gain="19661f" blacklevel="22938f" o:title="Aunkur_English_Logo__2_-removebg-preview"/>
+      <w:rPr>
+        <w:noProof/>
+      </w:rPr>
+      <w:pict w14:anchorId="57E72CE9">
+        <v:shapetype id="_x0000_t75" coordsize="21600,21600" o:spt="75" o:preferrelative="t" path="m@4@5l@4@11@9@11@9@5xe" filled="f" stroked="f">
+          <v:stroke joinstyle="miter"/>
+          <v:formulas>
+            <v:f eqn="if lineDrawn pixelLineWidth 0"/>
+            <v:f eqn="sum @0 1 0"/>
+            <v:f eqn="sum 0 0 @1"/>
+            <v:f eqn="prod @2 1 2"/>
+            <v:f eqn="prod @3 21600 pixelWidth"/>
+            <v:f eqn="prod @3 21600 pixelHeight"/>
+            <v:f eqn="sum @0 0 1"/>
+            <v:f eqn="prod @6 1 2"/>
+            <v:f eqn="prod @7 21600 pixelWidth"/>
+            <v:f eqn="sum @8 21600 0"/>
+            <v:f eqn="prod @7 21600 pixelHeight"/>
+            <v:f eqn="sum @10 21600 0"/>
+          </v:formulas>
+          <v:path o:extrusionok="f" gradientshapeok="t" o:connecttype="rect"/>
           <o:lock v:ext="edit" aspectratio="t"/>
-        </v:shape>
-      </w:pict>
-    </w:r>
-  </w:p>
-</w:hdr>
-</file>
-
-<file path=word/header3.xml><?xml version="1.0" encoding="utf-8"?>
-<w:hdr xmlns:wpc="http://schemas.microsoft.com/office/word/2010/wordprocessingCanvas" xmlns:mc="http://schemas.openxmlformats.org/markup-compatibility/2006" xmlns:o="urn:schemas-microsoft-com:office:office" xmlns:r="http://schemas.openxmlformats.org/officeDocument/2006/relationships" xmlns:m="http://schemas.openxmlformats.org/officeDocument/2006/math" xmlns:v="urn:schemas-microsoft-com:vml" xmlns:wp14="http://schemas.microsoft.com/office/word/2010/wordprocessingDrawing" xmlns:wp="http://schemas.openxmlformats.org/drawingml/2006/wordprocessingDrawing" xmlns:w10="urn:schemas-microsoft-com:office:word" xmlns:w="http://schemas.openxmlformats.org/wordprocessingml/2006/main" xmlns:w14="http://schemas.microsoft.com/office/word/2010/wordml" xmlns:w15="http://schemas.microsoft.com/office/word/2012/wordml" xmlns:wpg="http://schemas.microsoft.com/office/word/2010/wordprocessingGroup" xmlns:wpi="http://schemas.microsoft.com/office/word/2010/wordprocessingInk" xmlns:wne="http://schemas.microsoft.com/office/word/2006/wordml" xmlns:wps="http://schemas.microsoft.com/office/word/2010/wordprocessingShape" xmlns:wpsCustomData="http://www.wps.cn/officeDocument/2013/wpsCustomData" mc:Ignorable="w14 w15 wp14">
-  <w:p>
-    <w:pPr>
-      <w:pStyle w:val="6"/>
-    </w:pPr>
-    <w:r>
-      <w:pict>
-        <v:shape id="WordPictureWatermark13581781" o:spid="_x0000_s2052" o:spt="75" type="#_x0000_t75" style="position:absolute;left:0pt;height:375pt;width:375pt;mso-position-horizontal:center;mso-position-horizontal-relative:margin;mso-position-vertical:center;mso-position-vertical-relative:margin;z-index:-251653120;mso-width-relative:page;mso-height-relative:page;" filled="f" o:preferrelative="t" stroked="f" coordsize="21600,21600" o:allowincell="f">
-          <v:path/>
-          <v:fill on="f" focussize="0,0"/>
-          <v:stroke on="f" joinstyle="miter"/>
-          <v:imagedata r:id="rId1" gain="19661f" blacklevel="22938f" o:title="Aunkur_English_Logo__2_-removebg-preview"/>
-          <o:lock v:ext="edit" aspectratio="t"/>
+        </v:shapetype>
+        <v:shape id="WordPictureWatermark13581781" o:spid="_x0000_s2052" type="#_x0000_t75" style="position:absolute;margin-left:0;margin-top:0;width:375pt;height:375pt;z-index:-251654144;mso-position-horizontal:center;mso-position-horizontal-relative:margin;mso-position-vertical:center;mso-position-vertical-relative:margin" o:allowincell="f">
+          <v:imagedata r:id="rId1" o:title="Aunkur_English_Logo__2_-removebg-preview" gain="19661f" blacklevel="22938f"/>
+          <w10:wrap anchorx="margin" anchory="margin"/>
         </v:shape>
       </w:pict>
     </w:r>
@@ -2719,291 +3058,413 @@
 </file>
 
 <file path=word/styles.xml><?xml version="1.0" encoding="utf-8"?>
-<w:styles xmlns:mc="http://schemas.openxmlformats.org/markup-compatibility/2006" xmlns:o="urn:schemas-microsoft-com:office:office" xmlns:r="http://schemas.openxmlformats.org/officeDocument/2006/relationships" xmlns:m="http://schemas.openxmlformats.org/officeDocument/2006/math" xmlns:v="urn:schemas-microsoft-com:vml" xmlns:w="http://schemas.openxmlformats.org/wordprocessingml/2006/main" xmlns:w14="http://schemas.microsoft.com/office/word/2010/wordml" xmlns:w10="urn:schemas-microsoft-com:office:word" xmlns:sl="http://schemas.openxmlformats.org/schemaLibrary/2006/main" xmlns:wpsCustomData="http://www.wps.cn/officeDocument/2013/wpsCustomData" mc:Ignorable="w14">
+<w:styles xmlns:mc="http://schemas.openxmlformats.org/markup-compatibility/2006" xmlns:r="http://schemas.openxmlformats.org/officeDocument/2006/relationships" xmlns:w="http://schemas.openxmlformats.org/wordprocessingml/2006/main" xmlns:w14="http://schemas.microsoft.com/office/word/2010/wordml" xmlns:w15="http://schemas.microsoft.com/office/word/2012/wordml" xmlns:w16cex="http://schemas.microsoft.com/office/word/2018/wordml/cex" xmlns:w16cid="http://schemas.microsoft.com/office/word/2016/wordml/cid" xmlns:w16="http://schemas.microsoft.com/office/word/2018/wordml" xmlns:w16sdtdh="http://schemas.microsoft.com/office/word/2020/wordml/sdtdatahash" xmlns:w16se="http://schemas.microsoft.com/office/word/2015/wordml/symex" mc:Ignorable="w14 w15 w16se w16cid w16 w16cex w16sdtdh">
   <w:docDefaults>
     <w:rPrDefault>
       <w:rPr>
-        <w:rFonts w:asciiTheme="minorHAnsi" w:hAnsiTheme="minorHAnsi" w:eastAsiaTheme="minorHAnsi" w:cstheme="minorBidi"/>
+        <w:rFonts w:asciiTheme="minorHAnsi" w:eastAsiaTheme="minorHAnsi" w:hAnsiTheme="minorHAnsi" w:cstheme="minorBidi"/>
+        <w:sz w:val="22"/>
+        <w:szCs w:val="22"/>
+        <w:lang w:val="en-US" w:eastAsia="en-US" w:bidi="ar-SA"/>
       </w:rPr>
     </w:rPrDefault>
-    <w:pPrDefault/>
+    <w:pPrDefault>
+      <w:pPr>
+        <w:spacing w:after="160" w:line="259" w:lineRule="auto"/>
+      </w:pPr>
+    </w:pPrDefault>
   </w:docDefaults>
-  <w:latentStyles w:count="260" w:defQFormat="0" w:defUnhideWhenUsed="1" w:defSemiHidden="1" w:defUIPriority="99" w:defLockedState="0">
-    <w:lsdException w:qFormat="1" w:unhideWhenUsed="0" w:uiPriority="0" w:semiHidden="0" w:name="Normal"/>
-    <w:lsdException w:qFormat="1" w:unhideWhenUsed="0" w:uiPriority="9" w:semiHidden="0" w:name="heading 1"/>
-    <w:lsdException w:qFormat="1" w:uiPriority="9" w:name="heading 2"/>
-    <w:lsdException w:qFormat="1" w:uiPriority="9" w:name="heading 3"/>
-    <w:lsdException w:qFormat="1" w:uiPriority="9" w:name="heading 4"/>
-    <w:lsdException w:qFormat="1" w:uiPriority="9" w:name="heading 5"/>
-    <w:lsdException w:qFormat="1" w:uiPriority="9" w:name="heading 6"/>
-    <w:lsdException w:qFormat="1" w:uiPriority="9" w:name="heading 7"/>
-    <w:lsdException w:qFormat="1" w:uiPriority="9" w:name="heading 8"/>
-    <w:lsdException w:qFormat="1" w:uiPriority="9" w:name="heading 9"/>
-    <w:lsdException w:uiPriority="99" w:name="index 1"/>
-    <w:lsdException w:uiPriority="99" w:name="index 2"/>
-    <w:lsdException w:uiPriority="99" w:name="index 3"/>
-    <w:lsdException w:uiPriority="99" w:name="index 4"/>
-    <w:lsdException w:uiPriority="99" w:name="index 5"/>
-    <w:lsdException w:uiPriority="99" w:name="index 6"/>
-    <w:lsdException w:uiPriority="99" w:name="index 7"/>
-    <w:lsdException w:uiPriority="99" w:name="index 8"/>
-    <w:lsdException w:uiPriority="99" w:name="index 9"/>
-    <w:lsdException w:uiPriority="39" w:name="toc 1"/>
-    <w:lsdException w:uiPriority="39" w:name="toc 2"/>
-    <w:lsdException w:uiPriority="39" w:name="toc 3"/>
-    <w:lsdException w:uiPriority="39" w:name="toc 4"/>
-    <w:lsdException w:uiPriority="39" w:name="toc 5"/>
-    <w:lsdException w:uiPriority="39" w:name="toc 6"/>
-    <w:lsdException w:uiPriority="39" w:name="toc 7"/>
-    <w:lsdException w:uiPriority="39" w:name="toc 8"/>
-    <w:lsdException w:uiPriority="39" w:name="toc 9"/>
-    <w:lsdException w:uiPriority="99" w:name="Normal Indent"/>
-    <w:lsdException w:uiPriority="99" w:name="footnote text"/>
-    <w:lsdException w:uiPriority="99" w:name="annotation text"/>
-    <w:lsdException w:uiPriority="99" w:semiHidden="0" w:name="header"/>
-    <w:lsdException w:uiPriority="99" w:semiHidden="0" w:name="footer"/>
-    <w:lsdException w:uiPriority="99" w:name="index heading"/>
-    <w:lsdException w:qFormat="1" w:uiPriority="35" w:name="caption"/>
-    <w:lsdException w:uiPriority="99" w:name="table of figures"/>
-    <w:lsdException w:uiPriority="99" w:name="envelope address"/>
-    <w:lsdException w:uiPriority="99" w:name="envelope return"/>
-    <w:lsdException w:uiPriority="99" w:name="footnote reference"/>
-    <w:lsdException w:uiPriority="99" w:name="annotation reference"/>
-    <w:lsdException w:uiPriority="99" w:name="line number"/>
-    <w:lsdException w:uiPriority="99" w:name="page number"/>
-    <w:lsdException w:uiPriority="99" w:name="endnote reference"/>
-    <w:lsdException w:uiPriority="99" w:name="endnote text"/>
-    <w:lsdException w:uiPriority="99" w:name="table of authorities"/>
-    <w:lsdException w:uiPriority="99" w:name="macro"/>
-    <w:lsdException w:uiPriority="99" w:name="toa heading"/>
-    <w:lsdException w:uiPriority="99" w:name="List"/>
-    <w:lsdException w:uiPriority="99" w:name="List Bullet"/>
-    <w:lsdException w:uiPriority="99" w:name="List Number"/>
-    <w:lsdException w:uiPriority="99" w:name="List 2"/>
-    <w:lsdException w:uiPriority="99" w:name="List 3"/>
-    <w:lsdException w:uiPriority="99" w:name="List 4"/>
-    <w:lsdException w:uiPriority="99" w:name="List 5"/>
-    <w:lsdException w:uiPriority="99" w:name="List Bullet 2"/>
-    <w:lsdException w:uiPriority="99" w:name="List Bullet 3"/>
-    <w:lsdException w:uiPriority="99" w:name="List Bullet 4"/>
-    <w:lsdException w:uiPriority="99" w:name="List Bullet 5"/>
-    <w:lsdException w:uiPriority="99" w:name="List Number 2"/>
-    <w:lsdException w:uiPriority="99" w:name="List Number 3"/>
-    <w:lsdException w:uiPriority="99" w:name="List Number 4"/>
-    <w:lsdException w:uiPriority="99" w:name="List Number 5"/>
-    <w:lsdException w:qFormat="1" w:unhideWhenUsed="0" w:uiPriority="10" w:semiHidden="0" w:name="Title"/>
-    <w:lsdException w:uiPriority="99" w:name="Closing"/>
-    <w:lsdException w:uiPriority="99" w:name="Signature"/>
-    <w:lsdException w:uiPriority="1" w:name="Default Paragraph Font"/>
-    <w:lsdException w:uiPriority="99" w:name="Body Text"/>
-    <w:lsdException w:uiPriority="99" w:name="Body Text Indent"/>
-    <w:lsdException w:uiPriority="99" w:name="List Continue"/>
-    <w:lsdException w:uiPriority="99" w:name="List Continue 2"/>
-    <w:lsdException w:uiPriority="99" w:name="List Continue 3"/>
-    <w:lsdException w:uiPriority="99" w:name="List Continue 4"/>
-    <w:lsdException w:uiPriority="99" w:name="List Continue 5"/>
-    <w:lsdException w:uiPriority="99" w:name="Message Header"/>
-    <w:lsdException w:qFormat="1" w:unhideWhenUsed="0" w:uiPriority="11" w:semiHidden="0" w:name="Subtitle"/>
-    <w:lsdException w:uiPriority="99" w:name="Salutation"/>
-    <w:lsdException w:uiPriority="99" w:name="Date"/>
-    <w:lsdException w:uiPriority="99" w:name="Body Text First Indent"/>
-    <w:lsdException w:uiPriority="99" w:name="Body Text First Indent 2"/>
-    <w:lsdException w:uiPriority="99" w:name="Note Heading"/>
-    <w:lsdException w:uiPriority="99" w:name="Body Text 2"/>
-    <w:lsdException w:uiPriority="99" w:name="Body Text 3"/>
-    <w:lsdException w:uiPriority="99" w:name="Body Text Indent 2"/>
-    <w:lsdException w:uiPriority="99" w:name="Body Text Indent 3"/>
-    <w:lsdException w:uiPriority="99" w:name="Block Text"/>
-    <w:lsdException w:uiPriority="99" w:name="Hyperlink"/>
-    <w:lsdException w:uiPriority="99" w:name="FollowedHyperlink"/>
-    <w:lsdException w:qFormat="1" w:unhideWhenUsed="0" w:uiPriority="22" w:semiHidden="0" w:name="Strong"/>
-    <w:lsdException w:qFormat="1" w:unhideWhenUsed="0" w:uiPriority="20" w:semiHidden="0" w:name="Emphasis"/>
-    <w:lsdException w:uiPriority="99" w:name="Document Map"/>
-    <w:lsdException w:uiPriority="99" w:name="Plain Text"/>
-    <w:lsdException w:uiPriority="99" w:name="E-mail Signature"/>
-    <w:lsdException w:qFormat="1" w:uiPriority="99" w:semiHidden="0" w:name="Normal (Web)"/>
-    <w:lsdException w:uiPriority="99" w:name="HTML Acronym"/>
-    <w:lsdException w:uiPriority="99" w:name="HTML Address"/>
-    <w:lsdException w:uiPriority="99" w:name="HTML Cite"/>
-    <w:lsdException w:uiPriority="99" w:name="HTML Code"/>
-    <w:lsdException w:uiPriority="99" w:name="HTML Definition"/>
-    <w:lsdException w:uiPriority="99" w:name="HTML Keyboard"/>
-    <w:lsdException w:uiPriority="99" w:name="HTML Preformatted"/>
-    <w:lsdException w:uiPriority="99" w:name="HTML Sample"/>
-    <w:lsdException w:uiPriority="99" w:name="HTML Typewriter"/>
-    <w:lsdException w:uiPriority="99" w:name="HTML Variable"/>
-    <w:lsdException w:uiPriority="99" w:name="Normal Table"/>
-    <w:lsdException w:uiPriority="99" w:name="annotation subject"/>
-    <w:lsdException w:uiPriority="99" w:name="Table Simple 1"/>
-    <w:lsdException w:uiPriority="99" w:name="Table Simple 2"/>
-    <w:lsdException w:uiPriority="99" w:name="Table Simple 3"/>
-    <w:lsdException w:uiPriority="99" w:name="Table Classic 1"/>
-    <w:lsdException w:uiPriority="99" w:name="Table Classic 2"/>
-    <w:lsdException w:uiPriority="99" w:name="Table Classic 3"/>
-    <w:lsdException w:uiPriority="99" w:name="Table Classic 4"/>
-    <w:lsdException w:uiPriority="99" w:name="Table Colorful 1"/>
-    <w:lsdException w:uiPriority="99" w:name="Table Colorful 2"/>
-    <w:lsdException w:uiPriority="99" w:name="Table Colorful 3"/>
-    <w:lsdException w:uiPriority="99" w:name="Table Columns 1"/>
-    <w:lsdException w:uiPriority="99" w:name="Table Columns 2"/>
-    <w:lsdException w:uiPriority="99" w:name="Table Columns 3"/>
-    <w:lsdException w:uiPriority="99" w:name="Table Columns 4"/>
-    <w:lsdException w:uiPriority="99" w:name="Table Columns 5"/>
-    <w:lsdException w:uiPriority="99" w:name="Table Grid 1"/>
-    <w:lsdException w:uiPriority="99" w:name="Table Grid 2"/>
-    <w:lsdException w:uiPriority="99" w:name="Table Grid 3"/>
-    <w:lsdException w:uiPriority="99" w:name="Table Grid 4"/>
-    <w:lsdException w:uiPriority="99" w:name="Table Grid 5"/>
-    <w:lsdException w:uiPriority="99" w:name="Table Grid 6"/>
-    <w:lsdException w:uiPriority="99" w:name="Table Grid 7"/>
-    <w:lsdException w:uiPriority="99" w:name="Table Grid 8"/>
-    <w:lsdException w:uiPriority="99" w:name="Table List 1"/>
-    <w:lsdException w:uiPriority="99" w:name="Table List 2"/>
-    <w:lsdException w:uiPriority="99" w:name="Table List 3"/>
-    <w:lsdException w:uiPriority="99" w:name="Table List 4"/>
-    <w:lsdException w:uiPriority="99" w:name="Table List 5"/>
-    <w:lsdException w:uiPriority="99" w:name="Table List 6"/>
-    <w:lsdException w:uiPriority="99" w:name="Table List 7"/>
-    <w:lsdException w:uiPriority="99" w:name="Table List 8"/>
-    <w:lsdException w:uiPriority="99" w:name="Table 3D effects 1"/>
-    <w:lsdException w:uiPriority="99" w:name="Table 3D effects 2"/>
-    <w:lsdException w:uiPriority="99" w:name="Table 3D effects 3"/>
-    <w:lsdException w:uiPriority="99" w:name="Table Contemporary"/>
-    <w:lsdException w:uiPriority="99" w:name="Table Elegant"/>
-    <w:lsdException w:uiPriority="99" w:name="Table Professional"/>
-    <w:lsdException w:unhideWhenUsed="0" w:uiPriority="99" w:semiHidden="0" w:name="Table Subtle 1"/>
-    <w:lsdException w:uiPriority="99" w:name="Table Subtle 2"/>
-    <w:lsdException w:uiPriority="99" w:name="Table Web 1"/>
-    <w:lsdException w:unhideWhenUsed="0" w:uiPriority="99" w:semiHidden="0" w:name="Table Web 2"/>
-    <w:lsdException w:unhideWhenUsed="0" w:uiPriority="99" w:semiHidden="0" w:name="Table Web 3"/>
-    <w:lsdException w:qFormat="1" w:uiPriority="99" w:name="Balloon Text"/>
-    <w:lsdException w:unhideWhenUsed="0" w:uiPriority="39" w:semiHidden="0" w:name="Table Grid"/>
-    <w:lsdException w:uiPriority="99" w:name="Table Theme"/>
-    <w:lsdException w:unhideWhenUsed="0" w:uiPriority="60" w:semiHidden="0" w:name="Light Shading"/>
-    <w:lsdException w:unhideWhenUsed="0" w:uiPriority="61" w:semiHidden="0" w:name="Light List"/>
-    <w:lsdException w:unhideWhenUsed="0" w:uiPriority="62" w:semiHidden="0" w:name="Light Grid"/>
-    <w:lsdException w:unhideWhenUsed="0" w:uiPriority="63" w:semiHidden="0" w:name="Medium Shading 1"/>
-    <w:lsdException w:unhideWhenUsed="0" w:uiPriority="64" w:semiHidden="0" w:name="Medium Shading 2"/>
-    <w:lsdException w:unhideWhenUsed="0" w:uiPriority="65" w:semiHidden="0" w:name="Medium List 1"/>
-    <w:lsdException w:unhideWhenUsed="0" w:uiPriority="66" w:semiHidden="0" w:name="Medium List 2"/>
-    <w:lsdException w:unhideWhenUsed="0" w:uiPriority="67" w:semiHidden="0" w:name="Medium Grid 1"/>
-    <w:lsdException w:unhideWhenUsed="0" w:uiPriority="68" w:semiHidden="0" w:name="Medium Grid 2"/>
-    <w:lsdException w:unhideWhenUsed="0" w:uiPriority="69" w:semiHidden="0" w:name="Medium Grid 3"/>
-    <w:lsdException w:unhideWhenUsed="0" w:uiPriority="70" w:semiHidden="0" w:name="Dark List"/>
-    <w:lsdException w:unhideWhenUsed="0" w:uiPriority="71" w:semiHidden="0" w:name="Colorful Shading"/>
-    <w:lsdException w:unhideWhenUsed="0" w:uiPriority="72" w:semiHidden="0" w:name="Colorful List"/>
-    <w:lsdException w:unhideWhenUsed="0" w:uiPriority="73" w:semiHidden="0" w:name="Colorful Grid"/>
-    <w:lsdException w:unhideWhenUsed="0" w:uiPriority="60" w:semiHidden="0" w:name="Light Shading Accent 1"/>
-    <w:lsdException w:unhideWhenUsed="0" w:uiPriority="61" w:semiHidden="0" w:name="Light List Accent 1"/>
-    <w:lsdException w:unhideWhenUsed="0" w:uiPriority="62" w:semiHidden="0" w:name="Light Grid Accent 1"/>
-    <w:lsdException w:unhideWhenUsed="0" w:uiPriority="63" w:semiHidden="0" w:name="Medium Shading 1 Accent 1"/>
-    <w:lsdException w:unhideWhenUsed="0" w:uiPriority="64" w:semiHidden="0" w:name="Medium Shading 2 Accent 1"/>
-    <w:lsdException w:unhideWhenUsed="0" w:uiPriority="65" w:semiHidden="0" w:name="Medium List 1 Accent 1"/>
-    <w:lsdException w:unhideWhenUsed="0" w:uiPriority="66" w:semiHidden="0" w:name="Medium List 2 Accent 1"/>
-    <w:lsdException w:unhideWhenUsed="0" w:uiPriority="67" w:semiHidden="0" w:name="Medium Grid 1 Accent 1"/>
-    <w:lsdException w:unhideWhenUsed="0" w:uiPriority="68" w:semiHidden="0" w:name="Medium Grid 2 Accent 1"/>
-    <w:lsdException w:unhideWhenUsed="0" w:uiPriority="69" w:semiHidden="0" w:name="Medium Grid 3 Accent 1"/>
-    <w:lsdException w:unhideWhenUsed="0" w:uiPriority="70" w:semiHidden="0" w:name="Dark List Accent 1"/>
-    <w:lsdException w:unhideWhenUsed="0" w:uiPriority="71" w:semiHidden="0" w:name="Colorful Shading Accent 1"/>
-    <w:lsdException w:unhideWhenUsed="0" w:uiPriority="72" w:semiHidden="0" w:name="Colorful List Accent 1"/>
-    <w:lsdException w:unhideWhenUsed="0" w:uiPriority="73" w:semiHidden="0" w:name="Colorful Grid Accent 1"/>
-    <w:lsdException w:unhideWhenUsed="0" w:uiPriority="60" w:semiHidden="0" w:name="Light Shading Accent 2"/>
-    <w:lsdException w:unhideWhenUsed="0" w:uiPriority="61" w:semiHidden="0" w:name="Light List Accent 2"/>
-    <w:lsdException w:unhideWhenUsed="0" w:uiPriority="62" w:semiHidden="0" w:name="Light Grid Accent 2"/>
-    <w:lsdException w:unhideWhenUsed="0" w:uiPriority="63" w:semiHidden="0" w:name="Medium Shading 1 Accent 2"/>
-    <w:lsdException w:unhideWhenUsed="0" w:uiPriority="64" w:semiHidden="0" w:name="Medium Shading 2 Accent 2"/>
-    <w:lsdException w:unhideWhenUsed="0" w:uiPriority="65" w:semiHidden="0" w:name="Medium List 1 Accent 2"/>
-    <w:lsdException w:unhideWhenUsed="0" w:uiPriority="66" w:semiHidden="0" w:name="Medium List 2 Accent 2"/>
-    <w:lsdException w:unhideWhenUsed="0" w:uiPriority="67" w:semiHidden="0" w:name="Medium Grid 1 Accent 2"/>
-    <w:lsdException w:unhideWhenUsed="0" w:uiPriority="68" w:semiHidden="0" w:name="Medium Grid 2 Accent 2"/>
-    <w:lsdException w:unhideWhenUsed="0" w:uiPriority="69" w:semiHidden="0" w:name="Medium Grid 3 Accent 2"/>
-    <w:lsdException w:unhideWhenUsed="0" w:uiPriority="70" w:semiHidden="0" w:name="Dark List Accent 2"/>
-    <w:lsdException w:unhideWhenUsed="0" w:uiPriority="71" w:semiHidden="0" w:name="Colorful Shading Accent 2"/>
-    <w:lsdException w:unhideWhenUsed="0" w:uiPriority="72" w:semiHidden="0" w:name="Colorful List Accent 2"/>
-    <w:lsdException w:unhideWhenUsed="0" w:uiPriority="73" w:semiHidden="0" w:name="Colorful Grid Accent 2"/>
-    <w:lsdException w:unhideWhenUsed="0" w:uiPriority="60" w:semiHidden="0" w:name="Light Shading Accent 3"/>
-    <w:lsdException w:unhideWhenUsed="0" w:uiPriority="61" w:semiHidden="0" w:name="Light List Accent 3"/>
-    <w:lsdException w:unhideWhenUsed="0" w:uiPriority="62" w:semiHidden="0" w:name="Light Grid Accent 3"/>
-    <w:lsdException w:unhideWhenUsed="0" w:uiPriority="63" w:semiHidden="0" w:name="Medium Shading 1 Accent 3"/>
-    <w:lsdException w:unhideWhenUsed="0" w:uiPriority="64" w:semiHidden="0" w:name="Medium Shading 2 Accent 3"/>
-    <w:lsdException w:unhideWhenUsed="0" w:uiPriority="65" w:semiHidden="0" w:name="Medium List 1 Accent 3"/>
-    <w:lsdException w:unhideWhenUsed="0" w:uiPriority="66" w:semiHidden="0" w:name="Medium List 2 Accent 3"/>
-    <w:lsdException w:unhideWhenUsed="0" w:uiPriority="67" w:semiHidden="0" w:name="Medium Grid 1 Accent 3"/>
-    <w:lsdException w:unhideWhenUsed="0" w:uiPriority="68" w:semiHidden="0" w:name="Medium Grid 2 Accent 3"/>
-    <w:lsdException w:unhideWhenUsed="0" w:uiPriority="69" w:semiHidden="0" w:name="Medium Grid 3 Accent 3"/>
-    <w:lsdException w:unhideWhenUsed="0" w:uiPriority="70" w:semiHidden="0" w:name="Dark List Accent 3"/>
-    <w:lsdException w:unhideWhenUsed="0" w:uiPriority="71" w:semiHidden="0" w:name="Colorful Shading Accent 3"/>
-    <w:lsdException w:unhideWhenUsed="0" w:uiPriority="72" w:semiHidden="0" w:name="Colorful List Accent 3"/>
-    <w:lsdException w:unhideWhenUsed="0" w:uiPriority="73" w:semiHidden="0" w:name="Colorful Grid Accent 3"/>
-    <w:lsdException w:unhideWhenUsed="0" w:uiPriority="60" w:semiHidden="0" w:name="Light Shading Accent 4"/>
-    <w:lsdException w:unhideWhenUsed="0" w:uiPriority="61" w:semiHidden="0" w:name="Light List Accent 4"/>
-    <w:lsdException w:unhideWhenUsed="0" w:uiPriority="62" w:semiHidden="0" w:name="Light Grid Accent 4"/>
-    <w:lsdException w:unhideWhenUsed="0" w:uiPriority="63" w:semiHidden="0" w:name="Medium Shading 1 Accent 4"/>
-    <w:lsdException w:unhideWhenUsed="0" w:uiPriority="64" w:semiHidden="0" w:name="Medium Shading 2 Accent 4"/>
-    <w:lsdException w:unhideWhenUsed="0" w:uiPriority="65" w:semiHidden="0" w:name="Medium List 1 Accent 4"/>
-    <w:lsdException w:unhideWhenUsed="0" w:uiPriority="66" w:semiHidden="0" w:name="Medium List 2 Accent 4"/>
-    <w:lsdException w:unhideWhenUsed="0" w:uiPriority="67" w:semiHidden="0" w:name="Medium Grid 1 Accent 4"/>
-    <w:lsdException w:unhideWhenUsed="0" w:uiPriority="68" w:semiHidden="0" w:name="Medium Grid 2 Accent 4"/>
-    <w:lsdException w:unhideWhenUsed="0" w:uiPriority="69" w:semiHidden="0" w:name="Medium Grid 3 Accent 4"/>
-    <w:lsdException w:unhideWhenUsed="0" w:uiPriority="70" w:semiHidden="0" w:name="Dark List Accent 4"/>
-    <w:lsdException w:unhideWhenUsed="0" w:uiPriority="71" w:semiHidden="0" w:name="Colorful Shading Accent 4"/>
-    <w:lsdException w:unhideWhenUsed="0" w:uiPriority="72" w:semiHidden="0" w:name="Colorful List Accent 4"/>
-    <w:lsdException w:unhideWhenUsed="0" w:uiPriority="73" w:semiHidden="0" w:name="Colorful Grid Accent 4"/>
-    <w:lsdException w:unhideWhenUsed="0" w:uiPriority="60" w:semiHidden="0" w:name="Light Shading Accent 5"/>
-    <w:lsdException w:unhideWhenUsed="0" w:uiPriority="61" w:semiHidden="0" w:name="Light List Accent 5"/>
-    <w:lsdException w:unhideWhenUsed="0" w:uiPriority="62" w:semiHidden="0" w:name="Light Grid Accent 5"/>
-    <w:lsdException w:unhideWhenUsed="0" w:uiPriority="63" w:semiHidden="0" w:name="Medium Shading 1 Accent 5"/>
-    <w:lsdException w:unhideWhenUsed="0" w:uiPriority="64" w:semiHidden="0" w:name="Medium Shading 2 Accent 5"/>
-    <w:lsdException w:unhideWhenUsed="0" w:uiPriority="65" w:semiHidden="0" w:name="Medium List 1 Accent 5"/>
-    <w:lsdException w:unhideWhenUsed="0" w:uiPriority="66" w:semiHidden="0" w:name="Medium List 2 Accent 5"/>
-    <w:lsdException w:unhideWhenUsed="0" w:uiPriority="67" w:semiHidden="0" w:name="Medium Grid 1 Accent 5"/>
-    <w:lsdException w:unhideWhenUsed="0" w:uiPriority="68" w:semiHidden="0" w:name="Medium Grid 2 Accent 5"/>
-    <w:lsdException w:unhideWhenUsed="0" w:uiPriority="69" w:semiHidden="0" w:name="Medium Grid 3 Accent 5"/>
-    <w:lsdException w:unhideWhenUsed="0" w:uiPriority="70" w:semiHidden="0" w:name="Dark List Accent 5"/>
-    <w:lsdException w:unhideWhenUsed="0" w:uiPriority="71" w:semiHidden="0" w:name="Colorful Shading Accent 5"/>
-    <w:lsdException w:unhideWhenUsed="0" w:uiPriority="72" w:semiHidden="0" w:name="Colorful List Accent 5"/>
-    <w:lsdException w:unhideWhenUsed="0" w:uiPriority="73" w:semiHidden="0" w:name="Colorful Grid Accent 5"/>
-    <w:lsdException w:unhideWhenUsed="0" w:uiPriority="60" w:semiHidden="0" w:name="Light Shading Accent 6"/>
-    <w:lsdException w:unhideWhenUsed="0" w:uiPriority="61" w:semiHidden="0" w:name="Light List Accent 6"/>
-    <w:lsdException w:unhideWhenUsed="0" w:uiPriority="62" w:semiHidden="0" w:name="Light Grid Accent 6"/>
-    <w:lsdException w:unhideWhenUsed="0" w:uiPriority="63" w:semiHidden="0" w:name="Medium Shading 1 Accent 6"/>
-    <w:lsdException w:unhideWhenUsed="0" w:uiPriority="64" w:semiHidden="0" w:name="Medium Shading 2 Accent 6"/>
-    <w:lsdException w:unhideWhenUsed="0" w:uiPriority="65" w:semiHidden="0" w:name="Medium List 1 Accent 6"/>
-    <w:lsdException w:unhideWhenUsed="0" w:uiPriority="66" w:semiHidden="0" w:name="Medium List 2 Accent 6"/>
-    <w:lsdException w:unhideWhenUsed="0" w:uiPriority="67" w:semiHidden="0" w:name="Medium Grid 1 Accent 6"/>
-    <w:lsdException w:unhideWhenUsed="0" w:uiPriority="68" w:semiHidden="0" w:name="Medium Grid 2 Accent 6"/>
-    <w:lsdException w:unhideWhenUsed="0" w:uiPriority="69" w:semiHidden="0" w:name="Medium Grid 3 Accent 6"/>
-    <w:lsdException w:unhideWhenUsed="0" w:uiPriority="70" w:semiHidden="0" w:name="Dark List Accent 6"/>
-    <w:lsdException w:unhideWhenUsed="0" w:uiPriority="71" w:semiHidden="0" w:name="Colorful Shading Accent 6"/>
-    <w:lsdException w:unhideWhenUsed="0" w:uiPriority="72" w:semiHidden="0" w:name="Colorful List Accent 6"/>
-    <w:lsdException w:unhideWhenUsed="0" w:uiPriority="73" w:semiHidden="0" w:name="Colorful Grid Accent 6"/>
+  <w:latentStyles w:defLockedState="0" w:defUIPriority="99" w:defSemiHidden="0" w:defUnhideWhenUsed="0" w:defQFormat="0" w:count="376">
+    <w:lsdException w:name="Normal" w:uiPriority="0" w:qFormat="1"/>
+    <w:lsdException w:name="heading 1" w:uiPriority="9" w:qFormat="1"/>
+    <w:lsdException w:name="heading 2" w:semiHidden="1" w:uiPriority="9" w:unhideWhenUsed="1" w:qFormat="1"/>
+    <w:lsdException w:name="heading 3" w:semiHidden="1" w:uiPriority="9" w:unhideWhenUsed="1" w:qFormat="1"/>
+    <w:lsdException w:name="heading 4" w:semiHidden="1" w:uiPriority="9" w:unhideWhenUsed="1" w:qFormat="1"/>
+    <w:lsdException w:name="heading 5" w:semiHidden="1" w:uiPriority="9" w:unhideWhenUsed="1" w:qFormat="1"/>
+    <w:lsdException w:name="heading 6" w:semiHidden="1" w:uiPriority="9" w:unhideWhenUsed="1" w:qFormat="1"/>
+    <w:lsdException w:name="heading 7" w:semiHidden="1" w:uiPriority="9" w:unhideWhenUsed="1" w:qFormat="1"/>
+    <w:lsdException w:name="heading 8" w:semiHidden="1" w:uiPriority="9" w:unhideWhenUsed="1" w:qFormat="1"/>
+    <w:lsdException w:name="heading 9" w:semiHidden="1" w:uiPriority="9" w:unhideWhenUsed="1" w:qFormat="1"/>
+    <w:lsdException w:name="index 1" w:semiHidden="1" w:unhideWhenUsed="1"/>
+    <w:lsdException w:name="index 2" w:semiHidden="1" w:unhideWhenUsed="1"/>
+    <w:lsdException w:name="index 3" w:semiHidden="1" w:unhideWhenUsed="1"/>
+    <w:lsdException w:name="index 4" w:semiHidden="1" w:unhideWhenUsed="1"/>
+    <w:lsdException w:name="index 5" w:semiHidden="1" w:unhideWhenUsed="1"/>
+    <w:lsdException w:name="index 6" w:semiHidden="1" w:unhideWhenUsed="1"/>
+    <w:lsdException w:name="index 7" w:semiHidden="1" w:unhideWhenUsed="1"/>
+    <w:lsdException w:name="index 8" w:semiHidden="1" w:unhideWhenUsed="1"/>
+    <w:lsdException w:name="index 9" w:semiHidden="1" w:unhideWhenUsed="1"/>
+    <w:lsdException w:name="toc 1" w:semiHidden="1" w:uiPriority="39" w:unhideWhenUsed="1"/>
+    <w:lsdException w:name="toc 2" w:semiHidden="1" w:uiPriority="39" w:unhideWhenUsed="1"/>
+    <w:lsdException w:name="toc 3" w:semiHidden="1" w:uiPriority="39" w:unhideWhenUsed="1"/>
+    <w:lsdException w:name="toc 4" w:semiHidden="1" w:uiPriority="39" w:unhideWhenUsed="1"/>
+    <w:lsdException w:name="toc 5" w:semiHidden="1" w:uiPriority="39" w:unhideWhenUsed="1"/>
+    <w:lsdException w:name="toc 6" w:semiHidden="1" w:uiPriority="39" w:unhideWhenUsed="1"/>
+    <w:lsdException w:name="toc 7" w:semiHidden="1" w:uiPriority="39" w:unhideWhenUsed="1"/>
+    <w:lsdException w:name="toc 8" w:semiHidden="1" w:uiPriority="39" w:unhideWhenUsed="1"/>
+    <w:lsdException w:name="toc 9" w:semiHidden="1" w:uiPriority="39" w:unhideWhenUsed="1"/>
+    <w:lsdException w:name="Normal Indent" w:semiHidden="1" w:unhideWhenUsed="1"/>
+    <w:lsdException w:name="footnote text" w:semiHidden="1" w:unhideWhenUsed="1"/>
+    <w:lsdException w:name="annotation text" w:semiHidden="1" w:unhideWhenUsed="1"/>
+    <w:lsdException w:name="header" w:semiHidden="1" w:unhideWhenUsed="1"/>
+    <w:lsdException w:name="footer" w:semiHidden="1" w:unhideWhenUsed="1"/>
+    <w:lsdException w:name="index heading" w:semiHidden="1" w:unhideWhenUsed="1"/>
+    <w:lsdException w:name="caption" w:semiHidden="1" w:uiPriority="35" w:unhideWhenUsed="1" w:qFormat="1"/>
+    <w:lsdException w:name="table of figures" w:semiHidden="1" w:unhideWhenUsed="1"/>
+    <w:lsdException w:name="envelope address" w:semiHidden="1" w:unhideWhenUsed="1"/>
+    <w:lsdException w:name="envelope return" w:semiHidden="1" w:unhideWhenUsed="1"/>
+    <w:lsdException w:name="footnote reference" w:semiHidden="1" w:unhideWhenUsed="1"/>
+    <w:lsdException w:name="annotation reference" w:semiHidden="1" w:unhideWhenUsed="1"/>
+    <w:lsdException w:name="line number" w:semiHidden="1" w:unhideWhenUsed="1"/>
+    <w:lsdException w:name="page number" w:semiHidden="1" w:unhideWhenUsed="1"/>
+    <w:lsdException w:name="endnote reference" w:semiHidden="1" w:unhideWhenUsed="1"/>
+    <w:lsdException w:name="endnote text" w:semiHidden="1" w:unhideWhenUsed="1"/>
+    <w:lsdException w:name="table of authorities" w:semiHidden="1" w:unhideWhenUsed="1"/>
+    <w:lsdException w:name="macro" w:semiHidden="1" w:unhideWhenUsed="1"/>
+    <w:lsdException w:name="toa heading" w:semiHidden="1" w:unhideWhenUsed="1"/>
+    <w:lsdException w:name="List" w:semiHidden="1" w:unhideWhenUsed="1"/>
+    <w:lsdException w:name="List Bullet" w:semiHidden="1" w:unhideWhenUsed="1"/>
+    <w:lsdException w:name="List Number" w:semiHidden="1" w:unhideWhenUsed="1"/>
+    <w:lsdException w:name="List 2" w:semiHidden="1" w:unhideWhenUsed="1"/>
+    <w:lsdException w:name="List 3" w:semiHidden="1" w:unhideWhenUsed="1"/>
+    <w:lsdException w:name="List 4" w:semiHidden="1" w:unhideWhenUsed="1"/>
+    <w:lsdException w:name="List 5" w:semiHidden="1" w:unhideWhenUsed="1"/>
+    <w:lsdException w:name="List Bullet 2" w:semiHidden="1" w:unhideWhenUsed="1"/>
+    <w:lsdException w:name="List Bullet 3" w:semiHidden="1" w:unhideWhenUsed="1"/>
+    <w:lsdException w:name="List Bullet 4" w:semiHidden="1" w:unhideWhenUsed="1"/>
+    <w:lsdException w:name="List Bullet 5" w:semiHidden="1" w:unhideWhenUsed="1"/>
+    <w:lsdException w:name="List Number 2" w:semiHidden="1" w:unhideWhenUsed="1"/>
+    <w:lsdException w:name="List Number 3" w:semiHidden="1" w:unhideWhenUsed="1"/>
+    <w:lsdException w:name="List Number 4" w:semiHidden="1" w:unhideWhenUsed="1"/>
+    <w:lsdException w:name="List Number 5" w:semiHidden="1" w:unhideWhenUsed="1"/>
+    <w:lsdException w:name="Title" w:uiPriority="10" w:qFormat="1"/>
+    <w:lsdException w:name="Closing" w:semiHidden="1" w:unhideWhenUsed="1"/>
+    <w:lsdException w:name="Signature" w:semiHidden="1" w:unhideWhenUsed="1"/>
+    <w:lsdException w:name="Default Paragraph Font" w:semiHidden="1" w:uiPriority="1" w:unhideWhenUsed="1"/>
+    <w:lsdException w:name="Body Text" w:semiHidden="1" w:unhideWhenUsed="1"/>
+    <w:lsdException w:name="Body Text Indent" w:semiHidden="1" w:unhideWhenUsed="1"/>
+    <w:lsdException w:name="List Continue" w:semiHidden="1" w:unhideWhenUsed="1"/>
+    <w:lsdException w:name="List Continue 2" w:semiHidden="1" w:unhideWhenUsed="1"/>
+    <w:lsdException w:name="List Continue 3" w:semiHidden="1" w:unhideWhenUsed="1"/>
+    <w:lsdException w:name="List Continue 4" w:semiHidden="1" w:unhideWhenUsed="1"/>
+    <w:lsdException w:name="List Continue 5" w:semiHidden="1" w:unhideWhenUsed="1"/>
+    <w:lsdException w:name="Message Header" w:semiHidden="1" w:unhideWhenUsed="1"/>
+    <w:lsdException w:name="Subtitle" w:uiPriority="11" w:qFormat="1"/>
+    <w:lsdException w:name="Salutation" w:semiHidden="1" w:unhideWhenUsed="1"/>
+    <w:lsdException w:name="Date" w:semiHidden="1" w:unhideWhenUsed="1"/>
+    <w:lsdException w:name="Body Text First Indent" w:semiHidden="1" w:unhideWhenUsed="1"/>
+    <w:lsdException w:name="Body Text First Indent 2" w:semiHidden="1" w:unhideWhenUsed="1"/>
+    <w:lsdException w:name="Note Heading" w:semiHidden="1" w:unhideWhenUsed="1"/>
+    <w:lsdException w:name="Body Text 2" w:semiHidden="1" w:unhideWhenUsed="1"/>
+    <w:lsdException w:name="Body Text 3" w:semiHidden="1" w:unhideWhenUsed="1"/>
+    <w:lsdException w:name="Body Text Indent 2" w:semiHidden="1" w:unhideWhenUsed="1"/>
+    <w:lsdException w:name="Body Text Indent 3" w:semiHidden="1" w:unhideWhenUsed="1"/>
+    <w:lsdException w:name="Block Text" w:semiHidden="1" w:unhideWhenUsed="1"/>
+    <w:lsdException w:name="Hyperlink" w:semiHidden="1" w:unhideWhenUsed="1"/>
+    <w:lsdException w:name="FollowedHyperlink" w:semiHidden="1" w:unhideWhenUsed="1"/>
+    <w:lsdException w:name="Strong" w:uiPriority="22" w:qFormat="1"/>
+    <w:lsdException w:name="Emphasis" w:uiPriority="20" w:qFormat="1"/>
+    <w:lsdException w:name="Document Map" w:semiHidden="1" w:unhideWhenUsed="1"/>
+    <w:lsdException w:name="Plain Text" w:semiHidden="1" w:unhideWhenUsed="1"/>
+    <w:lsdException w:name="E-mail Signature" w:semiHidden="1" w:unhideWhenUsed="1"/>
+    <w:lsdException w:name="HTML Top of Form" w:semiHidden="1" w:unhideWhenUsed="1"/>
+    <w:lsdException w:name="HTML Bottom of Form" w:semiHidden="1" w:unhideWhenUsed="1"/>
+    <w:lsdException w:name="Normal (Web)" w:semiHidden="1" w:unhideWhenUsed="1"/>
+    <w:lsdException w:name="HTML Acronym" w:semiHidden="1" w:unhideWhenUsed="1"/>
+    <w:lsdException w:name="HTML Address" w:semiHidden="1" w:unhideWhenUsed="1"/>
+    <w:lsdException w:name="HTML Cite" w:semiHidden="1" w:unhideWhenUsed="1"/>
+    <w:lsdException w:name="HTML Code" w:semiHidden="1" w:unhideWhenUsed="1"/>
+    <w:lsdException w:name="HTML Definition" w:semiHidden="1" w:unhideWhenUsed="1"/>
+    <w:lsdException w:name="HTML Keyboard" w:semiHidden="1" w:unhideWhenUsed="1"/>
+    <w:lsdException w:name="HTML Preformatted" w:semiHidden="1" w:unhideWhenUsed="1"/>
+    <w:lsdException w:name="HTML Sample" w:semiHidden="1" w:unhideWhenUsed="1"/>
+    <w:lsdException w:name="HTML Typewriter" w:semiHidden="1" w:unhideWhenUsed="1"/>
+    <w:lsdException w:name="HTML Variable" w:semiHidden="1" w:unhideWhenUsed="1"/>
+    <w:lsdException w:name="annotation subject" w:semiHidden="1" w:unhideWhenUsed="1"/>
+    <w:lsdException w:name="No List" w:semiHidden="1" w:unhideWhenUsed="1"/>
+    <w:lsdException w:name="Outline List 1" w:semiHidden="1" w:unhideWhenUsed="1"/>
+    <w:lsdException w:name="Outline List 2" w:semiHidden="1" w:unhideWhenUsed="1"/>
+    <w:lsdException w:name="Outline List 3" w:semiHidden="1" w:unhideWhenUsed="1"/>
+    <w:lsdException w:name="Table Simple 1" w:semiHidden="1" w:unhideWhenUsed="1"/>
+    <w:lsdException w:name="Table Simple 2" w:semiHidden="1" w:unhideWhenUsed="1"/>
+    <w:lsdException w:name="Table Simple 3" w:semiHidden="1" w:unhideWhenUsed="1"/>
+    <w:lsdException w:name="Table Classic 1" w:semiHidden="1" w:unhideWhenUsed="1"/>
+    <w:lsdException w:name="Table Classic 2" w:semiHidden="1" w:unhideWhenUsed="1"/>
+    <w:lsdException w:name="Table Classic 3" w:semiHidden="1" w:unhideWhenUsed="1"/>
+    <w:lsdException w:name="Table Classic 4" w:semiHidden="1" w:unhideWhenUsed="1"/>
+    <w:lsdException w:name="Table Colorful 1" w:semiHidden="1" w:unhideWhenUsed="1"/>
+    <w:lsdException w:name="Table Colorful 2" w:semiHidden="1" w:unhideWhenUsed="1"/>
+    <w:lsdException w:name="Table Colorful 3" w:semiHidden="1" w:unhideWhenUsed="1"/>
+    <w:lsdException w:name="Table Columns 1" w:semiHidden="1" w:unhideWhenUsed="1"/>
+    <w:lsdException w:name="Table Columns 2" w:semiHidden="1" w:unhideWhenUsed="1"/>
+    <w:lsdException w:name="Table Columns 3" w:semiHidden="1" w:unhideWhenUsed="1"/>
+    <w:lsdException w:name="Table Columns 4" w:semiHidden="1" w:unhideWhenUsed="1"/>
+    <w:lsdException w:name="Table Columns 5" w:semiHidden="1" w:unhideWhenUsed="1"/>
+    <w:lsdException w:name="Table Grid 1" w:semiHidden="1" w:unhideWhenUsed="1"/>
+    <w:lsdException w:name="Table Grid 2" w:semiHidden="1" w:unhideWhenUsed="1"/>
+    <w:lsdException w:name="Table Grid 3" w:semiHidden="1" w:unhideWhenUsed="1"/>
+    <w:lsdException w:name="Table Grid 4" w:semiHidden="1" w:unhideWhenUsed="1"/>
+    <w:lsdException w:name="Table Grid 5" w:semiHidden="1" w:unhideWhenUsed="1"/>
+    <w:lsdException w:name="Table Grid 6" w:semiHidden="1" w:unhideWhenUsed="1"/>
+    <w:lsdException w:name="Table Grid 7" w:semiHidden="1" w:unhideWhenUsed="1"/>
+    <w:lsdException w:name="Table Grid 8" w:semiHidden="1" w:unhideWhenUsed="1"/>
+    <w:lsdException w:name="Table List 1" w:semiHidden="1" w:unhideWhenUsed="1"/>
+    <w:lsdException w:name="Table List 2" w:semiHidden="1" w:unhideWhenUsed="1"/>
+    <w:lsdException w:name="Table List 3" w:semiHidden="1" w:unhideWhenUsed="1"/>
+    <w:lsdException w:name="Table List 4" w:semiHidden="1" w:unhideWhenUsed="1"/>
+    <w:lsdException w:name="Table List 5" w:semiHidden="1" w:unhideWhenUsed="1"/>
+    <w:lsdException w:name="Table List 6" w:semiHidden="1" w:unhideWhenUsed="1"/>
+    <w:lsdException w:name="Table List 7" w:semiHidden="1" w:unhideWhenUsed="1"/>
+    <w:lsdException w:name="Table List 8" w:semiHidden="1" w:unhideWhenUsed="1"/>
+    <w:lsdException w:name="Table 3D effects 1" w:semiHidden="1" w:unhideWhenUsed="1"/>
+    <w:lsdException w:name="Table 3D effects 2" w:semiHidden="1" w:unhideWhenUsed="1"/>
+    <w:lsdException w:name="Table 3D effects 3" w:semiHidden="1" w:unhideWhenUsed="1"/>
+    <w:lsdException w:name="Table Contemporary" w:semiHidden="1" w:unhideWhenUsed="1"/>
+    <w:lsdException w:name="Table Elegant" w:semiHidden="1" w:unhideWhenUsed="1"/>
+    <w:lsdException w:name="Table Professional" w:semiHidden="1" w:unhideWhenUsed="1"/>
+    <w:lsdException w:name="Table Subtle 2" w:semiHidden="1" w:unhideWhenUsed="1"/>
+    <w:lsdException w:name="Table Web 1" w:semiHidden="1" w:unhideWhenUsed="1"/>
+    <w:lsdException w:name="Balloon Text" w:semiHidden="1" w:unhideWhenUsed="1"/>
+    <w:lsdException w:name="Table Grid" w:uiPriority="39"/>
+    <w:lsdException w:name="Table Theme" w:semiHidden="1" w:unhideWhenUsed="1"/>
+    <w:lsdException w:name="Placeholder Text" w:semiHidden="1"/>
+    <w:lsdException w:name="No Spacing" w:uiPriority="1" w:qFormat="1"/>
+    <w:lsdException w:name="Light Shading" w:uiPriority="60"/>
+    <w:lsdException w:name="Light List" w:uiPriority="61"/>
+    <w:lsdException w:name="Light Grid" w:uiPriority="62"/>
+    <w:lsdException w:name="Medium Shading 1" w:uiPriority="63"/>
+    <w:lsdException w:name="Medium Shading 2" w:uiPriority="64"/>
+    <w:lsdException w:name="Medium List 1" w:uiPriority="65"/>
+    <w:lsdException w:name="Medium List 2" w:uiPriority="66"/>
+    <w:lsdException w:name="Medium Grid 1" w:uiPriority="67"/>
+    <w:lsdException w:name="Medium Grid 2" w:uiPriority="68"/>
+    <w:lsdException w:name="Medium Grid 3" w:uiPriority="69"/>
+    <w:lsdException w:name="Dark List" w:uiPriority="70"/>
+    <w:lsdException w:name="Colorful Shading" w:uiPriority="71"/>
+    <w:lsdException w:name="Colorful List" w:uiPriority="72"/>
+    <w:lsdException w:name="Colorful Grid" w:uiPriority="73"/>
+    <w:lsdException w:name="Light Shading Accent 1" w:uiPriority="60"/>
+    <w:lsdException w:name="Light List Accent 1" w:uiPriority="61"/>
+    <w:lsdException w:name="Light Grid Accent 1" w:uiPriority="62"/>
+    <w:lsdException w:name="Medium Shading 1 Accent 1" w:uiPriority="63"/>
+    <w:lsdException w:name="Medium Shading 2 Accent 1" w:uiPriority="64"/>
+    <w:lsdException w:name="Medium List 1 Accent 1" w:uiPriority="65"/>
+    <w:lsdException w:name="Revision" w:semiHidden="1"/>
+    <w:lsdException w:name="List Paragraph" w:uiPriority="34" w:qFormat="1"/>
+    <w:lsdException w:name="Quote" w:uiPriority="29" w:qFormat="1"/>
+    <w:lsdException w:name="Intense Quote" w:uiPriority="30" w:qFormat="1"/>
+    <w:lsdException w:name="Medium List 2 Accent 1" w:uiPriority="66"/>
+    <w:lsdException w:name="Medium Grid 1 Accent 1" w:uiPriority="67"/>
+    <w:lsdException w:name="Medium Grid 2 Accent 1" w:uiPriority="68"/>
+    <w:lsdException w:name="Medium Grid 3 Accent 1" w:uiPriority="69"/>
+    <w:lsdException w:name="Dark List Accent 1" w:uiPriority="70"/>
+    <w:lsdException w:name="Colorful Shading Accent 1" w:uiPriority="71"/>
+    <w:lsdException w:name="Colorful List Accent 1" w:uiPriority="72"/>
+    <w:lsdException w:name="Colorful Grid Accent 1" w:uiPriority="73"/>
+    <w:lsdException w:name="Light Shading Accent 2" w:uiPriority="60"/>
+    <w:lsdException w:name="Light List Accent 2" w:uiPriority="61"/>
+    <w:lsdException w:name="Light Grid Accent 2" w:uiPriority="62"/>
+    <w:lsdException w:name="Medium Shading 1 Accent 2" w:uiPriority="63"/>
+    <w:lsdException w:name="Medium Shading 2 Accent 2" w:uiPriority="64"/>
+    <w:lsdException w:name="Medium List 1 Accent 2" w:uiPriority="65"/>
+    <w:lsdException w:name="Medium List 2 Accent 2" w:uiPriority="66"/>
+    <w:lsdException w:name="Medium Grid 1 Accent 2" w:uiPriority="67"/>
+    <w:lsdException w:name="Medium Grid 2 Accent 2" w:uiPriority="68"/>
+    <w:lsdException w:name="Medium Grid 3 Accent 2" w:uiPriority="69"/>
+    <w:lsdException w:name="Dark List Accent 2" w:uiPriority="70"/>
+    <w:lsdException w:name="Colorful Shading Accent 2" w:uiPriority="71"/>
+    <w:lsdException w:name="Colorful List Accent 2" w:uiPriority="72"/>
+    <w:lsdException w:name="Colorful Grid Accent 2" w:uiPriority="73"/>
+    <w:lsdException w:name="Light Shading Accent 3" w:uiPriority="60"/>
+    <w:lsdException w:name="Light List Accent 3" w:uiPriority="61"/>
+    <w:lsdException w:name="Light Grid Accent 3" w:uiPriority="62"/>
+    <w:lsdException w:name="Medium Shading 1 Accent 3" w:uiPriority="63"/>
+    <w:lsdException w:name="Medium Shading 2 Accent 3" w:uiPriority="64"/>
+    <w:lsdException w:name="Medium List 1 Accent 3" w:uiPriority="65"/>
+    <w:lsdException w:name="Medium List 2 Accent 3" w:uiPriority="66"/>
+    <w:lsdException w:name="Medium Grid 1 Accent 3" w:uiPriority="67"/>
+    <w:lsdException w:name="Medium Grid 2 Accent 3" w:uiPriority="68"/>
+    <w:lsdException w:name="Medium Grid 3 Accent 3" w:uiPriority="69"/>
+    <w:lsdException w:name="Dark List Accent 3" w:uiPriority="70"/>
+    <w:lsdException w:name="Colorful Shading Accent 3" w:uiPriority="71"/>
+    <w:lsdException w:name="Colorful List Accent 3" w:uiPriority="72"/>
+    <w:lsdException w:name="Colorful Grid Accent 3" w:uiPriority="73"/>
+    <w:lsdException w:name="Light Shading Accent 4" w:uiPriority="60"/>
+    <w:lsdException w:name="Light List Accent 4" w:uiPriority="61"/>
+    <w:lsdException w:name="Light Grid Accent 4" w:uiPriority="62"/>
+    <w:lsdException w:name="Medium Shading 1 Accent 4" w:uiPriority="63"/>
+    <w:lsdException w:name="Medium Shading 2 Accent 4" w:uiPriority="64"/>
+    <w:lsdException w:name="Medium List 1 Accent 4" w:uiPriority="65"/>
+    <w:lsdException w:name="Medium List 2 Accent 4" w:uiPriority="66"/>
+    <w:lsdException w:name="Medium Grid 1 Accent 4" w:uiPriority="67"/>
+    <w:lsdException w:name="Medium Grid 2 Accent 4" w:uiPriority="68"/>
+    <w:lsdException w:name="Medium Grid 3 Accent 4" w:uiPriority="69"/>
+    <w:lsdException w:name="Dark List Accent 4" w:uiPriority="70"/>
+    <w:lsdException w:name="Colorful Shading Accent 4" w:uiPriority="71"/>
+    <w:lsdException w:name="Colorful List Accent 4" w:uiPriority="72"/>
+    <w:lsdException w:name="Colorful Grid Accent 4" w:uiPriority="73"/>
+    <w:lsdException w:name="Light Shading Accent 5" w:uiPriority="60"/>
+    <w:lsdException w:name="Light List Accent 5" w:uiPriority="61"/>
+    <w:lsdException w:name="Light Grid Accent 5" w:uiPriority="62"/>
+    <w:lsdException w:name="Medium Shading 1 Accent 5" w:uiPriority="63"/>
+    <w:lsdException w:name="Medium Shading 2 Accent 5" w:uiPriority="64"/>
+    <w:lsdException w:name="Medium List 1 Accent 5" w:uiPriority="65"/>
+    <w:lsdException w:name="Medium List 2 Accent 5" w:uiPriority="66"/>
+    <w:lsdException w:name="Medium Grid 1 Accent 5" w:uiPriority="67"/>
+    <w:lsdException w:name="Medium Grid 2 Accent 5" w:uiPriority="68"/>
+    <w:lsdException w:name="Medium Grid 3 Accent 5" w:uiPriority="69"/>
+    <w:lsdException w:name="Dark List Accent 5" w:uiPriority="70"/>
+    <w:lsdException w:name="Colorful Shading Accent 5" w:uiPriority="71"/>
+    <w:lsdException w:name="Colorful List Accent 5" w:uiPriority="72"/>
+    <w:lsdException w:name="Colorful Grid Accent 5" w:uiPriority="73"/>
+    <w:lsdException w:name="Light Shading Accent 6" w:uiPriority="60"/>
+    <w:lsdException w:name="Light List Accent 6" w:uiPriority="61"/>
+    <w:lsdException w:name="Light Grid Accent 6" w:uiPriority="62"/>
+    <w:lsdException w:name="Medium Shading 1 Accent 6" w:uiPriority="63"/>
+    <w:lsdException w:name="Medium Shading 2 Accent 6" w:uiPriority="64"/>
+    <w:lsdException w:name="Medium List 1 Accent 6" w:uiPriority="65"/>
+    <w:lsdException w:name="Medium List 2 Accent 6" w:uiPriority="66"/>
+    <w:lsdException w:name="Medium Grid 1 Accent 6" w:uiPriority="67"/>
+    <w:lsdException w:name="Medium Grid 2 Accent 6" w:uiPriority="68"/>
+    <w:lsdException w:name="Medium Grid 3 Accent 6" w:uiPriority="69"/>
+    <w:lsdException w:name="Dark List Accent 6" w:uiPriority="70"/>
+    <w:lsdException w:name="Colorful Shading Accent 6" w:uiPriority="71"/>
+    <w:lsdException w:name="Colorful List Accent 6" w:uiPriority="72"/>
+    <w:lsdException w:name="Colorful Grid Accent 6" w:uiPriority="73"/>
+    <w:lsdException w:name="Subtle Emphasis" w:uiPriority="19" w:qFormat="1"/>
+    <w:lsdException w:name="Intense Emphasis" w:uiPriority="21" w:qFormat="1"/>
+    <w:lsdException w:name="Subtle Reference" w:uiPriority="31" w:qFormat="1"/>
+    <w:lsdException w:name="Intense Reference" w:uiPriority="32" w:qFormat="1"/>
+    <w:lsdException w:name="Book Title" w:uiPriority="33" w:qFormat="1"/>
+    <w:lsdException w:name="Bibliography" w:semiHidden="1" w:uiPriority="37" w:unhideWhenUsed="1"/>
+    <w:lsdException w:name="TOC Heading" w:semiHidden="1" w:uiPriority="39" w:unhideWhenUsed="1" w:qFormat="1"/>
+    <w:lsdException w:name="Plain Table 1" w:uiPriority="41"/>
+    <w:lsdException w:name="Plain Table 2" w:uiPriority="42"/>
+    <w:lsdException w:name="Plain Table 3" w:uiPriority="43"/>
+    <w:lsdException w:name="Plain Table 4" w:uiPriority="44"/>
+    <w:lsdException w:name="Plain Table 5" w:uiPriority="45"/>
+    <w:lsdException w:name="Grid Table Light" w:uiPriority="40"/>
+    <w:lsdException w:name="Grid Table 1 Light" w:uiPriority="46"/>
+    <w:lsdException w:name="Grid Table 2" w:uiPriority="47"/>
+    <w:lsdException w:name="Grid Table 3" w:uiPriority="48"/>
+    <w:lsdException w:name="Grid Table 4" w:uiPriority="49"/>
+    <w:lsdException w:name="Grid Table 5 Dark" w:uiPriority="50"/>
+    <w:lsdException w:name="Grid Table 6 Colorful" w:uiPriority="51"/>
+    <w:lsdException w:name="Grid Table 7 Colorful" w:uiPriority="52"/>
+    <w:lsdException w:name="Grid Table 1 Light Accent 1" w:uiPriority="46"/>
+    <w:lsdException w:name="Grid Table 2 Accent 1" w:uiPriority="47"/>
+    <w:lsdException w:name="Grid Table 3 Accent 1" w:uiPriority="48"/>
+    <w:lsdException w:name="Grid Table 4 Accent 1" w:uiPriority="49"/>
+    <w:lsdException w:name="Grid Table 5 Dark Accent 1" w:uiPriority="50"/>
+    <w:lsdException w:name="Grid Table 6 Colorful Accent 1" w:uiPriority="51"/>
+    <w:lsdException w:name="Grid Table 7 Colorful Accent 1" w:uiPriority="52"/>
+    <w:lsdException w:name="Grid Table 1 Light Accent 2" w:uiPriority="46"/>
+    <w:lsdException w:name="Grid Table 2 Accent 2" w:uiPriority="47"/>
+    <w:lsdException w:name="Grid Table 3 Accent 2" w:uiPriority="48"/>
+    <w:lsdException w:name="Grid Table 4 Accent 2" w:uiPriority="49"/>
+    <w:lsdException w:name="Grid Table 5 Dark Accent 2" w:uiPriority="50"/>
+    <w:lsdException w:name="Grid Table 6 Colorful Accent 2" w:uiPriority="51"/>
+    <w:lsdException w:name="Grid Table 7 Colorful Accent 2" w:uiPriority="52"/>
+    <w:lsdException w:name="Grid Table 1 Light Accent 3" w:uiPriority="46"/>
+    <w:lsdException w:name="Grid Table 2 Accent 3" w:uiPriority="47"/>
+    <w:lsdException w:name="Grid Table 3 Accent 3" w:uiPriority="48"/>
+    <w:lsdException w:name="Grid Table 4 Accent 3" w:uiPriority="49"/>
+    <w:lsdException w:name="Grid Table 5 Dark Accent 3" w:uiPriority="50"/>
+    <w:lsdException w:name="Grid Table 6 Colorful Accent 3" w:uiPriority="51"/>
+    <w:lsdException w:name="Grid Table 7 Colorful Accent 3" w:uiPriority="52"/>
+    <w:lsdException w:name="Grid Table 1 Light Accent 4" w:uiPriority="46"/>
+    <w:lsdException w:name="Grid Table 2 Accent 4" w:uiPriority="47"/>
+    <w:lsdException w:name="Grid Table 3 Accent 4" w:uiPriority="48"/>
+    <w:lsdException w:name="Grid Table 4 Accent 4" w:uiPriority="49"/>
+    <w:lsdException w:name="Grid Table 5 Dark Accent 4" w:uiPriority="50"/>
+    <w:lsdException w:name="Grid Table 6 Colorful Accent 4" w:uiPriority="51"/>
+    <w:lsdException w:name="Grid Table 7 Colorful Accent 4" w:uiPriority="52"/>
+    <w:lsdException w:name="Grid Table 1 Light Accent 5" w:uiPriority="46"/>
+    <w:lsdException w:name="Grid Table 2 Accent 5" w:uiPriority="47"/>
+    <w:lsdException w:name="Grid Table 3 Accent 5" w:uiPriority="48"/>
+    <w:lsdException w:name="Grid Table 4 Accent 5" w:uiPriority="49"/>
+    <w:lsdException w:name="Grid Table 5 Dark Accent 5" w:uiPriority="50"/>
+    <w:lsdException w:name="Grid Table 6 Colorful Accent 5" w:uiPriority="51"/>
+    <w:lsdException w:name="Grid Table 7 Colorful Accent 5" w:uiPriority="52"/>
+    <w:lsdException w:name="Grid Table 1 Light Accent 6" w:uiPriority="46"/>
+    <w:lsdException w:name="Grid Table 2 Accent 6" w:uiPriority="47"/>
+    <w:lsdException w:name="Grid Table 3 Accent 6" w:uiPriority="48"/>
+    <w:lsdException w:name="Grid Table 4 Accent 6" w:uiPriority="49"/>
+    <w:lsdException w:name="Grid Table 5 Dark Accent 6" w:uiPriority="50"/>
+    <w:lsdException w:name="Grid Table 6 Colorful Accent 6" w:uiPriority="51"/>
+    <w:lsdException w:name="Grid Table 7 Colorful Accent 6" w:uiPriority="52"/>
+    <w:lsdException w:name="List Table 1 Light" w:uiPriority="46"/>
+    <w:lsdException w:name="List Table 2" w:uiPriority="47"/>
+    <w:lsdException w:name="List Table 3" w:uiPriority="48"/>
+    <w:lsdException w:name="List Table 4" w:uiPriority="49"/>
+    <w:lsdException w:name="List Table 5 Dark" w:uiPriority="50"/>
+    <w:lsdException w:name="List Table 6 Colorful" w:uiPriority="51"/>
+    <w:lsdException w:name="List Table 7 Colorful" w:uiPriority="52"/>
+    <w:lsdException w:name="List Table 1 Light Accent 1" w:uiPriority="46"/>
+    <w:lsdException w:name="List Table 2 Accent 1" w:uiPriority="47"/>
+    <w:lsdException w:name="List Table 3 Accent 1" w:uiPriority="48"/>
+    <w:lsdException w:name="List Table 4 Accent 1" w:uiPriority="49"/>
+    <w:lsdException w:name="List Table 5 Dark Accent 1" w:uiPriority="50"/>
+    <w:lsdException w:name="List Table 6 Colorful Accent 1" w:uiPriority="51"/>
+    <w:lsdException w:name="List Table 7 Colorful Accent 1" w:uiPriority="52"/>
+    <w:lsdException w:name="List Table 1 Light Accent 2" w:uiPriority="46"/>
+    <w:lsdException w:name="List Table 2 Accent 2" w:uiPriority="47"/>
+    <w:lsdException w:name="List Table 3 Accent 2" w:uiPriority="48"/>
+    <w:lsdException w:name="List Table 4 Accent 2" w:uiPriority="49"/>
+    <w:lsdException w:name="List Table 5 Dark Accent 2" w:uiPriority="50"/>
+    <w:lsdException w:name="List Table 6 Colorful Accent 2" w:uiPriority="51"/>
+    <w:lsdException w:name="List Table 7 Colorful Accent 2" w:uiPriority="52"/>
+    <w:lsdException w:name="List Table 1 Light Accent 3" w:uiPriority="46"/>
+    <w:lsdException w:name="List Table 2 Accent 3" w:uiPriority="47"/>
+    <w:lsdException w:name="List Table 3 Accent 3" w:uiPriority="48"/>
+    <w:lsdException w:name="List Table 4 Accent 3" w:uiPriority="49"/>
+    <w:lsdException w:name="List Table 5 Dark Accent 3" w:uiPriority="50"/>
+    <w:lsdException w:name="List Table 6 Colorful Accent 3" w:uiPriority="51"/>
+    <w:lsdException w:name="List Table 7 Colorful Accent 3" w:uiPriority="52"/>
+    <w:lsdException w:name="List Table 1 Light Accent 4" w:uiPriority="46"/>
+    <w:lsdException w:name="List Table 2 Accent 4" w:uiPriority="47"/>
+    <w:lsdException w:name="List Table 3 Accent 4" w:uiPriority="48"/>
+    <w:lsdException w:name="List Table 4 Accent 4" w:uiPriority="49"/>
+    <w:lsdException w:name="List Table 5 Dark Accent 4" w:uiPriority="50"/>
+    <w:lsdException w:name="List Table 6 Colorful Accent 4" w:uiPriority="51"/>
+    <w:lsdException w:name="List Table 7 Colorful Accent 4" w:uiPriority="52"/>
+    <w:lsdException w:name="List Table 1 Light Accent 5" w:uiPriority="46"/>
+    <w:lsdException w:name="List Table 2 Accent 5" w:uiPriority="47"/>
+    <w:lsdException w:name="List Table 3 Accent 5" w:uiPriority="48"/>
+    <w:lsdException w:name="List Table 4 Accent 5" w:uiPriority="49"/>
+    <w:lsdException w:name="List Table 5 Dark Accent 5" w:uiPriority="50"/>
+    <w:lsdException w:name="List Table 6 Colorful Accent 5" w:uiPriority="51"/>
+    <w:lsdException w:name="List Table 7 Colorful Accent 5" w:uiPriority="52"/>
+    <w:lsdException w:name="List Table 1 Light Accent 6" w:uiPriority="46"/>
+    <w:lsdException w:name="List Table 2 Accent 6" w:uiPriority="47"/>
+    <w:lsdException w:name="List Table 3 Accent 6" w:uiPriority="48"/>
+    <w:lsdException w:name="List Table 4 Accent 6" w:uiPriority="49"/>
+    <w:lsdException w:name="List Table 5 Dark Accent 6" w:uiPriority="50"/>
+    <w:lsdException w:name="List Table 6 Colorful Accent 6" w:uiPriority="51"/>
+    <w:lsdException w:name="List Table 7 Colorful Accent 6" w:uiPriority="52"/>
+    <w:lsdException w:name="Mention" w:semiHidden="1" w:unhideWhenUsed="1"/>
+    <w:lsdException w:name="Smart Hyperlink" w:semiHidden="1" w:unhideWhenUsed="1"/>
+    <w:lsdException w:name="Hashtag" w:semiHidden="1" w:unhideWhenUsed="1"/>
+    <w:lsdException w:name="Unresolved Mention" w:semiHidden="1" w:unhideWhenUsed="1"/>
+    <w:lsdException w:name="Smart Link" w:semiHidden="1" w:unhideWhenUsed="1"/>
   </w:latentStyles>
-  <w:style w:type="paragraph" w:default="1" w:styleId="1">
+  <w:style w:type="paragraph" w:default="1" w:styleId="Normal">
     <w:name w:val="Normal"/>
     <w:qFormat/>
-    <w:uiPriority w:val="0"/>
-    <w:pPr>
-      <w:spacing w:after="160" w:line="259" w:lineRule="auto"/>
-    </w:pPr>
-    <w:rPr>
-      <w:rFonts w:asciiTheme="minorHAnsi" w:hAnsiTheme="minorHAnsi" w:eastAsiaTheme="minorHAnsi" w:cstheme="minorBidi"/>
-      <w:sz w:val="22"/>
-      <w:szCs w:val="22"/>
-      <w:lang w:val="en-US" w:eastAsia="en-US" w:bidi="ar-SA"/>
-    </w:rPr>
   </w:style>
-  <w:style w:type="character" w:default="1" w:styleId="2">
+  <w:style w:type="character" w:default="1" w:styleId="DefaultParagraphFont">
     <w:name w:val="Default Paragraph Font"/>
+    <w:uiPriority w:val="1"/>
     <w:semiHidden/>
     <w:unhideWhenUsed/>
-    <w:uiPriority w:val="1"/>
   </w:style>
-  <w:style w:type="table" w:default="1" w:styleId="3">
+  <w:style w:type="table" w:default="1" w:styleId="TableNormal">
     <w:name w:val="Normal Table"/>
+    <w:uiPriority w:val="99"/>
     <w:semiHidden/>
     <w:unhideWhenUsed/>
-    <w:uiPriority w:val="99"/>
     <w:tblPr>
+      <w:tblInd w:w="0" w:type="dxa"/>
       <w:tblCellMar>
         <w:top w:w="0" w:type="dxa"/>
         <w:left w:w="108" w:type="dxa"/>
@@ -3012,14 +3473,109 @@
       </w:tblCellMar>
     </w:tblPr>
   </w:style>
-  <w:style w:type="paragraph" w:styleId="4">
-    <w:name w:val="Balloon Text"/>
-    <w:basedOn w:val="1"/>
-    <w:link w:val="12"/>
+  <w:style w:type="numbering" w:default="1" w:styleId="NoList">
+    <w:name w:val="No List"/>
+    <w:uiPriority w:val="99"/>
     <w:semiHidden/>
     <w:unhideWhenUsed/>
+  </w:style>
+  <w:style w:type="paragraph" w:styleId="Header">
+    <w:name w:val="header"/>
+    <w:basedOn w:val="Normal"/>
+    <w:link w:val="HeaderChar"/>
+    <w:uiPriority w:val="99"/>
+    <w:unhideWhenUsed/>
+    <w:rsid w:val="00805B3A"/>
+    <w:pPr>
+      <w:tabs>
+        <w:tab w:val="center" w:pos="4680"/>
+        <w:tab w:val="right" w:pos="9360"/>
+      </w:tabs>
+      <w:spacing w:after="0" w:line="240" w:lineRule="auto"/>
+    </w:pPr>
+  </w:style>
+  <w:style w:type="character" w:customStyle="1" w:styleId="HeaderChar">
+    <w:name w:val="Header Char"/>
+    <w:basedOn w:val="DefaultParagraphFont"/>
+    <w:link w:val="Header"/>
+    <w:uiPriority w:val="99"/>
+    <w:rsid w:val="00805B3A"/>
+  </w:style>
+  <w:style w:type="paragraph" w:styleId="Footer">
+    <w:name w:val="footer"/>
+    <w:basedOn w:val="Normal"/>
+    <w:link w:val="FooterChar"/>
+    <w:uiPriority w:val="99"/>
+    <w:unhideWhenUsed/>
+    <w:rsid w:val="00805B3A"/>
+    <w:pPr>
+      <w:tabs>
+        <w:tab w:val="center" w:pos="4680"/>
+        <w:tab w:val="right" w:pos="9360"/>
+      </w:tabs>
+      <w:spacing w:after="0" w:line="240" w:lineRule="auto"/>
+    </w:pPr>
+  </w:style>
+  <w:style w:type="character" w:customStyle="1" w:styleId="FooterChar">
+    <w:name w:val="Footer Char"/>
+    <w:basedOn w:val="DefaultParagraphFont"/>
+    <w:link w:val="Footer"/>
+    <w:uiPriority w:val="99"/>
+    <w:rsid w:val="00805B3A"/>
+  </w:style>
+  <w:style w:type="table" w:styleId="TableGrid">
+    <w:name w:val="Table Grid"/>
+    <w:basedOn w:val="TableNormal"/>
+    <w:uiPriority w:val="39"/>
+    <w:rsid w:val="00D51AF9"/>
+    <w:pPr>
+      <w:spacing w:after="0" w:line="240" w:lineRule="auto"/>
+    </w:pPr>
+    <w:tblPr>
+      <w:tblBorders>
+        <w:top w:val="single" w:sz="4" w:space="0" w:color="auto"/>
+        <w:left w:val="single" w:sz="4" w:space="0" w:color="auto"/>
+        <w:bottom w:val="single" w:sz="4" w:space="0" w:color="auto"/>
+        <w:right w:val="single" w:sz="4" w:space="0" w:color="auto"/>
+        <w:insideH w:val="single" w:sz="4" w:space="0" w:color="auto"/>
+        <w:insideV w:val="single" w:sz="4" w:space="0" w:color="auto"/>
+      </w:tblBorders>
+    </w:tblPr>
+  </w:style>
+  <w:style w:type="paragraph" w:styleId="NormalWeb">
+    <w:name w:val="Normal (Web)"/>
+    <w:basedOn w:val="Normal"/>
+    <w:uiPriority w:val="99"/>
+    <w:unhideWhenUsed/>
+    <w:rsid w:val="00123242"/>
+    <w:pPr>
+      <w:spacing w:before="100" w:beforeAutospacing="1" w:after="100" w:afterAutospacing="1" w:line="240" w:lineRule="auto"/>
+    </w:pPr>
+    <w:rPr>
+      <w:rFonts w:ascii="Times New Roman" w:eastAsia="Times New Roman" w:hAnsi="Times New Roman" w:cs="Times New Roman"/>
+      <w:sz w:val="24"/>
+      <w:szCs w:val="24"/>
+    </w:rPr>
+  </w:style>
+  <w:style w:type="character" w:styleId="Strong">
+    <w:name w:val="Strong"/>
+    <w:basedOn w:val="DefaultParagraphFont"/>
+    <w:uiPriority w:val="22"/>
     <w:qFormat/>
+    <w:rsid w:val="00123242"/>
+    <w:rPr>
+      <w:b/>
+      <w:bCs/>
+    </w:rPr>
+  </w:style>
+  <w:style w:type="paragraph" w:styleId="BalloonText">
+    <w:name w:val="Balloon Text"/>
+    <w:basedOn w:val="Normal"/>
+    <w:link w:val="BalloonTextChar"/>
     <w:uiPriority w:val="99"/>
+    <w:semiHidden/>
+    <w:unhideWhenUsed/>
+    <w:rsid w:val="00DF17A4"/>
     <w:pPr>
       <w:spacing w:after="0" w:line="240" w:lineRule="auto"/>
     </w:pPr>
@@ -3029,109 +3585,23 @@
       <w:szCs w:val="18"/>
     </w:rPr>
   </w:style>
-  <w:style w:type="paragraph" w:styleId="5">
-    <w:name w:val="footer"/>
-    <w:basedOn w:val="1"/>
-    <w:link w:val="11"/>
-    <w:unhideWhenUsed/>
+  <w:style w:type="character" w:customStyle="1" w:styleId="BalloonTextChar">
+    <w:name w:val="Balloon Text Char"/>
+    <w:basedOn w:val="DefaultParagraphFont"/>
+    <w:link w:val="BalloonText"/>
     <w:uiPriority w:val="99"/>
-    <w:pPr>
-      <w:tabs>
-        <w:tab w:val="center" w:pos="4680"/>
-        <w:tab w:val="right" w:pos="9360"/>
-      </w:tabs>
-      <w:spacing w:after="0" w:line="240" w:lineRule="auto"/>
-    </w:pPr>
-  </w:style>
-  <w:style w:type="paragraph" w:styleId="6">
-    <w:name w:val="header"/>
-    <w:basedOn w:val="1"/>
-    <w:link w:val="10"/>
-    <w:unhideWhenUsed/>
-    <w:uiPriority w:val="99"/>
-    <w:pPr>
-      <w:tabs>
-        <w:tab w:val="center" w:pos="4680"/>
-        <w:tab w:val="right" w:pos="9360"/>
-      </w:tabs>
-      <w:spacing w:after="0" w:line="240" w:lineRule="auto"/>
-    </w:pPr>
-  </w:style>
-  <w:style w:type="paragraph" w:styleId="7">
-    <w:name w:val="Normal (Web)"/>
-    <w:basedOn w:val="1"/>
-    <w:unhideWhenUsed/>
-    <w:qFormat/>
-    <w:uiPriority w:val="99"/>
-    <w:pPr>
-      <w:spacing w:before="100" w:beforeAutospacing="1" w:after="100" w:afterAutospacing="1" w:line="240" w:lineRule="auto"/>
-    </w:pPr>
-    <w:rPr>
-      <w:rFonts w:ascii="Times New Roman" w:hAnsi="Times New Roman" w:eastAsia="Times New Roman" w:cs="Times New Roman"/>
-      <w:sz w:val="24"/>
-      <w:szCs w:val="24"/>
-    </w:rPr>
-  </w:style>
-  <w:style w:type="character" w:styleId="8">
-    <w:name w:val="Strong"/>
-    <w:basedOn w:val="2"/>
-    <w:qFormat/>
-    <w:uiPriority w:val="22"/>
-    <w:rPr>
-      <w:b/>
-      <w:bCs/>
-    </w:rPr>
-  </w:style>
-  <w:style w:type="table" w:styleId="9">
-    <w:name w:val="Table Grid"/>
-    <w:basedOn w:val="3"/>
-    <w:uiPriority w:val="39"/>
-    <w:pPr>
-      <w:spacing w:after="0" w:line="240" w:lineRule="auto"/>
-    </w:pPr>
-    <w:tblPr>
-      <w:tblBorders>
-        <w:top w:val="single" w:color="auto" w:sz="4" w:space="0"/>
-        <w:left w:val="single" w:color="auto" w:sz="4" w:space="0"/>
-        <w:bottom w:val="single" w:color="auto" w:sz="4" w:space="0"/>
-        <w:right w:val="single" w:color="auto" w:sz="4" w:space="0"/>
-        <w:insideH w:val="single" w:color="auto" w:sz="4" w:space="0"/>
-        <w:insideV w:val="single" w:color="auto" w:sz="4" w:space="0"/>
-      </w:tblBorders>
-    </w:tblPr>
-  </w:style>
-  <w:style w:type="character" w:customStyle="1" w:styleId="10">
-    <w:name w:val="Header Char"/>
-    <w:basedOn w:val="2"/>
-    <w:link w:val="6"/>
-    <w:qFormat/>
-    <w:uiPriority w:val="99"/>
-  </w:style>
-  <w:style w:type="character" w:customStyle="1" w:styleId="11">
-    <w:name w:val="Footer Char"/>
-    <w:basedOn w:val="2"/>
-    <w:link w:val="5"/>
-    <w:qFormat/>
-    <w:uiPriority w:val="99"/>
-  </w:style>
-  <w:style w:type="character" w:customStyle="1" w:styleId="12">
-    <w:name w:val="Balloon Text Char"/>
-    <w:basedOn w:val="2"/>
-    <w:link w:val="4"/>
     <w:semiHidden/>
-    <w:qFormat/>
-    <w:uiPriority w:val="99"/>
+    <w:rsid w:val="00DF17A4"/>
     <w:rPr>
       <w:rFonts w:ascii="Segoe UI" w:hAnsi="Segoe UI" w:cs="Segoe UI"/>
       <w:sz w:val="18"/>
       <w:szCs w:val="18"/>
     </w:rPr>
   </w:style>
-  <w:style w:type="character" w:customStyle="1" w:styleId="13">
+  <w:style w:type="character" w:customStyle="1" w:styleId="oypena">
     <w:name w:val="oypena"/>
-    <w:basedOn w:val="2"/>
-    <w:qFormat/>
-    <w:uiPriority w:val="0"/>
+    <w:basedOn w:val="DefaultParagraphFont"/>
+    <w:rsid w:val="00142EA1"/>
   </w:style>
 </w:styles>
 </file>
@@ -3179,7 +3649,7 @@
     </a:clrScheme>
     <a:fontScheme name="Office">
       <a:majorFont>
-        <a:latin typeface="Calibri Light"/>
+        <a:latin typeface="Calibri Light" panose="020F0302020204030204"/>
         <a:ea typeface=""/>
         <a:cs typeface=""/>
         <a:font script="Jpan" typeface="游ゴシック Light"/>
@@ -3214,7 +3684,7 @@
         <a:font script="Geor" typeface="Sylfaen"/>
       </a:majorFont>
       <a:minorFont>
-        <a:latin typeface="Calibri"/>
+        <a:latin typeface="Calibri" panose="020F0502020204030204"/>
         <a:ea typeface=""/>
         <a:cs typeface=""/>
         <a:font script="Jpan" typeface="游明朝"/>
@@ -3388,35 +3858,23 @@
     </a:fmtScheme>
   </a:themeElements>
   <a:objectDefaults/>
+  <a:extraClrSchemeLst/>
+  <a:extLst>
+    <a:ext uri="{05A4C25C-085E-4340-85A3-A5531E510DB2}">
+      <thm15:themeFamily xmlns:thm15="http://schemas.microsoft.com/office/thememl/2012/main" name="Office Theme" id="{62F939B6-93AF-4DB8-9C6B-D6C7DFDC589F}" vid="{4A3C46E8-61CC-4603-A589-7422A47A8E4A}"/>
+    </a:ext>
+  </a:extLst>
 </a:theme>
 </file>
 
 <file path=customXml/item1.xml><?xml version="1.0" encoding="utf-8"?>
-<s:customData xmlns="http://www.wps.cn/officeDocument/2013/wpsCustomData" xmlns:s="http://www.wps.cn/officeDocument/2013/wpsCustomData">
-  <customSectProps/>
-  <customShpExts>
-    <customShpInfo spid="_x0000_s1026" textRotate="1"/>
-    <customShpInfo spid="_x0000_s2054"/>
-    <customShpInfo spid="_x0000_s2053"/>
-    <customShpInfo spid="_x0000_s2052"/>
-  </customShpExts>
-</s:customData>
-</file>
-
-<file path=customXml/item2.xml><?xml version="1.0" encoding="utf-8"?>
 <b:Sources xmlns:b="http://schemas.openxmlformats.org/officeDocument/2006/bibliography" xmlns="http://schemas.openxmlformats.org/officeDocument/2006/bibliography" SelectedStyle="\APASixthEditionOfficeOnline.xsl" StyleName="APA" Version="6"/>
 </file>
 
 <file path=customXml/itemProps1.xml><?xml version="1.0" encoding="utf-8"?>
-<ds:datastoreItem xmlns:ds="http://schemas.openxmlformats.org/officeDocument/2006/customXml" ds:itemID="{B1977F7D-205B-4081-913C-38D41E755F92}">
+<ds:datastoreItem xmlns:ds="http://schemas.openxmlformats.org/officeDocument/2006/customXml" ds:itemID="{33ED747B-4F6D-4849-95D2-96278288DF66}">
   <ds:schemaRefs>
-    <ds:schemaRef ds:uri="http://www.wps.cn/officeDocument/2013/wpsCustomData"/>
+    <ds:schemaRef ds:uri="http://schemas.openxmlformats.org/officeDocument/2006/bibliography"/>
   </ds:schemaRefs>
 </ds:datastoreItem>
-</file>
-
-<file path=customXml/itemProps2.xml><?xml version="1.0" encoding="utf-8"?>
-<ds:datastoreItem xmlns:ds="http://schemas.openxmlformats.org/officeDocument/2006/customXml" ds:itemID="{33ED747B-4F6D-4849-95D2-96278288DF66}">
-  <ds:schemaRefs/>
-</ds:datastoreItem>
 </file>
</xml_diff>